<commit_message>
md: add homework already finish and the pdf ready to submit
</commit_message>
<xml_diff>
--- a/md/2.2/AS_2.2_Practicando.docx
+++ b/md/2.2/AS_2.2_Practicando.docx
@@ -5,7 +5,7 @@
     <w:p>
       <w:pPr>
         <w:pStyle w:val="NormalWeb"/>
-        <w:spacing w:beforeAutospacing="0" w:before="0" w:afterAutospacing="0" w:after="0"/>
+        <w:spacing w:before="0" w:after="0"/>
         <w:rPr>
           <w:rFonts w:ascii="Arial" w:hAnsi="Arial" w:cs="Arial"/>
           <w:i/>
@@ -30,7 +30,7 @@
     <w:p>
       <w:pPr>
         <w:pStyle w:val="NormalWeb"/>
-        <w:spacing w:beforeAutospacing="0" w:before="0" w:afterAutospacing="0" w:after="0"/>
+        <w:spacing w:before="0" w:after="0"/>
         <w:rPr>
           <w:rFonts w:ascii="Arial" w:hAnsi="Arial" w:cs="Arial"/>
           <w:b/>
@@ -55,7 +55,7 @@
     <w:p>
       <w:pPr>
         <w:pStyle w:val="NormalWeb"/>
-        <w:spacing w:beforeAutospacing="0" w:before="0" w:afterAutospacing="0" w:after="0"/>
+        <w:spacing w:before="0" w:after="0"/>
         <w:rPr>
           <w:rFonts w:ascii="Arial" w:hAnsi="Arial" w:cs="Arial"/>
           <w:b/>
@@ -79,7 +79,7 @@
     <w:p>
       <w:pPr>
         <w:pStyle w:val="NormalWeb"/>
-        <w:spacing w:beforeAutospacing="0" w:before="0" w:afterAutospacing="0" w:after="0"/>
+        <w:spacing w:before="0" w:after="0"/>
         <w:rPr>
           <w:rFonts w:ascii="Arial" w:hAnsi="Arial" w:cs="Arial"/>
           <w:sz w:val="24"/>
@@ -100,7 +100,7 @@
     <w:p>
       <w:pPr>
         <w:pStyle w:val="NormalWeb"/>
-        <w:spacing w:beforeAutospacing="0" w:before="0" w:afterAutospacing="0" w:after="0"/>
+        <w:spacing w:before="0" w:after="0"/>
         <w:rPr>
           <w:rFonts w:ascii="Arial" w:hAnsi="Arial" w:cs="Arial"/>
           <w:sz w:val="24"/>
@@ -121,7 +121,7 @@
     <w:p>
       <w:pPr>
         <w:pStyle w:val="NormalWeb"/>
-        <w:spacing w:beforeAutospacing="0" w:before="0" w:afterAutospacing="0" w:after="0"/>
+        <w:spacing w:before="0" w:after="0"/>
         <w:rPr>
           <w:rFonts w:ascii="Arial" w:hAnsi="Arial" w:cs="Arial"/>
           <w:sz w:val="24"/>
@@ -142,7 +142,7 @@
     <w:p>
       <w:pPr>
         <w:pStyle w:val="NormalWeb"/>
-        <w:spacing w:beforeAutospacing="0" w:before="0" w:afterAutospacing="0" w:after="0"/>
+        <w:spacing w:before="0" w:after="0"/>
         <w:rPr>
           <w:rFonts w:ascii="Arial" w:hAnsi="Arial" w:cs="Arial"/>
           <w:sz w:val="24"/>
@@ -163,7 +163,7 @@
     <w:p>
       <w:pPr>
         <w:pStyle w:val="NormalWeb"/>
-        <w:spacing w:beforeAutospacing="0" w:before="0" w:afterAutospacing="0" w:after="0"/>
+        <w:spacing w:before="0" w:after="0"/>
         <w:rPr>
           <w:rFonts w:ascii="Arial" w:hAnsi="Arial" w:cs="Arial"/>
           <w:sz w:val="24"/>
@@ -183,7 +183,7 @@
     <w:p>
       <w:pPr>
         <w:pStyle w:val="NormalWeb"/>
-        <w:spacing w:beforeAutospacing="0" w:before="0" w:afterAutospacing="0" w:after="0"/>
+        <w:spacing w:before="0" w:after="0"/>
         <w:rPr>
           <w:rFonts w:ascii="Arial" w:hAnsi="Arial" w:cs="Arial"/>
           <w:sz w:val="24"/>
@@ -204,7 +204,7 @@
     <w:p>
       <w:pPr>
         <w:pStyle w:val="NormalWeb"/>
-        <w:spacing w:beforeAutospacing="0" w:before="0" w:afterAutospacing="0" w:after="0"/>
+        <w:spacing w:before="0" w:after="0"/>
         <w:rPr>
           <w:rFonts w:ascii="Arial" w:hAnsi="Arial" w:cs="Arial"/>
           <w:sz w:val="24"/>
@@ -225,7 +225,7 @@
     <w:p>
       <w:pPr>
         <w:pStyle w:val="NormalWeb"/>
-        <w:spacing w:beforeAutospacing="0" w:before="0" w:afterAutospacing="0" w:after="0"/>
+        <w:spacing w:before="0" w:after="0"/>
         <w:rPr>
           <w:rFonts w:ascii="Arial" w:hAnsi="Arial" w:cs="Arial"/>
           <w:sz w:val="24"/>
@@ -246,7 +246,7 @@
     <w:p>
       <w:pPr>
         <w:pStyle w:val="NormalWeb"/>
-        <w:spacing w:beforeAutospacing="0" w:before="0" w:afterAutospacing="0" w:after="0"/>
+        <w:spacing w:before="0" w:after="0"/>
         <w:rPr>
           <w:rFonts w:ascii="Arial" w:hAnsi="Arial" w:cs="Arial"/>
           <w:sz w:val="24"/>
@@ -267,7 +267,7 @@
     <w:p>
       <w:pPr>
         <w:pStyle w:val="NormalWeb"/>
-        <w:spacing w:beforeAutospacing="0" w:before="0" w:afterAutospacing="0" w:after="0"/>
+        <w:spacing w:before="0" w:after="0"/>
         <w:rPr>
           <w:rFonts w:ascii="Arial" w:hAnsi="Arial" w:cs="Arial"/>
           <w:sz w:val="24"/>
@@ -287,7 +287,7 @@
     <w:p>
       <w:pPr>
         <w:pStyle w:val="NormalWeb"/>
-        <w:spacing w:beforeAutospacing="0" w:before="0" w:afterAutospacing="0" w:after="0"/>
+        <w:spacing w:before="0" w:after="0"/>
         <w:rPr>
           <w:rFonts w:ascii="Arial" w:hAnsi="Arial" w:cs="Arial"/>
           <w:sz w:val="24"/>
@@ -308,7 +308,7 @@
     <w:p>
       <w:pPr>
         <w:pStyle w:val="NormalWeb"/>
-        <w:spacing w:beforeAutospacing="0" w:before="0" w:afterAutospacing="0" w:after="0"/>
+        <w:spacing w:before="0" w:after="0"/>
         <w:rPr>
           <w:rFonts w:ascii="Arial" w:hAnsi="Arial" w:cs="Arial"/>
           <w:sz w:val="24"/>
@@ -331,9 +331,9 @@
         <w:pStyle w:val="NormalWeb"/>
         <w:numPr>
           <w:ilvl w:val="0"/>
-          <w:numId w:val="1"/>
+          <w:numId w:val="2"/>
         </w:numPr>
-        <w:spacing w:beforeAutospacing="0" w:before="0" w:afterAutospacing="0" w:after="0"/>
+        <w:spacing w:before="0" w:after="0"/>
         <w:rPr>
           <w:rFonts w:ascii="Arial" w:hAnsi="Arial" w:cs="Arial"/>
           <w:b/>
@@ -358,7 +358,7 @@
     <w:p>
       <w:pPr>
         <w:pStyle w:val="NormalWeb"/>
-        <w:spacing w:beforeAutospacing="0" w:before="0" w:afterAutospacing="0" w:after="0"/>
+        <w:spacing w:before="0" w:after="0"/>
         <w:ind w:left="720"/>
         <w:rPr>
           <w:rFonts w:ascii="Arial" w:hAnsi="Arial" w:cs="Arial"/>
@@ -382,9 +382,9 @@
         <w:pStyle w:val="NormalWeb"/>
         <w:numPr>
           <w:ilvl w:val="0"/>
-          <w:numId w:val="1"/>
+          <w:numId w:val="2"/>
         </w:numPr>
-        <w:spacing w:beforeAutospacing="0" w:before="0" w:afterAutospacing="0" w:after="0"/>
+        <w:spacing w:before="0" w:after="0"/>
         <w:rPr>
           <w:rFonts w:ascii="Arial" w:hAnsi="Arial" w:cs="Arial"/>
           <w:b/>
@@ -409,7 +409,7 @@
     <w:p>
       <w:pPr>
         <w:pStyle w:val="NormalWeb"/>
-        <w:spacing w:beforeAutospacing="0" w:before="0" w:afterAutospacing="0" w:after="0"/>
+        <w:spacing w:before="0" w:after="0"/>
         <w:ind w:left="720"/>
         <w:rPr>
           <w:rFonts w:ascii="Arial" w:hAnsi="Arial" w:cs="Arial"/>
@@ -433,9 +433,9 @@
         <w:pStyle w:val="NormalWeb"/>
         <w:numPr>
           <w:ilvl w:val="0"/>
-          <w:numId w:val="1"/>
+          <w:numId w:val="2"/>
         </w:numPr>
-        <w:spacing w:beforeAutospacing="0" w:before="0" w:afterAutospacing="0" w:after="0"/>
+        <w:spacing w:before="0" w:after="0"/>
         <w:rPr>
           <w:rFonts w:ascii="Arial" w:hAnsi="Arial" w:cs="Arial"/>
           <w:b/>
@@ -460,7 +460,7 @@
     <w:p>
       <w:pPr>
         <w:pStyle w:val="NormalWeb"/>
-        <w:spacing w:beforeAutospacing="0" w:before="0" w:afterAutospacing="0" w:after="0"/>
+        <w:spacing w:before="0" w:after="0"/>
         <w:ind w:left="720"/>
         <w:rPr>
           <w:rFonts w:ascii="Arial" w:hAnsi="Arial" w:cs="Arial"/>
@@ -484,9 +484,9 @@
         <w:pStyle w:val="NormalWeb"/>
         <w:numPr>
           <w:ilvl w:val="0"/>
-          <w:numId w:val="1"/>
+          <w:numId w:val="2"/>
         </w:numPr>
-        <w:spacing w:beforeAutospacing="0" w:before="0" w:afterAutospacing="0" w:after="0"/>
+        <w:spacing w:before="0" w:after="0"/>
         <w:rPr>
           <w:rFonts w:ascii="Arial" w:hAnsi="Arial" w:cs="Arial"/>
           <w:b/>
@@ -511,7 +511,7 @@
     <w:p>
       <w:pPr>
         <w:pStyle w:val="NormalWeb"/>
-        <w:spacing w:beforeAutospacing="0" w:before="0" w:afterAutospacing="0" w:after="0"/>
+        <w:spacing w:before="0" w:after="0"/>
         <w:ind w:left="720"/>
         <w:rPr>
           <w:rFonts w:ascii="Arial" w:hAnsi="Arial" w:cs="Arial"/>
@@ -533,7 +533,7 @@
     <w:p>
       <w:pPr>
         <w:pStyle w:val="NormalWeb"/>
-        <w:spacing w:beforeAutospacing="0" w:before="0" w:afterAutospacing="0" w:after="0"/>
+        <w:spacing w:before="0" w:after="0"/>
         <w:rPr>
           <w:rFonts w:ascii="Arial" w:hAnsi="Arial" w:cs="Arial"/>
           <w:sz w:val="24"/>
@@ -553,7 +553,7 @@
     <w:p>
       <w:pPr>
         <w:pStyle w:val="NormalWeb"/>
-        <w:spacing w:beforeAutospacing="0" w:before="0" w:afterAutospacing="0" w:after="0"/>
+        <w:spacing w:before="0" w:after="0"/>
         <w:rPr>
           <w:rFonts w:ascii="Arial" w:hAnsi="Arial" w:cs="Arial"/>
           <w:sz w:val="24"/>
@@ -576,9 +576,9 @@
         <w:pStyle w:val="NormalWeb"/>
         <w:numPr>
           <w:ilvl w:val="0"/>
-          <w:numId w:val="1"/>
+          <w:numId w:val="2"/>
         </w:numPr>
-        <w:spacing w:beforeAutospacing="0" w:before="0" w:afterAutospacing="0" w:after="0"/>
+        <w:spacing w:before="0" w:after="0"/>
         <w:rPr>
           <w:rFonts w:ascii="Arial" w:hAnsi="Arial" w:cs="Arial"/>
           <w:b/>
@@ -603,7 +603,7 @@
     <w:p>
       <w:pPr>
         <w:pStyle w:val="NormalWeb"/>
-        <w:spacing w:beforeAutospacing="0" w:before="0" w:afterAutospacing="0" w:after="0"/>
+        <w:spacing w:before="0" w:after="0"/>
         <w:ind w:left="720"/>
         <w:rPr>
           <w:rFonts w:ascii="Arial" w:hAnsi="Arial" w:cs="Arial"/>
@@ -625,7 +625,7 @@
     <w:p>
       <w:pPr>
         <w:pStyle w:val="NormalWeb"/>
-        <w:spacing w:beforeAutospacing="0" w:before="0" w:afterAutospacing="0" w:after="0"/>
+        <w:spacing w:before="0" w:after="0"/>
         <w:ind w:left="720"/>
         <w:rPr>
           <w:rFonts w:ascii="Arial" w:hAnsi="Arial" w:cs="Arial"/>
@@ -649,9 +649,9 @@
         <w:pStyle w:val="NormalWeb"/>
         <w:numPr>
           <w:ilvl w:val="0"/>
-          <w:numId w:val="1"/>
+          <w:numId w:val="2"/>
         </w:numPr>
-        <w:spacing w:beforeAutospacing="0" w:before="0" w:afterAutospacing="0" w:after="0"/>
+        <w:spacing w:before="0" w:after="0"/>
         <w:rPr>
           <w:rFonts w:ascii="Arial" w:hAnsi="Arial" w:cs="Arial"/>
           <w:b/>
@@ -676,7 +676,7 @@
     <w:p>
       <w:pPr>
         <w:pStyle w:val="NormalWeb"/>
-        <w:spacing w:beforeAutospacing="0" w:before="0" w:afterAutospacing="0" w:after="0"/>
+        <w:spacing w:before="0" w:after="0"/>
         <w:ind w:left="720"/>
         <w:rPr>
           <w:rFonts w:ascii="Arial" w:hAnsi="Arial" w:cs="Arial"/>
@@ -698,7 +698,7 @@
     <w:p>
       <w:pPr>
         <w:pStyle w:val="NormalWeb"/>
-        <w:spacing w:beforeAutospacing="0" w:before="0" w:afterAutospacing="0" w:after="0"/>
+        <w:spacing w:before="0" w:after="0"/>
         <w:rPr>
           <w:rFonts w:ascii="Arial" w:hAnsi="Arial" w:cs="Arial"/>
           <w:sz w:val="24"/>
@@ -718,7 +718,7 @@
     <w:p>
       <w:pPr>
         <w:pStyle w:val="NormalWeb"/>
-        <w:spacing w:beforeAutospacing="0" w:before="0" w:afterAutospacing="0" w:after="0"/>
+        <w:spacing w:before="0" w:after="0"/>
         <w:rPr>
           <w:rFonts w:ascii="Arial" w:hAnsi="Arial" w:cs="Arial"/>
           <w:sz w:val="24"/>
@@ -738,7 +738,7 @@
     <w:p>
       <w:pPr>
         <w:pStyle w:val="NormalWeb"/>
-        <w:spacing w:beforeAutospacing="0" w:before="0" w:afterAutospacing="0" w:after="0"/>
+        <w:spacing w:before="0" w:after="0"/>
         <w:rPr>
           <w:rFonts w:ascii="Arial" w:hAnsi="Arial" w:cs="Arial"/>
           <w:sz w:val="24"/>
@@ -758,7 +758,7 @@
     <w:p>
       <w:pPr>
         <w:pStyle w:val="NormalWeb"/>
-        <w:spacing w:beforeAutospacing="0" w:before="0" w:afterAutospacing="0" w:after="0"/>
+        <w:spacing w:before="0" w:after="0"/>
         <w:rPr>
           <w:rFonts w:ascii="Arial" w:hAnsi="Arial" w:cs="Arial"/>
           <w:sz w:val="24"/>
@@ -778,7 +778,7 @@
     <w:p>
       <w:pPr>
         <w:pStyle w:val="NormalWeb"/>
-        <w:spacing w:beforeAutospacing="0" w:before="0" w:afterAutospacing="0" w:after="0"/>
+        <w:spacing w:before="0" w:after="0"/>
         <w:rPr>
           <w:rFonts w:ascii="Arial" w:hAnsi="Arial" w:cs="Arial"/>
           <w:sz w:val="24"/>
@@ -798,7 +798,7 @@
     <w:p>
       <w:pPr>
         <w:pStyle w:val="NormalWeb"/>
-        <w:spacing w:beforeAutospacing="0" w:before="0" w:afterAutospacing="0" w:after="0"/>
+        <w:spacing w:before="0" w:after="0"/>
         <w:rPr>
           <w:rFonts w:ascii="Arial" w:hAnsi="Arial" w:cs="Arial"/>
           <w:sz w:val="24"/>
@@ -818,7 +818,7 @@
     <w:p>
       <w:pPr>
         <w:pStyle w:val="NormalWeb"/>
-        <w:spacing w:beforeAutospacing="0" w:before="0" w:afterAutospacing="0" w:after="0"/>
+        <w:spacing w:before="0" w:after="0"/>
         <w:rPr>
           <w:rFonts w:ascii="Arial" w:hAnsi="Arial" w:cs="Arial"/>
           <w:sz w:val="24"/>
@@ -857,7 +857,7 @@
     <w:p>
       <w:pPr>
         <w:pStyle w:val="NormalWeb"/>
-        <w:spacing w:beforeAutospacing="0" w:before="0" w:afterAutospacing="0" w:after="0"/>
+        <w:spacing w:before="0" w:after="0"/>
         <w:rPr>
           <w:rFonts w:ascii="Arial" w:hAnsi="Arial" w:cs="Arial"/>
           <w:sz w:val="24"/>
@@ -879,9 +879,9 @@
         <w:pStyle w:val="NormalWeb"/>
         <w:numPr>
           <w:ilvl w:val="0"/>
-          <w:numId w:val="1"/>
+          <w:numId w:val="2"/>
         </w:numPr>
-        <w:spacing w:beforeAutospacing="0" w:before="0" w:afterAutospacing="0" w:after="0"/>
+        <w:spacing w:before="0" w:after="0"/>
         <w:rPr>
           <w:rFonts w:ascii="Arial" w:hAnsi="Arial" w:cs="Arial"/>
           <w:b/>
@@ -906,7 +906,7 @@
     <w:p>
       <w:pPr>
         <w:pStyle w:val="NormalWeb"/>
-        <w:spacing w:beforeAutospacing="0" w:before="0" w:afterAutospacing="0" w:after="0"/>
+        <w:spacing w:before="0" w:after="0"/>
         <w:ind w:left="720"/>
         <w:rPr>
           <w:rFonts w:ascii="Arial" w:hAnsi="Arial" w:cs="Arial"/>
@@ -928,7 +928,7 @@
     <w:p>
       <w:pPr>
         <w:pStyle w:val="NormalWeb"/>
-        <w:spacing w:beforeAutospacing="0" w:before="0" w:afterAutospacing="0" w:after="0"/>
+        <w:spacing w:before="0" w:after="0"/>
         <w:ind w:left="720"/>
         <w:rPr>
           <w:rFonts w:ascii="Arial" w:hAnsi="Arial" w:cs="Arial"/>
@@ -950,7 +950,7 @@
     <w:p>
       <w:pPr>
         <w:pStyle w:val="NormalWeb"/>
-        <w:spacing w:beforeAutospacing="0" w:before="0" w:afterAutospacing="0" w:after="0"/>
+        <w:spacing w:before="0" w:after="0"/>
         <w:ind w:left="720"/>
         <w:rPr>
           <w:rFonts w:ascii="Arial" w:hAnsi="Arial" w:cs="Arial"/>
@@ -973,9 +973,9 @@
         <w:pStyle w:val="NormalWeb"/>
         <w:numPr>
           <w:ilvl w:val="0"/>
-          <w:numId w:val="1"/>
+          <w:numId w:val="2"/>
         </w:numPr>
-        <w:spacing w:beforeAutospacing="0" w:before="0" w:afterAutospacing="0" w:after="0"/>
+        <w:spacing w:before="0" w:after="0"/>
         <w:rPr>
           <w:rFonts w:ascii="Arial" w:hAnsi="Arial" w:cs="Arial"/>
           <w:sz w:val="24"/>
@@ -1016,7 +1016,7 @@
     <w:p>
       <w:pPr>
         <w:pStyle w:val="NormalWeb"/>
-        <w:spacing w:beforeAutospacing="0" w:before="0" w:afterAutospacing="0" w:after="0"/>
+        <w:spacing w:before="0" w:after="0"/>
         <w:ind w:left="708"/>
         <w:rPr>
           <w:rFonts w:ascii="Arial" w:hAnsi="Arial" w:cs="Arial"/>
@@ -1042,7 +1042,7 @@
     <w:p>
       <w:pPr>
         <w:pStyle w:val="NormalWeb"/>
-        <w:spacing w:beforeAutospacing="0" w:before="0" w:afterAutospacing="0" w:after="0"/>
+        <w:spacing w:before="0" w:after="0"/>
         <w:ind w:left="708"/>
         <w:rPr>
           <w:rFonts w:ascii="Arial" w:hAnsi="Arial" w:cs="Arial"/>
@@ -1068,7 +1068,7 @@
     <w:p>
       <w:pPr>
         <w:pStyle w:val="NormalWeb"/>
-        <w:spacing w:beforeAutospacing="0" w:before="0" w:afterAutospacing="0" w:after="0"/>
+        <w:spacing w:before="0" w:after="0"/>
         <w:ind w:left="708"/>
         <w:rPr>
           <w:rFonts w:ascii="Arial" w:hAnsi="Arial" w:cs="Arial"/>
@@ -1094,7 +1094,7 @@
     <w:p>
       <w:pPr>
         <w:pStyle w:val="NormalWeb"/>
-        <w:spacing w:beforeAutospacing="0" w:before="0" w:afterAutospacing="0" w:after="0"/>
+        <w:spacing w:before="0" w:after="0"/>
         <w:rPr>
           <w:rFonts w:ascii="Arial" w:hAnsi="Arial" w:cs="Arial"/>
           <w:sz w:val="24"/>
@@ -1114,7 +1114,7 @@
     <w:p>
       <w:pPr>
         <w:pStyle w:val="NormalWeb"/>
-        <w:spacing w:beforeAutospacing="0" w:before="0" w:afterAutospacing="0" w:after="0"/>
+        <w:spacing w:before="0" w:after="0"/>
         <w:rPr>
           <w:rFonts w:ascii="Arial" w:hAnsi="Arial" w:cs="Arial"/>
           <w:sz w:val="24"/>
@@ -1137,9 +1137,9 @@
         <w:pStyle w:val="NormalWeb"/>
         <w:numPr>
           <w:ilvl w:val="0"/>
-          <w:numId w:val="1"/>
+          <w:numId w:val="2"/>
         </w:numPr>
-        <w:spacing w:beforeAutospacing="0" w:before="0" w:afterAutospacing="0" w:after="0"/>
+        <w:spacing w:before="0" w:after="0"/>
         <w:rPr>
           <w:rFonts w:ascii="Arial" w:hAnsi="Arial" w:cs="Arial"/>
           <w:sz w:val="24"/>
@@ -1173,9 +1173,9 @@
         <w:pStyle w:val="NormalWeb"/>
         <w:numPr>
           <w:ilvl w:val="0"/>
-          <w:numId w:val="1"/>
+          <w:numId w:val="2"/>
         </w:numPr>
-        <w:spacing w:beforeAutospacing="0" w:before="0" w:afterAutospacing="0" w:after="0"/>
+        <w:spacing w:before="0" w:after="0"/>
         <w:rPr>
           <w:rFonts w:ascii="Arial" w:hAnsi="Arial" w:cs="Arial"/>
           <w:sz w:val="24"/>
@@ -1209,9 +1209,9 @@
         <w:pStyle w:val="NormalWeb"/>
         <w:numPr>
           <w:ilvl w:val="0"/>
-          <w:numId w:val="1"/>
+          <w:numId w:val="2"/>
         </w:numPr>
-        <w:spacing w:beforeAutospacing="0" w:before="0" w:afterAutospacing="0" w:after="0"/>
+        <w:spacing w:before="0" w:after="0"/>
         <w:rPr>
           <w:rFonts w:ascii="Arial" w:hAnsi="Arial" w:cs="Arial"/>
           <w:sz w:val="24"/>
@@ -1243,7 +1243,7 @@
     <w:p>
       <w:pPr>
         <w:pStyle w:val="NormalWeb"/>
-        <w:spacing w:beforeAutospacing="0" w:before="0" w:afterAutospacing="0" w:after="0"/>
+        <w:spacing w:before="0" w:after="0"/>
         <w:rPr>
           <w:rFonts w:ascii="Arial" w:hAnsi="Arial" w:cs="Arial"/>
           <w:sz w:val="24"/>
@@ -1263,7 +1263,7 @@
     <w:p>
       <w:pPr>
         <w:pStyle w:val="NormalWeb"/>
-        <w:spacing w:beforeAutospacing="0" w:before="0" w:afterAutospacing="0" w:after="0"/>
+        <w:spacing w:before="0" w:after="0"/>
         <w:rPr>
           <w:rFonts w:ascii="Arial" w:hAnsi="Arial" w:cs="Arial"/>
           <w:b/>
@@ -1513,121 +1513,6 @@
           <w:lang w:eastAsia="es-MX"/>
         </w:rPr>
         <w:t>Datos disponibles:</w:t>
-      </w:r>
-    </w:p>
-    <w:p>
-      <w:pPr>
-        <w:pStyle w:val="Normal"/>
-        <w:numPr>
-          <w:ilvl w:val="0"/>
-          <w:numId w:val="2"/>
-        </w:numPr>
-        <w:spacing w:lineRule="auto" w:line="240" w:before="0" w:after="0"/>
-        <w:ind w:hanging="360" w:left="426"/>
-        <w:jc w:val="both"/>
-        <w:textAlignment w:val="baseline"/>
-        <w:rPr>
-          <w:rFonts w:ascii="Arial" w:hAnsi="Arial" w:eastAsia="Times New Roman" w:cs="Arial"/>
-          <w:color w:val="000000"/>
-          <w:sz w:val="24"/>
-          <w:szCs w:val="24"/>
-          <w:lang w:eastAsia="es-MX"/>
-        </w:rPr>
-      </w:pPr>
-      <w:r>
-        <w:rPr>
-          <w:rFonts w:eastAsia="Times New Roman" w:cs="Arial" w:ascii="Arial" w:hAnsi="Arial"/>
-          <w:color w:val="000000"/>
-          <w:sz w:val="24"/>
-          <w:szCs w:val="24"/>
-          <w:lang w:eastAsia="es-MX"/>
-        </w:rPr>
-        <w:t>Ficción F= {Ana, Juan, Marta, Luis} </w:t>
-      </w:r>
-    </w:p>
-    <w:p>
-      <w:pPr>
-        <w:pStyle w:val="Normal"/>
-        <w:numPr>
-          <w:ilvl w:val="0"/>
-          <w:numId w:val="2"/>
-        </w:numPr>
-        <w:spacing w:lineRule="auto" w:line="240" w:before="0" w:after="0"/>
-        <w:ind w:hanging="360" w:left="426"/>
-        <w:jc w:val="both"/>
-        <w:textAlignment w:val="baseline"/>
-        <w:rPr>
-          <w:rFonts w:ascii="Arial" w:hAnsi="Arial" w:eastAsia="Times New Roman" w:cs="Arial"/>
-          <w:color w:val="000000"/>
-          <w:sz w:val="24"/>
-          <w:szCs w:val="24"/>
-          <w:lang w:eastAsia="es-MX"/>
-        </w:rPr>
-      </w:pPr>
-      <w:r>
-        <w:rPr>
-          <w:rFonts w:eastAsia="Times New Roman" w:cs="Arial" w:ascii="Arial" w:hAnsi="Arial"/>
-          <w:color w:val="000000"/>
-          <w:sz w:val="24"/>
-          <w:szCs w:val="24"/>
-          <w:lang w:eastAsia="es-MX"/>
-        </w:rPr>
-        <w:t>No ficción N= {Marta, Luis, Pedro, Sofía}</w:t>
-      </w:r>
-    </w:p>
-    <w:p>
-      <w:pPr>
-        <w:pStyle w:val="Normal"/>
-        <w:numPr>
-          <w:ilvl w:val="0"/>
-          <w:numId w:val="2"/>
-        </w:numPr>
-        <w:spacing w:lineRule="auto" w:line="240" w:before="0" w:after="0"/>
-        <w:ind w:hanging="360" w:left="426"/>
-        <w:jc w:val="both"/>
-        <w:textAlignment w:val="baseline"/>
-        <w:rPr>
-          <w:rFonts w:ascii="Arial" w:hAnsi="Arial" w:eastAsia="Times New Roman" w:cs="Arial"/>
-          <w:color w:val="000000"/>
-          <w:sz w:val="24"/>
-          <w:szCs w:val="24"/>
-          <w:lang w:eastAsia="es-MX"/>
-        </w:rPr>
-      </w:pPr>
-      <w:r>
-        <w:rPr>
-          <w:rFonts w:eastAsia="Times New Roman" w:cs="Arial" w:ascii="Arial" w:hAnsi="Arial"/>
-          <w:color w:val="000000"/>
-          <w:sz w:val="24"/>
-          <w:szCs w:val="24"/>
-          <w:lang w:eastAsia="es-MX"/>
-        </w:rPr>
-        <w:t>Interesados U= {Ana, Juan, Marta, Luis, Pedro, Sofía, Elena, Carlos}</w:t>
-      </w:r>
-    </w:p>
-    <w:p>
-      <w:pPr>
-        <w:pStyle w:val="Normal"/>
-        <w:spacing w:lineRule="auto" w:line="240" w:before="0" w:after="0"/>
-        <w:ind w:left="426"/>
-        <w:jc w:val="both"/>
-        <w:textAlignment w:val="baseline"/>
-        <w:rPr>
-          <w:rFonts w:ascii="Arial" w:hAnsi="Arial" w:eastAsia="Times New Roman" w:cs="Arial"/>
-          <w:color w:val="000000"/>
-          <w:sz w:val="24"/>
-          <w:szCs w:val="24"/>
-          <w:lang w:eastAsia="es-MX"/>
-        </w:rPr>
-      </w:pPr>
-      <w:r>
-        <w:rPr>
-          <w:rFonts w:eastAsia="Times New Roman" w:cs="Arial" w:ascii="Arial" w:hAnsi="Arial"/>
-          <w:color w:val="000000"/>
-          <w:sz w:val="24"/>
-          <w:szCs w:val="24"/>
-          <w:lang w:eastAsia="es-MX"/>
-        </w:rPr>
       </w:r>
     </w:p>
     <w:p>
@@ -1639,6 +1524,7 @@
         </w:numPr>
         <w:spacing w:lineRule="auto" w:line="240" w:before="0" w:after="0"/>
         <w:ind w:hanging="360" w:left="426"/>
+        <w:jc w:val="both"/>
         <w:textAlignment w:val="baseline"/>
         <w:rPr>
           <w:rFonts w:ascii="Arial" w:hAnsi="Arial" w:eastAsia="Times New Roman" w:cs="Arial"/>
@@ -1656,7 +1542,92 @@
           <w:szCs w:val="24"/>
           <w:lang w:eastAsia="es-MX"/>
         </w:rPr>
-        <w:t>Responder a cada pregunta, asociando qué operación entre conjuntos se está realizando</w:t>
+        <w:t>Ficción F= {Ana, Juan, Marta, Luis} </w:t>
+      </w:r>
+    </w:p>
+    <w:p>
+      <w:pPr>
+        <w:pStyle w:val="Normal"/>
+        <w:numPr>
+          <w:ilvl w:val="0"/>
+          <w:numId w:val="3"/>
+        </w:numPr>
+        <w:spacing w:lineRule="auto" w:line="240" w:before="0" w:after="0"/>
+        <w:ind w:hanging="360" w:left="426"/>
+        <w:jc w:val="both"/>
+        <w:textAlignment w:val="baseline"/>
+        <w:rPr>
+          <w:rFonts w:ascii="Arial" w:hAnsi="Arial" w:eastAsia="Times New Roman" w:cs="Arial"/>
+          <w:color w:val="000000"/>
+          <w:sz w:val="24"/>
+          <w:szCs w:val="24"/>
+          <w:lang w:eastAsia="es-MX"/>
+        </w:rPr>
+      </w:pPr>
+      <w:r>
+        <w:rPr>
+          <w:rFonts w:eastAsia="Times New Roman" w:cs="Arial" w:ascii="Arial" w:hAnsi="Arial"/>
+          <w:color w:val="000000"/>
+          <w:sz w:val="24"/>
+          <w:szCs w:val="24"/>
+          <w:lang w:eastAsia="es-MX"/>
+        </w:rPr>
+        <w:t>No ficción N= {Marta, Luis, Pedro, Sofía}</w:t>
+      </w:r>
+    </w:p>
+    <w:p>
+      <w:pPr>
+        <w:pStyle w:val="Normal"/>
+        <w:numPr>
+          <w:ilvl w:val="0"/>
+          <w:numId w:val="3"/>
+        </w:numPr>
+        <w:spacing w:lineRule="auto" w:line="240" w:before="0" w:after="0"/>
+        <w:ind w:hanging="360" w:left="426"/>
+        <w:jc w:val="both"/>
+        <w:textAlignment w:val="baseline"/>
+        <w:rPr>
+          <w:rFonts w:ascii="Arial" w:hAnsi="Arial" w:eastAsia="Times New Roman" w:cs="Arial"/>
+          <w:color w:val="000000"/>
+          <w:sz w:val="24"/>
+          <w:szCs w:val="24"/>
+          <w:lang w:eastAsia="es-MX"/>
+        </w:rPr>
+      </w:pPr>
+      <w:r>
+        <w:rPr>
+          <w:rFonts w:eastAsia="Times New Roman" w:cs="Arial" w:ascii="Arial" w:hAnsi="Arial"/>
+          <w:color w:val="000000"/>
+          <w:sz w:val="24"/>
+          <w:szCs w:val="24"/>
+          <w:lang w:eastAsia="es-MX"/>
+        </w:rPr>
+        <w:t>Interesados U= {Ana, Juan, Marta, Luis, Pedro, Sofía, Elena, Carlos}</w:t>
+      </w:r>
+    </w:p>
+    <w:p>
+      <w:pPr>
+        <w:pStyle w:val="Normal"/>
+        <w:spacing w:lineRule="auto" w:line="240" w:before="0" w:after="0"/>
+        <w:ind w:left="426"/>
+        <w:jc w:val="both"/>
+        <w:textAlignment w:val="baseline"/>
+        <w:rPr>
+          <w:rFonts w:ascii="Arial" w:hAnsi="Arial" w:eastAsia="Times New Roman" w:cs="Arial"/>
+          <w:color w:val="000000"/>
+          <w:sz w:val="24"/>
+          <w:szCs w:val="24"/>
+          <w:lang w:eastAsia="es-MX"/>
+        </w:rPr>
+      </w:pPr>
+      <w:r>
+        <w:rPr>
+          <w:rFonts w:eastAsia="Times New Roman" w:cs="Arial" w:ascii="Arial" w:hAnsi="Arial"/>
+          <w:color w:val="000000"/>
+          <w:sz w:val="24"/>
+          <w:szCs w:val="24"/>
+          <w:lang w:eastAsia="es-MX"/>
+        </w:rPr>
       </w:r>
     </w:p>
     <w:p>
@@ -1667,7 +1638,7 @@
           <w:numId w:val="4"/>
         </w:numPr>
         <w:spacing w:lineRule="auto" w:line="240" w:before="0" w:after="0"/>
-        <w:ind w:hanging="284" w:left="709"/>
+        <w:ind w:hanging="360" w:left="426"/>
         <w:textAlignment w:val="baseline"/>
         <w:rPr>
           <w:rFonts w:ascii="Arial" w:hAnsi="Arial" w:eastAsia="Times New Roman" w:cs="Arial"/>
@@ -1685,7 +1656,7 @@
           <w:szCs w:val="24"/>
           <w:lang w:eastAsia="es-MX"/>
         </w:rPr>
-        <w:t>¿Quiénes están interesados en participar en al menos uno de los géneros literarios (ficción o no ficción)?</w:t>
+        <w:t>Responder a cada pregunta, asociando qué operación entre conjuntos se está realizando</w:t>
       </w:r>
     </w:p>
     <w:p>
@@ -1693,7 +1664,36 @@
         <w:pStyle w:val="Normal"/>
         <w:numPr>
           <w:ilvl w:val="0"/>
-          <w:numId w:val="4"/>
+          <w:numId w:val="5"/>
+        </w:numPr>
+        <w:spacing w:lineRule="auto" w:line="240" w:before="0" w:after="0"/>
+        <w:ind w:hanging="284" w:left="709"/>
+        <w:textAlignment w:val="baseline"/>
+        <w:rPr>
+          <w:rFonts w:ascii="Arial" w:hAnsi="Arial" w:eastAsia="Times New Roman" w:cs="Arial"/>
+          <w:color w:val="000000"/>
+          <w:sz w:val="24"/>
+          <w:szCs w:val="24"/>
+          <w:lang w:eastAsia="es-MX"/>
+        </w:rPr>
+      </w:pPr>
+      <w:r>
+        <w:rPr>
+          <w:rFonts w:eastAsia="Times New Roman" w:cs="Arial" w:ascii="Arial" w:hAnsi="Arial"/>
+          <w:color w:val="000000"/>
+          <w:sz w:val="24"/>
+          <w:szCs w:val="24"/>
+          <w:lang w:eastAsia="es-MX"/>
+        </w:rPr>
+        <w:t>¿Quiénes están interesados en participar en al menos uno de los géneros literarios (ficción o no ficción)?</w:t>
+      </w:r>
+    </w:p>
+    <w:p>
+      <w:pPr>
+        <w:pStyle w:val="Normal"/>
+        <w:numPr>
+          <w:ilvl w:val="0"/>
+          <w:numId w:val="5"/>
         </w:numPr>
         <w:spacing w:lineRule="auto" w:line="240" w:before="0" w:after="0"/>
         <w:ind w:hanging="283" w:left="709"/>
@@ -1807,21 +1807,69 @@
     <w:p>
       <w:pPr>
         <w:pStyle w:val="Normal"/>
+        <w:numPr>
+          <w:ilvl w:val="0"/>
+          <w:numId w:val="0"/>
+        </w:numPr>
         <w:spacing w:lineRule="auto" w:line="240" w:before="0" w:after="0"/>
+        <w:ind w:hanging="0" w:left="709"/>
+        <w:textAlignment w:val="baseline"/>
         <w:rPr>
           <w:rFonts w:ascii="Arial" w:hAnsi="Arial" w:eastAsia="Times New Roman" w:cs="Arial"/>
-          <w:sz w:val="24"/>
-          <w:szCs w:val="24"/>
-          <w:lang w:eastAsia="es-MX"/>
-        </w:rPr>
-      </w:pPr>
-      <w:r>
-        <w:rPr>
-          <w:rFonts w:eastAsia="Times New Roman" w:cs="Arial" w:ascii="Arial" w:hAnsi="Arial"/>
-          <w:sz w:val="24"/>
-          <w:szCs w:val="24"/>
-          <w:lang w:eastAsia="es-MX"/>
-        </w:rPr>
+          <w:color w:val="000000"/>
+          <w:sz w:val="24"/>
+          <w:szCs w:val="24"/>
+          <w:lang w:eastAsia="es-MX"/>
+        </w:rPr>
+      </w:pPr>
+      <w:r>
+        <w:rPr/>
+        <w:drawing>
+          <wp:anchor behindDoc="0" distT="0" distB="0" distL="0" distR="0" simplePos="0" locked="0" layoutInCell="0" allowOverlap="1" relativeHeight="26">
+            <wp:simplePos x="0" y="0"/>
+            <wp:positionH relativeFrom="column">
+              <wp:align>center</wp:align>
+            </wp:positionH>
+            <wp:positionV relativeFrom="paragraph">
+              <wp:posOffset>635</wp:posOffset>
+            </wp:positionV>
+            <wp:extent cx="6130290" cy="3642360"/>
+            <wp:effectExtent l="0" t="0" r="0" b="0"/>
+            <wp:wrapSquare wrapText="largest"/>
+            <wp:docPr id="1" name="Image1" descr=""/>
+            <wp:cNvGraphicFramePr>
+              <a:graphicFrameLocks xmlns:a="http://schemas.openxmlformats.org/drawingml/2006/main" noChangeAspect="1"/>
+            </wp:cNvGraphicFramePr>
+            <a:graphic xmlns:a="http://schemas.openxmlformats.org/drawingml/2006/main">
+              <a:graphicData uri="http://schemas.openxmlformats.org/drawingml/2006/picture">
+                <pic:pic xmlns:pic="http://schemas.openxmlformats.org/drawingml/2006/picture">
+                  <pic:nvPicPr>
+                    <pic:cNvPr id="1" name="Image1" descr=""/>
+                    <pic:cNvPicPr>
+                      <a:picLocks noChangeAspect="1" noChangeArrowheads="1"/>
+                    </pic:cNvPicPr>
+                  </pic:nvPicPr>
+                  <pic:blipFill>
+                    <a:blip r:embed="rId2"/>
+                    <a:stretch>
+                      <a:fillRect/>
+                    </a:stretch>
+                  </pic:blipFill>
+                  <pic:spPr bwMode="auto">
+                    <a:xfrm>
+                      <a:off x="0" y="0"/>
+                      <a:ext cx="6130290" cy="3642360"/>
+                    </a:xfrm>
+                    <a:prstGeom prst="rect">
+                      <a:avLst/>
+                    </a:prstGeom>
+                    <a:noFill/>
+                  </pic:spPr>
+                </pic:pic>
+              </a:graphicData>
+            </a:graphic>
+          </wp:anchor>
+        </w:drawing>
       </w:r>
     </w:p>
     <w:p>
@@ -1838,12 +1886,10 @@
       <w:r>
         <w:rPr>
           <w:rFonts w:eastAsia="Times New Roman" w:cs="Arial" w:ascii="Arial" w:hAnsi="Arial"/>
-          <w:color w:val="000000"/>
-          <w:sz w:val="24"/>
-          <w:szCs w:val="24"/>
-          <w:lang w:eastAsia="es-MX"/>
-        </w:rPr>
-        <w:t>Sección de relación de equivalencia: Clasificación por géneros favoritos</w:t>
+          <w:sz w:val="24"/>
+          <w:szCs w:val="24"/>
+          <w:lang w:eastAsia="es-MX"/>
+        </w:rPr>
       </w:r>
     </w:p>
     <w:p>
@@ -1852,7 +1898,6 @@
         <w:spacing w:lineRule="auto" w:line="240" w:before="0" w:after="0"/>
         <w:rPr>
           <w:rFonts w:ascii="Arial" w:hAnsi="Arial" w:eastAsia="Times New Roman" w:cs="Arial"/>
-          <w:color w:val="000000"/>
           <w:sz w:val="24"/>
           <w:szCs w:val="24"/>
           <w:lang w:eastAsia="es-MX"/>
@@ -1866,13 +1911,242 @@
           <w:szCs w:val="24"/>
           <w:lang w:eastAsia="es-MX"/>
         </w:rPr>
-        <w:t>Definición de la relación: Dos personas están relacionadas si tienen los mismos intereses literarios (pertenecen al mismo grupo de géneros).</w:t>
+        <w:t>Sección de relación de equivalencia: Clasificación por géneros favoritos</w:t>
       </w:r>
     </w:p>
     <w:p>
       <w:pPr>
         <w:pStyle w:val="Normal"/>
         <w:spacing w:lineRule="auto" w:line="240" w:before="0" w:after="0"/>
+        <w:rPr>
+          <w:rFonts w:ascii="Arial" w:hAnsi="Arial" w:eastAsia="Times New Roman" w:cs="Arial"/>
+          <w:color w:val="000000"/>
+          <w:sz w:val="24"/>
+          <w:szCs w:val="24"/>
+          <w:lang w:eastAsia="es-MX"/>
+        </w:rPr>
+      </w:pPr>
+      <w:r>
+        <w:rPr>
+          <w:rFonts w:eastAsia="Times New Roman" w:cs="Arial" w:ascii="Arial" w:hAnsi="Arial"/>
+          <w:color w:val="000000"/>
+          <w:sz w:val="24"/>
+          <w:szCs w:val="24"/>
+          <w:lang w:eastAsia="es-MX"/>
+        </w:rPr>
+        <w:t>Definición de la relación: Dos personas están relacionadas si tienen los mismos intereses literarios (pertenecen al mismo grupo de géneros).</w:t>
+      </w:r>
+    </w:p>
+    <w:p>
+      <w:pPr>
+        <w:pStyle w:val="Normal"/>
+        <w:spacing w:lineRule="auto" w:line="240" w:before="0" w:after="0"/>
+        <w:rPr>
+          <w:rFonts w:ascii="Arial" w:hAnsi="Arial" w:eastAsia="Times New Roman" w:cs="Arial"/>
+          <w:sz w:val="24"/>
+          <w:szCs w:val="24"/>
+          <w:lang w:eastAsia="es-MX"/>
+        </w:rPr>
+      </w:pPr>
+      <w:r>
+        <w:rPr>
+          <w:rFonts w:eastAsia="Times New Roman" w:cs="Arial" w:ascii="Arial" w:hAnsi="Arial"/>
+          <w:sz w:val="24"/>
+          <w:szCs w:val="24"/>
+          <w:lang w:eastAsia="es-MX"/>
+        </w:rPr>
+      </w:r>
+    </w:p>
+    <w:p>
+      <w:pPr>
+        <w:pStyle w:val="Normal"/>
+        <w:numPr>
+          <w:ilvl w:val="0"/>
+          <w:numId w:val="6"/>
+        </w:numPr>
+        <w:spacing w:lineRule="auto" w:line="240" w:before="0" w:after="0"/>
+        <w:ind w:hanging="425" w:left="426"/>
+        <w:textAlignment w:val="baseline"/>
+        <w:rPr>
+          <w:rFonts w:ascii="Arial" w:hAnsi="Arial" w:eastAsia="Times New Roman" w:cs="Arial"/>
+          <w:color w:val="000000"/>
+          <w:sz w:val="24"/>
+          <w:szCs w:val="24"/>
+          <w:lang w:eastAsia="es-MX"/>
+        </w:rPr>
+      </w:pPr>
+      <w:r>
+        <w:rPr>
+          <w:rFonts w:eastAsia="Times New Roman" w:cs="Arial" w:ascii="Arial" w:hAnsi="Arial"/>
+          <w:color w:val="000000"/>
+          <w:sz w:val="24"/>
+          <w:szCs w:val="24"/>
+          <w:lang w:eastAsia="es-MX"/>
+        </w:rPr>
+        <w:t>Crea las clases de equivalencia que agrupan a los participantes según sus intereses literarios:</w:t>
+      </w:r>
+    </w:p>
+    <w:p>
+      <w:pPr>
+        <w:pStyle w:val="Normal"/>
+        <w:numPr>
+          <w:ilvl w:val="0"/>
+          <w:numId w:val="7"/>
+        </w:numPr>
+        <w:spacing w:lineRule="auto" w:line="240" w:before="0" w:after="0"/>
+        <w:ind w:hanging="283" w:left="709"/>
+        <w:textAlignment w:val="baseline"/>
+        <w:rPr>
+          <w:rFonts w:ascii="Arial" w:hAnsi="Arial" w:eastAsia="Times New Roman" w:cs="Arial"/>
+          <w:color w:val="000000"/>
+          <w:sz w:val="24"/>
+          <w:szCs w:val="24"/>
+          <w:lang w:eastAsia="es-MX"/>
+        </w:rPr>
+      </w:pPr>
+      <w:r>
+        <w:rPr>
+          <w:rFonts w:eastAsia="Times New Roman" w:cs="Arial" w:ascii="Arial" w:hAnsi="Arial"/>
+          <w:color w:val="000000"/>
+          <w:sz w:val="24"/>
+          <w:szCs w:val="24"/>
+          <w:lang w:eastAsia="es-MX"/>
+        </w:rPr>
+        <w:t>Clase 1 (ficción) = ?</w:t>
+        <w:tab/>
+      </w:r>
+    </w:p>
+    <w:p>
+      <w:pPr>
+        <w:pStyle w:val="Normal"/>
+        <w:numPr>
+          <w:ilvl w:val="0"/>
+          <w:numId w:val="32"/>
+        </w:numPr>
+        <w:spacing w:lineRule="auto" w:line="240" w:before="0" w:after="0"/>
+        <w:ind w:hanging="283" w:left="709"/>
+        <w:textAlignment w:val="baseline"/>
+        <w:rPr>
+          <w:rFonts w:ascii="Arial" w:hAnsi="Arial" w:eastAsia="Times New Roman" w:cs="Arial"/>
+          <w:color w:val="000000"/>
+          <w:sz w:val="24"/>
+          <w:szCs w:val="24"/>
+          <w:lang w:eastAsia="es-MX"/>
+        </w:rPr>
+      </w:pPr>
+      <w:r>
+        <w:rPr>
+          <w:rFonts w:eastAsia="Times New Roman" w:cs="Arial" w:ascii="Arial" w:hAnsi="Arial"/>
+          <w:color w:val="000000"/>
+          <w:sz w:val="24"/>
+          <w:szCs w:val="24"/>
+          <w:lang w:eastAsia="es-MX"/>
+        </w:rPr>
+        <w:t>Clase 2 (No ficción) = ?</w:t>
+      </w:r>
+    </w:p>
+    <w:p>
+      <w:pPr>
+        <w:pStyle w:val="Normal"/>
+        <w:numPr>
+          <w:ilvl w:val="0"/>
+          <w:numId w:val="33"/>
+        </w:numPr>
+        <w:spacing w:lineRule="auto" w:line="240" w:before="0" w:after="0"/>
+        <w:ind w:hanging="283" w:left="709"/>
+        <w:textAlignment w:val="baseline"/>
+        <w:rPr>
+          <w:rFonts w:ascii="Arial" w:hAnsi="Arial" w:eastAsia="Times New Roman" w:cs="Arial"/>
+          <w:color w:val="000000"/>
+          <w:sz w:val="24"/>
+          <w:szCs w:val="24"/>
+          <w:lang w:eastAsia="es-MX"/>
+        </w:rPr>
+      </w:pPr>
+      <w:r>
+        <w:rPr>
+          <w:rFonts w:eastAsia="Times New Roman" w:cs="Arial" w:ascii="Arial" w:hAnsi="Arial"/>
+          <w:color w:val="000000"/>
+          <w:sz w:val="24"/>
+          <w:szCs w:val="24"/>
+          <w:lang w:eastAsia="es-MX"/>
+        </w:rPr>
+        <w:t>Clase 3 (No les interesa ficción o no ficción): = ?</w:t>
+      </w:r>
+    </w:p>
+    <w:p>
+      <w:pPr>
+        <w:pStyle w:val="Normal"/>
+        <w:numPr>
+          <w:ilvl w:val="0"/>
+          <w:numId w:val="0"/>
+        </w:numPr>
+        <w:spacing w:lineRule="auto" w:line="240" w:before="0" w:after="0"/>
+        <w:ind w:hanging="0" w:left="709"/>
+        <w:textAlignment w:val="baseline"/>
+        <w:rPr>
+          <w:rFonts w:ascii="Arial" w:hAnsi="Arial" w:eastAsia="Times New Roman" w:cs="Arial"/>
+          <w:color w:val="000000"/>
+          <w:sz w:val="24"/>
+          <w:szCs w:val="24"/>
+          <w:lang w:eastAsia="es-MX"/>
+        </w:rPr>
+      </w:pPr>
+      <w:r>
+        <w:rPr/>
+        <w:drawing>
+          <wp:anchor behindDoc="0" distT="0" distB="0" distL="0" distR="0" simplePos="0" locked="0" layoutInCell="0" allowOverlap="1" relativeHeight="27">
+            <wp:simplePos x="0" y="0"/>
+            <wp:positionH relativeFrom="column">
+              <wp:align>center</wp:align>
+            </wp:positionH>
+            <wp:positionV relativeFrom="paragraph">
+              <wp:posOffset>635</wp:posOffset>
+            </wp:positionV>
+            <wp:extent cx="5248275" cy="1562100"/>
+            <wp:effectExtent l="0" t="0" r="0" b="0"/>
+            <wp:wrapSquare wrapText="largest"/>
+            <wp:docPr id="2" name="Image2" descr=""/>
+            <wp:cNvGraphicFramePr>
+              <a:graphicFrameLocks xmlns:a="http://schemas.openxmlformats.org/drawingml/2006/main" noChangeAspect="1"/>
+            </wp:cNvGraphicFramePr>
+            <a:graphic xmlns:a="http://schemas.openxmlformats.org/drawingml/2006/main">
+              <a:graphicData uri="http://schemas.openxmlformats.org/drawingml/2006/picture">
+                <pic:pic xmlns:pic="http://schemas.openxmlformats.org/drawingml/2006/picture">
+                  <pic:nvPicPr>
+                    <pic:cNvPr id="2" name="Image2" descr=""/>
+                    <pic:cNvPicPr>
+                      <a:picLocks noChangeAspect="1" noChangeArrowheads="1"/>
+                    </pic:cNvPicPr>
+                  </pic:nvPicPr>
+                  <pic:blipFill>
+                    <a:blip r:embed="rId3"/>
+                    <a:stretch>
+                      <a:fillRect/>
+                    </a:stretch>
+                  </pic:blipFill>
+                  <pic:spPr bwMode="auto">
+                    <a:xfrm>
+                      <a:off x="0" y="0"/>
+                      <a:ext cx="5248275" cy="1562100"/>
+                    </a:xfrm>
+                    <a:prstGeom prst="rect">
+                      <a:avLst/>
+                    </a:prstGeom>
+                    <a:noFill/>
+                  </pic:spPr>
+                </pic:pic>
+              </a:graphicData>
+            </a:graphic>
+          </wp:anchor>
+        </w:drawing>
+      </w:r>
+    </w:p>
+    <w:p>
+      <w:pPr>
+        <w:pStyle w:val="Normal"/>
+        <w:spacing w:lineRule="auto" w:line="240" w:before="0" w:after="0"/>
+        <w:ind w:left="708"/>
         <w:rPr>
           <w:rFonts w:ascii="Arial" w:hAnsi="Arial" w:eastAsia="Times New Roman" w:cs="Arial"/>
           <w:sz w:val="24"/>
@@ -1915,7 +2189,7 @@
           <w:szCs w:val="24"/>
           <w:lang w:eastAsia="es-MX"/>
         </w:rPr>
-        <w:t>Crea las clases de equivalencia que agrupan a los participantes según sus intereses literarios:</w:t>
+        <w:t>Responde las preguntas relacionadas con las propiedades de reflexividad, simetría y transitividad en relación con el conjunto de datos proporcionado. Justifica cada una de tus respuestas</w:t>
       </w:r>
     </w:p>
     <w:p>
@@ -1924,143 +2198,6 @@
         <w:numPr>
           <w:ilvl w:val="0"/>
           <w:numId w:val="9"/>
-        </w:numPr>
-        <w:spacing w:lineRule="auto" w:line="240" w:before="0" w:after="0"/>
-        <w:ind w:hanging="283" w:left="709"/>
-        <w:textAlignment w:val="baseline"/>
-        <w:rPr>
-          <w:rFonts w:ascii="Arial" w:hAnsi="Arial" w:eastAsia="Times New Roman" w:cs="Arial"/>
-          <w:color w:val="000000"/>
-          <w:sz w:val="24"/>
-          <w:szCs w:val="24"/>
-          <w:lang w:eastAsia="es-MX"/>
-        </w:rPr>
-      </w:pPr>
-      <w:r>
-        <w:rPr>
-          <w:rFonts w:eastAsia="Times New Roman" w:cs="Arial" w:ascii="Arial" w:hAnsi="Arial"/>
-          <w:color w:val="000000"/>
-          <w:sz w:val="24"/>
-          <w:szCs w:val="24"/>
-          <w:lang w:eastAsia="es-MX"/>
-        </w:rPr>
-        <w:t>Clase 1 (ficción) = ?</w:t>
-      </w:r>
-    </w:p>
-    <w:p>
-      <w:pPr>
-        <w:pStyle w:val="Normal"/>
-        <w:numPr>
-          <w:ilvl w:val="0"/>
-          <w:numId w:val="32"/>
-        </w:numPr>
-        <w:spacing w:lineRule="auto" w:line="240" w:before="0" w:after="0"/>
-        <w:ind w:hanging="283" w:left="709"/>
-        <w:textAlignment w:val="baseline"/>
-        <w:rPr>
-          <w:rFonts w:ascii="Arial" w:hAnsi="Arial" w:eastAsia="Times New Roman" w:cs="Arial"/>
-          <w:color w:val="000000"/>
-          <w:sz w:val="24"/>
-          <w:szCs w:val="24"/>
-          <w:lang w:eastAsia="es-MX"/>
-        </w:rPr>
-      </w:pPr>
-      <w:r>
-        <w:rPr>
-          <w:rFonts w:eastAsia="Times New Roman" w:cs="Arial" w:ascii="Arial" w:hAnsi="Arial"/>
-          <w:color w:val="000000"/>
-          <w:sz w:val="24"/>
-          <w:szCs w:val="24"/>
-          <w:lang w:eastAsia="es-MX"/>
-        </w:rPr>
-        <w:t>Clase 2 (No ficción) = ?</w:t>
-      </w:r>
-    </w:p>
-    <w:p>
-      <w:pPr>
-        <w:pStyle w:val="Normal"/>
-        <w:numPr>
-          <w:ilvl w:val="0"/>
-          <w:numId w:val="33"/>
-        </w:numPr>
-        <w:spacing w:lineRule="auto" w:line="240" w:before="0" w:after="0"/>
-        <w:ind w:hanging="283" w:left="709"/>
-        <w:textAlignment w:val="baseline"/>
-        <w:rPr>
-          <w:rFonts w:ascii="Arial" w:hAnsi="Arial" w:eastAsia="Times New Roman" w:cs="Arial"/>
-          <w:color w:val="000000"/>
-          <w:sz w:val="24"/>
-          <w:szCs w:val="24"/>
-          <w:lang w:eastAsia="es-MX"/>
-        </w:rPr>
-      </w:pPr>
-      <w:r>
-        <w:rPr>
-          <w:rFonts w:eastAsia="Times New Roman" w:cs="Arial" w:ascii="Arial" w:hAnsi="Arial"/>
-          <w:color w:val="000000"/>
-          <w:sz w:val="24"/>
-          <w:szCs w:val="24"/>
-          <w:lang w:eastAsia="es-MX"/>
-        </w:rPr>
-        <w:t>Clase 3 (No les interesa ficción o no ficción): = ?</w:t>
-      </w:r>
-    </w:p>
-    <w:p>
-      <w:pPr>
-        <w:pStyle w:val="Normal"/>
-        <w:spacing w:lineRule="auto" w:line="240" w:before="0" w:after="0"/>
-        <w:ind w:left="708"/>
-        <w:rPr>
-          <w:rFonts w:ascii="Arial" w:hAnsi="Arial" w:eastAsia="Times New Roman" w:cs="Arial"/>
-          <w:sz w:val="24"/>
-          <w:szCs w:val="24"/>
-          <w:lang w:eastAsia="es-MX"/>
-        </w:rPr>
-      </w:pPr>
-      <w:r>
-        <w:rPr>
-          <w:rFonts w:eastAsia="Times New Roman" w:cs="Arial" w:ascii="Arial" w:hAnsi="Arial"/>
-          <w:sz w:val="24"/>
-          <w:szCs w:val="24"/>
-          <w:lang w:eastAsia="es-MX"/>
-        </w:rPr>
-      </w:r>
-    </w:p>
-    <w:p>
-      <w:pPr>
-        <w:pStyle w:val="Normal"/>
-        <w:numPr>
-          <w:ilvl w:val="0"/>
-          <w:numId w:val="12"/>
-        </w:numPr>
-        <w:spacing w:lineRule="auto" w:line="240" w:before="0" w:after="0"/>
-        <w:ind w:hanging="425" w:left="426"/>
-        <w:textAlignment w:val="baseline"/>
-        <w:rPr>
-          <w:rFonts w:ascii="Arial" w:hAnsi="Arial" w:eastAsia="Times New Roman" w:cs="Arial"/>
-          <w:color w:val="000000"/>
-          <w:sz w:val="24"/>
-          <w:szCs w:val="24"/>
-          <w:lang w:eastAsia="es-MX"/>
-        </w:rPr>
-      </w:pPr>
-      <w:r>
-        <w:rPr>
-          <w:rFonts w:eastAsia="Times New Roman" w:cs="Arial" w:ascii="Arial" w:hAnsi="Arial"/>
-          <w:color w:val="000000"/>
-          <w:sz w:val="24"/>
-          <w:szCs w:val="24"/>
-          <w:lang w:eastAsia="es-MX"/>
-        </w:rPr>
-        <w:t>Responde las preguntas relacionadas con las propiedades de reflexividad, simetría y transitividad en relación con el conjunto de datos proporcionado. Justifica cada una de tus respuestas</w:t>
-      </w:r>
-    </w:p>
-    <w:p>
-      <w:pPr>
-        <w:pStyle w:val="Normal"/>
-        <w:numPr>
-          <w:ilvl w:val="0"/>
-          <w:numId w:val="13"/>
         </w:numPr>
         <w:tabs>
           <w:tab w:val="clear" w:pos="708"/>
@@ -2265,7 +2402,7 @@
         <w:pStyle w:val="Normal"/>
         <w:numPr>
           <w:ilvl w:val="0"/>
-          <w:numId w:val="18"/>
+          <w:numId w:val="10"/>
         </w:numPr>
         <w:spacing w:lineRule="auto" w:line="240" w:before="0" w:after="0"/>
         <w:ind w:hanging="142" w:left="709"/>
@@ -2467,7 +2604,7 @@
         <w:pStyle w:val="Normal"/>
         <w:numPr>
           <w:ilvl w:val="0"/>
-          <w:numId w:val="23"/>
+          <w:numId w:val="11"/>
         </w:numPr>
         <w:spacing w:lineRule="auto" w:line="240" w:before="0" w:after="0"/>
         <w:ind w:hanging="141" w:left="709"/>
@@ -2636,7 +2773,7 @@
     <w:p>
       <w:pPr>
         <w:pStyle w:val="NormalWeb"/>
-        <w:spacing w:beforeAutospacing="0" w:before="0" w:afterAutospacing="0" w:after="0"/>
+        <w:spacing w:before="0" w:after="0"/>
         <w:rPr>
           <w:rFonts w:ascii="Arial" w:hAnsi="Arial" w:cs="Arial"/>
           <w:sz w:val="24"/>
@@ -2651,15 +2788,57 @@
           <w:szCs w:val="24"/>
           <w:lang w:val="es-ES_tradnl"/>
         </w:rPr>
+        <w:drawing>
+          <wp:anchor behindDoc="0" distT="0" distB="0" distL="0" distR="0" simplePos="0" locked="0" layoutInCell="0" allowOverlap="1" relativeHeight="28">
+            <wp:simplePos x="0" y="0"/>
+            <wp:positionH relativeFrom="column">
+              <wp:align>center</wp:align>
+            </wp:positionH>
+            <wp:positionV relativeFrom="paragraph">
+              <wp:posOffset>635</wp:posOffset>
+            </wp:positionV>
+            <wp:extent cx="6400800" cy="3044825"/>
+            <wp:effectExtent l="0" t="0" r="0" b="0"/>
+            <wp:wrapSquare wrapText="largest"/>
+            <wp:docPr id="3" name="Image3" descr=""/>
+            <wp:cNvGraphicFramePr>
+              <a:graphicFrameLocks xmlns:a="http://schemas.openxmlformats.org/drawingml/2006/main" noChangeAspect="1"/>
+            </wp:cNvGraphicFramePr>
+            <a:graphic xmlns:a="http://schemas.openxmlformats.org/drawingml/2006/main">
+              <a:graphicData uri="http://schemas.openxmlformats.org/drawingml/2006/picture">
+                <pic:pic xmlns:pic="http://schemas.openxmlformats.org/drawingml/2006/picture">
+                  <pic:nvPicPr>
+                    <pic:cNvPr id="3" name="Image3" descr=""/>
+                    <pic:cNvPicPr>
+                      <a:picLocks noChangeAspect="1" noChangeArrowheads="1"/>
+                    </pic:cNvPicPr>
+                  </pic:nvPicPr>
+                  <pic:blipFill>
+                    <a:blip r:embed="rId4"/>
+                    <a:stretch>
+                      <a:fillRect/>
+                    </a:stretch>
+                  </pic:blipFill>
+                  <pic:spPr bwMode="auto">
+                    <a:xfrm>
+                      <a:off x="0" y="0"/>
+                      <a:ext cx="6400800" cy="3044825"/>
+                    </a:xfrm>
+                    <a:prstGeom prst="rect">
+                      <a:avLst/>
+                    </a:prstGeom>
+                    <a:noFill/>
+                  </pic:spPr>
+                </pic:pic>
+              </a:graphicData>
+            </a:graphic>
+          </wp:anchor>
+        </w:drawing>
       </w:r>
     </w:p>
     <w:sectPr>
-      <w:headerReference w:type="even" r:id="rId2"/>
-      <w:headerReference w:type="default" r:id="rId3"/>
-      <w:headerReference w:type="first" r:id="rId4"/>
-      <w:footerReference w:type="even" r:id="rId5"/>
+      <w:headerReference w:type="default" r:id="rId5"/>
       <w:footerReference w:type="default" r:id="rId6"/>
-      <w:footerReference w:type="first" r:id="rId7"/>
       <w:type w:val="nextPage"/>
       <w:pgSz w:w="12240" w:h="15840"/>
       <w:pgMar w:left="1080" w:right="1080" w:gutter="0" w:header="340" w:top="1440" w:footer="680" w:bottom="1440"/>
@@ -2677,44 +2856,12 @@
   <w:p>
     <w:pPr>
       <w:pStyle w:val="Footer"/>
-      <w:rPr/>
-    </w:pPr>
-    <w:r>
-      <w:rPr/>
-    </w:r>
-  </w:p>
-</w:ftr>
-</file>
-
-<file path=word/footer2.xml><?xml version="1.0" encoding="utf-8"?>
-<w:ftr xmlns:o="urn:schemas-microsoft-com:office:office" xmlns:r="http://schemas.openxmlformats.org/officeDocument/2006/relationships" xmlns:v="urn:schemas-microsoft-com:vml" xmlns:w="http://schemas.openxmlformats.org/wordprocessingml/2006/main" xmlns:w10="urn:schemas-microsoft-com:office:word" xmlns:wp="http://schemas.openxmlformats.org/drawingml/2006/wordprocessingDrawing" xmlns:pic="http://schemas.openxmlformats.org/drawingml/2006/picture" xmlns:wps="http://schemas.microsoft.com/office/word/2010/wordprocessingShape" xmlns:wpg="http://schemas.microsoft.com/office/word/2010/wordprocessingGroup" xmlns:mc="http://schemas.openxmlformats.org/markup-compatibility/2006" xmlns:wp14="http://schemas.microsoft.com/office/word/2010/wordprocessingDrawing" xmlns:w14="http://schemas.microsoft.com/office/word/2010/wordml" xmlns:w15="http://schemas.microsoft.com/office/word/2012/wordml" mc:Ignorable="w14 wp14 w15">
-  <w:p>
-    <w:pPr>
-      <w:pStyle w:val="Footer"/>
-      <w:rPr/>
-    </w:pPr>
-    <w:r>
       <w:rPr>
-        <w:rFonts w:cs="Arial" w:ascii="Arial" w:hAnsi="Arial"/>
+        <w:rFonts w:ascii="Arial" w:hAnsi="Arial" w:cs="Arial"/>
         <w:b/>
         <w:sz w:val="14"/>
         <w:lang w:val="es-ES"/>
       </w:rPr>
-      <w:t>Matemáticas Discretas</w:t>
-      <w:tab/>
-      <w:t>ISC</w:t>
-      <w:tab/>
-    </w:r>
-  </w:p>
-</w:ftr>
-</file>
-
-<file path=word/footer3.xml><?xml version="1.0" encoding="utf-8"?>
-<w:ftr xmlns:o="urn:schemas-microsoft-com:office:office" xmlns:r="http://schemas.openxmlformats.org/officeDocument/2006/relationships" xmlns:v="urn:schemas-microsoft-com:vml" xmlns:w="http://schemas.openxmlformats.org/wordprocessingml/2006/main" xmlns:w10="urn:schemas-microsoft-com:office:word" xmlns:wp="http://schemas.openxmlformats.org/drawingml/2006/wordprocessingDrawing" xmlns:pic="http://schemas.openxmlformats.org/drawingml/2006/picture" xmlns:wps="http://schemas.microsoft.com/office/word/2010/wordprocessingShape" xmlns:wpg="http://schemas.microsoft.com/office/word/2010/wordprocessingGroup" xmlns:mc="http://schemas.openxmlformats.org/markup-compatibility/2006" xmlns:wp14="http://schemas.microsoft.com/office/word/2010/wordprocessingDrawing" xmlns:w14="http://schemas.microsoft.com/office/word/2010/wordml" xmlns:w15="http://schemas.microsoft.com/office/word/2012/wordml" mc:Ignorable="w14 wp14 w15">
-  <w:p>
-    <w:pPr>
-      <w:pStyle w:val="Footer"/>
-      <w:rPr/>
     </w:pPr>
     <w:r>
       <w:rPr>
@@ -2736,20 +2883,6 @@
 <w:hdr xmlns:o="urn:schemas-microsoft-com:office:office" xmlns:r="http://schemas.openxmlformats.org/officeDocument/2006/relationships" xmlns:v="urn:schemas-microsoft-com:vml" xmlns:w="http://schemas.openxmlformats.org/wordprocessingml/2006/main" xmlns:w10="urn:schemas-microsoft-com:office:word" xmlns:wp="http://schemas.openxmlformats.org/drawingml/2006/wordprocessingDrawing" xmlns:pic="http://schemas.openxmlformats.org/drawingml/2006/picture" xmlns:wps="http://schemas.microsoft.com/office/word/2010/wordprocessingShape" xmlns:wpg="http://schemas.microsoft.com/office/word/2010/wordprocessingGroup" xmlns:mc="http://schemas.openxmlformats.org/markup-compatibility/2006" xmlns:wp14="http://schemas.microsoft.com/office/word/2010/wordprocessingDrawing" xmlns:w14="http://schemas.microsoft.com/office/word/2010/wordml" xmlns:w15="http://schemas.microsoft.com/office/word/2012/wordml" mc:Ignorable="w14 wp14 w15">
   <w:p>
     <w:pPr>
-      <w:pStyle w:val="Header"/>
-      <w:rPr/>
-    </w:pPr>
-    <w:r>
-      <w:rPr/>
-    </w:r>
-  </w:p>
-</w:hdr>
-</file>
-
-<file path=word/header2.xml><?xml version="1.0" encoding="utf-8"?>
-<w:hdr xmlns:o="urn:schemas-microsoft-com:office:office" xmlns:r="http://schemas.openxmlformats.org/officeDocument/2006/relationships" xmlns:v="urn:schemas-microsoft-com:vml" xmlns:w="http://schemas.openxmlformats.org/wordprocessingml/2006/main" xmlns:w10="urn:schemas-microsoft-com:office:word" xmlns:wp="http://schemas.openxmlformats.org/drawingml/2006/wordprocessingDrawing" xmlns:pic="http://schemas.openxmlformats.org/drawingml/2006/picture" xmlns:wps="http://schemas.microsoft.com/office/word/2010/wordprocessingShape" xmlns:wpg="http://schemas.microsoft.com/office/word/2010/wordprocessingGroup" xmlns:mc="http://schemas.openxmlformats.org/markup-compatibility/2006" xmlns:wp14="http://schemas.microsoft.com/office/word/2010/wordprocessingDrawing" xmlns:w14="http://schemas.microsoft.com/office/word/2010/wordml" xmlns:w15="http://schemas.microsoft.com/office/word/2012/wordml" mc:Ignorable="w14 wp14 w15">
-  <w:p>
-    <w:pPr>
       <w:pStyle w:val="Normal"/>
       <w:spacing w:lineRule="auto" w:line="240" w:before="120" w:after="0"/>
       <w:jc w:val="center"/>
@@ -2763,7 +2896,7 @@
     </w:pPr>
     <w:r>
       <w:drawing>
-        <wp:anchor behindDoc="1" distT="0" distB="0" distL="114300" distR="114300" simplePos="0" locked="0" layoutInCell="0" allowOverlap="1" relativeHeight="6">
+        <wp:anchor behindDoc="1" distT="0" distB="0" distL="114300" distR="114300" simplePos="0" locked="0" layoutInCell="0" allowOverlap="1" relativeHeight="7">
           <wp:simplePos x="0" y="0"/>
           <wp:positionH relativeFrom="margin">
             <wp:posOffset>6141085</wp:posOffset>
@@ -2774,7 +2907,7 @@
           <wp:extent cx="563880" cy="478790"/>
           <wp:effectExtent l="0" t="0" r="0" b="0"/>
           <wp:wrapSquare wrapText="bothSides"/>
-          <wp:docPr id="1" name="Imagen 2" descr="Resultado de imagen para ingenieria de sistemas computacionales logo ITQ"/>
+          <wp:docPr id="4" name="Imagen 2" descr="Resultado de imagen para ingenieria de sistemas computacionales logo ITQ"/>
           <wp:cNvGraphicFramePr>
             <a:graphicFrameLocks xmlns:a="http://schemas.openxmlformats.org/drawingml/2006/main" noChangeAspect="1"/>
           </wp:cNvGraphicFramePr>
@@ -2782,7 +2915,7 @@
             <a:graphicData uri="http://schemas.openxmlformats.org/drawingml/2006/picture">
               <pic:pic xmlns:pic="http://schemas.openxmlformats.org/drawingml/2006/picture">
                 <pic:nvPicPr>
-                  <pic:cNvPr id="1" name="Imagen 2" descr="Resultado de imagen para ingenieria de sistemas computacionales logo ITQ"/>
+                  <pic:cNvPr id="4" name="Imagen 2" descr="Resultado de imagen para ingenieria de sistemas computacionales logo ITQ"/>
                   <pic:cNvPicPr>
                     <a:picLocks noChangeAspect="1" noChangeArrowheads="1"/>
                   </pic:cNvPicPr>
@@ -2809,7 +2942,7 @@
         </wp:anchor>
       </w:drawing>
       <w:drawing>
-        <wp:anchor behindDoc="1" distT="0" distB="0" distL="114300" distR="114300" simplePos="0" locked="0" layoutInCell="0" allowOverlap="1" relativeHeight="11">
+        <wp:anchor behindDoc="1" distT="0" distB="0" distL="114300" distR="114300" simplePos="0" locked="0" layoutInCell="0" allowOverlap="1" relativeHeight="13">
           <wp:simplePos x="0" y="0"/>
           <wp:positionH relativeFrom="column">
             <wp:posOffset>55245</wp:posOffset>
@@ -2820,7 +2953,7 @@
           <wp:extent cx="934085" cy="342265"/>
           <wp:effectExtent l="0" t="0" r="0" b="0"/>
           <wp:wrapSquare wrapText="bothSides"/>
-          <wp:docPr id="2" name="Imagen 3" descr=""/>
+          <wp:docPr id="5" name="Imagen 3" descr=""/>
           <wp:cNvGraphicFramePr>
             <a:graphicFrameLocks xmlns:a="http://schemas.openxmlformats.org/drawingml/2006/main" noChangeAspect="1"/>
           </wp:cNvGraphicFramePr>
@@ -2828,7 +2961,7 @@
             <a:graphicData uri="http://schemas.openxmlformats.org/drawingml/2006/picture">
               <pic:pic xmlns:pic="http://schemas.openxmlformats.org/drawingml/2006/picture">
                 <pic:nvPicPr>
-                  <pic:cNvPr id="2" name="Imagen 3" descr=""/>
+                  <pic:cNvPr id="5" name="Imagen 3" descr=""/>
                   <pic:cNvPicPr>
                     <a:picLocks noChangeAspect="1" noChangeArrowheads="1"/>
                   </pic:cNvPicPr>
@@ -2904,7 +3037,6 @@
         <w:bottom w:w="0" w:type="dxa"/>
         <w:right w:w="108" w:type="dxa"/>
       </w:tblCellMar>
-      <w:tblLook w:val="01e0" w:noHBand="0" w:noVBand="0" w:firstColumn="1" w:lastRow="1" w:lastColumn="1" w:firstRow="1"/>
     </w:tblPr>
     <w:tblGrid>
       <w:gridCol w:w="10070"/>
@@ -2922,7 +3054,7 @@
             <w:bottom w:val="single" w:sz="4" w:space="0" w:color="000000"/>
             <w:right w:val="single" w:sz="4" w:space="0" w:color="000000"/>
           </w:tcBorders>
-          <w:shd w:color="auto" w:fill="1F4E79" w:themeFill="accent1" w:themeFillShade="80" w:val="clear"/>
+          <w:shd w:fill="1F4E79" w:val="clear"/>
         </w:tcPr>
         <w:p>
           <w:pPr>
@@ -2965,11 +3097,11 @@
             <w:bottom w:val="single" w:sz="4" w:space="0" w:color="000000"/>
             <w:right w:val="single" w:sz="4" w:space="0" w:color="000000"/>
           </w:tcBorders>
-          <w:shd w:color="auto" w:fill="1F4E79" w:themeFill="accent1" w:themeFillShade="80" w:val="clear"/>
+          <w:shd w:fill="1F4E79" w:val="clear"/>
         </w:tcPr>
         <w:tbl>
           <w:tblPr>
-            <w:tblpPr w:vertAnchor="text" w:horzAnchor="text" w:leftFromText="141" w:rightFromText="141" w:tblpX="5" w:tblpY="1"/>
+            <w:tblpPr w:vertAnchor="text" w:horzAnchor="text" w:leftFromText="141" w:rightFromText="141" w:tblpX="15" w:tblpY="1"/>
             <w:tblOverlap w:val="never"/>
             <w:tblW w:w="9844" w:type="dxa"/>
             <w:jc w:val="left"/>
@@ -2981,11 +3113,10 @@
               <w:bottom w:w="0" w:type="dxa"/>
               <w:right w:w="108" w:type="dxa"/>
             </w:tblCellMar>
-            <w:tblLook w:val="01e0" w:noHBand="0" w:noVBand="0" w:firstColumn="1" w:lastRow="1" w:lastColumn="1" w:firstRow="1"/>
           </w:tblPr>
           <w:tblGrid>
             <w:gridCol w:w="2377"/>
-            <w:gridCol w:w="7466"/>
+            <w:gridCol w:w="7467"/>
           </w:tblGrid>
           <w:tr>
             <w:trPr/>
@@ -2998,7 +3129,7 @@
                   <w:bottom w:val="single" w:sz="4" w:space="0" w:color="000000"/>
                   <w:right w:val="single" w:sz="4" w:space="0" w:color="000000"/>
                 </w:tcBorders>
-                <w:shd w:color="auto" w:fill="FFFFFF" w:val="clear"/>
+                <w:shd w:fill="FFFFFF" w:val="clear"/>
               </w:tcPr>
               <w:p>
                 <w:pPr>
@@ -3022,401 +3153,14 @@
             </w:tc>
             <w:tc>
               <w:tcPr>
-                <w:tcW w:w="7466" w:type="dxa"/>
+                <w:tcW w:w="7467" w:type="dxa"/>
                 <w:tcBorders>
                   <w:top w:val="single" w:sz="4" w:space="0" w:color="000000"/>
                   <w:left w:val="single" w:sz="4" w:space="0" w:color="000000"/>
                   <w:bottom w:val="single" w:sz="4" w:space="0" w:color="000000"/>
                   <w:right w:val="single" w:sz="4" w:space="0" w:color="000000"/>
                 </w:tcBorders>
-                <w:shd w:color="auto" w:fill="FFFFFF" w:val="clear"/>
-              </w:tcPr>
-              <w:p>
-                <w:pPr>
-                  <w:pStyle w:val="Normal"/>
-                  <w:spacing w:lineRule="auto" w:line="240" w:before="120" w:after="0"/>
-                  <w:jc w:val="both"/>
-                  <w:rPr>
-                    <w:rFonts w:ascii="Arial" w:hAnsi="Arial" w:cs="Arial"/>
-                    <w:b/>
-                    <w:lang w:val="es-ES"/>
-                  </w:rPr>
-                </w:pPr>
-                <w:r>
-                  <w:rPr>
-                    <w:rFonts w:cs="Arial" w:ascii="Arial" w:hAnsi="Arial"/>
-                    <w:b/>
-                    <w:lang w:val="es-ES"/>
-                  </w:rPr>
-                  <w:t>Rojas Badillo Emilio</w:t>
-                </w:r>
-              </w:p>
-            </w:tc>
-          </w:tr>
-        </w:tbl>
-        <w:p>
-          <w:pPr>
-            <w:pStyle w:val="Normal"/>
-            <w:spacing w:lineRule="auto" w:line="240" w:before="120" w:after="0"/>
-            <w:jc w:val="both"/>
-            <w:rPr>
-              <w:rFonts w:ascii="Arial" w:hAnsi="Arial" w:cs="Arial"/>
-              <w:b/>
-              <w:color w:val="FFFFFF"/>
-              <w:sz w:val="20"/>
-              <w:szCs w:val="20"/>
-              <w:lang w:val="es-ES"/>
-            </w:rPr>
-          </w:pPr>
-          <w:r>
-            <w:rPr>
-              <w:rFonts w:cs="Arial" w:ascii="Arial" w:hAnsi="Arial"/>
-              <w:b/>
-              <w:color w:val="FFFFFF"/>
-              <w:sz w:val="20"/>
-              <w:szCs w:val="20"/>
-              <w:lang w:val="es-ES"/>
-            </w:rPr>
-          </w:r>
-        </w:p>
-      </w:tc>
-    </w:tr>
-  </w:tbl>
-  <w:p>
-    <w:pPr>
-      <w:pStyle w:val="Normal"/>
-      <w:spacing w:lineRule="auto" w:line="240" w:before="120" w:after="0"/>
-      <w:rPr>
-        <w:rFonts w:ascii="Arial" w:hAnsi="Arial" w:eastAsia="Times New Roman" w:cs="Arial"/>
-        <w:b/>
-        <w:bCs/>
-        <w:sz w:val="2"/>
-        <w:szCs w:val="2"/>
-        <w:lang w:val="es-ES" w:eastAsia="es-MX"/>
-      </w:rPr>
-    </w:pPr>
-    <w:r>
-      <w:rPr>
-        <w:rFonts w:eastAsia="Times New Roman" w:cs="Arial" w:ascii="Arial" w:hAnsi="Arial"/>
-        <w:b/>
-        <w:bCs/>
-        <w:sz w:val="2"/>
-        <w:szCs w:val="2"/>
-        <w:lang w:val="es-ES" w:eastAsia="es-MX"/>
-      </w:rPr>
-    </w:r>
-  </w:p>
-  <w:p>
-    <w:pPr>
-      <w:pStyle w:val="Normal"/>
-      <w:spacing w:lineRule="auto" w:line="240" w:before="120" w:after="0"/>
-      <w:rPr>
-        <w:rFonts w:ascii="Arial" w:hAnsi="Arial" w:eastAsia="Times New Roman" w:cs="Arial"/>
-        <w:b/>
-        <w:bCs/>
-        <w:sz w:val="2"/>
-        <w:szCs w:val="2"/>
-        <w:lang w:val="es-ES" w:eastAsia="es-MX"/>
-      </w:rPr>
-    </w:pPr>
-    <w:r>
-      <w:rPr>
-        <w:rFonts w:eastAsia="Times New Roman" w:cs="Arial" w:ascii="Arial" w:hAnsi="Arial"/>
-        <w:b/>
-        <w:bCs/>
-        <w:sz w:val="2"/>
-        <w:szCs w:val="2"/>
-        <w:lang w:val="es-ES" w:eastAsia="es-MX"/>
-      </w:rPr>
-    </w:r>
-  </w:p>
-</w:hdr>
-</file>
-
-<file path=word/header3.xml><?xml version="1.0" encoding="utf-8"?>
-<w:hdr xmlns:o="urn:schemas-microsoft-com:office:office" xmlns:r="http://schemas.openxmlformats.org/officeDocument/2006/relationships" xmlns:v="urn:schemas-microsoft-com:vml" xmlns:w="http://schemas.openxmlformats.org/wordprocessingml/2006/main" xmlns:w10="urn:schemas-microsoft-com:office:word" xmlns:wp="http://schemas.openxmlformats.org/drawingml/2006/wordprocessingDrawing" xmlns:pic="http://schemas.openxmlformats.org/drawingml/2006/picture" xmlns:wps="http://schemas.microsoft.com/office/word/2010/wordprocessingShape" xmlns:wpg="http://schemas.microsoft.com/office/word/2010/wordprocessingGroup" xmlns:mc="http://schemas.openxmlformats.org/markup-compatibility/2006" xmlns:wp14="http://schemas.microsoft.com/office/word/2010/wordprocessingDrawing" xmlns:w14="http://schemas.microsoft.com/office/word/2010/wordml" xmlns:w15="http://schemas.microsoft.com/office/word/2012/wordml" mc:Ignorable="w14 wp14 w15">
-  <w:p>
-    <w:pPr>
-      <w:pStyle w:val="Normal"/>
-      <w:spacing w:lineRule="auto" w:line="240" w:before="120" w:after="0"/>
-      <w:jc w:val="center"/>
-      <w:rPr>
-        <w:rFonts w:ascii="Arial" w:hAnsi="Arial" w:eastAsia="Times New Roman" w:cs="Arial"/>
-        <w:b/>
-        <w:bCs/>
-        <w:sz w:val="28"/>
-        <w:lang w:val="es-ES" w:eastAsia="es-MX"/>
-      </w:rPr>
-    </w:pPr>
-    <w:r>
-      <w:drawing>
-        <wp:anchor behindDoc="1" distT="0" distB="0" distL="114300" distR="114300" simplePos="0" locked="0" layoutInCell="0" allowOverlap="1" relativeHeight="6">
-          <wp:simplePos x="0" y="0"/>
-          <wp:positionH relativeFrom="margin">
-            <wp:posOffset>6141085</wp:posOffset>
-          </wp:positionH>
-          <wp:positionV relativeFrom="paragraph">
-            <wp:posOffset>-20320</wp:posOffset>
-          </wp:positionV>
-          <wp:extent cx="563880" cy="478790"/>
-          <wp:effectExtent l="0" t="0" r="0" b="0"/>
-          <wp:wrapSquare wrapText="bothSides"/>
-          <wp:docPr id="3" name="Imagen 2" descr="Resultado de imagen para ingenieria de sistemas computacionales logo ITQ"/>
-          <wp:cNvGraphicFramePr>
-            <a:graphicFrameLocks xmlns:a="http://schemas.openxmlformats.org/drawingml/2006/main" noChangeAspect="1"/>
-          </wp:cNvGraphicFramePr>
-          <a:graphic xmlns:a="http://schemas.openxmlformats.org/drawingml/2006/main">
-            <a:graphicData uri="http://schemas.openxmlformats.org/drawingml/2006/picture">
-              <pic:pic xmlns:pic="http://schemas.openxmlformats.org/drawingml/2006/picture">
-                <pic:nvPicPr>
-                  <pic:cNvPr id="3" name="Imagen 2" descr="Resultado de imagen para ingenieria de sistemas computacionales logo ITQ"/>
-                  <pic:cNvPicPr>
-                    <a:picLocks noChangeAspect="1" noChangeArrowheads="1"/>
-                  </pic:cNvPicPr>
-                </pic:nvPicPr>
-                <pic:blipFill>
-                  <a:blip r:embed="rId1"/>
-                  <a:stretch>
-                    <a:fillRect/>
-                  </a:stretch>
-                </pic:blipFill>
-                <pic:spPr bwMode="auto">
-                  <a:xfrm>
-                    <a:off x="0" y="0"/>
-                    <a:ext cx="563880" cy="478790"/>
-                  </a:xfrm>
-                  <a:prstGeom prst="rect">
-                    <a:avLst/>
-                  </a:prstGeom>
-                  <a:noFill/>
-                </pic:spPr>
-              </pic:pic>
-            </a:graphicData>
-          </a:graphic>
-        </wp:anchor>
-      </w:drawing>
-      <w:drawing>
-        <wp:anchor behindDoc="1" distT="0" distB="0" distL="114300" distR="114300" simplePos="0" locked="0" layoutInCell="0" allowOverlap="1" relativeHeight="11">
-          <wp:simplePos x="0" y="0"/>
-          <wp:positionH relativeFrom="column">
-            <wp:posOffset>55245</wp:posOffset>
-          </wp:positionH>
-          <wp:positionV relativeFrom="paragraph">
-            <wp:posOffset>42545</wp:posOffset>
-          </wp:positionV>
-          <wp:extent cx="934085" cy="342265"/>
-          <wp:effectExtent l="0" t="0" r="0" b="0"/>
-          <wp:wrapSquare wrapText="bothSides"/>
-          <wp:docPr id="4" name="Imagen 3" descr=""/>
-          <wp:cNvGraphicFramePr>
-            <a:graphicFrameLocks xmlns:a="http://schemas.openxmlformats.org/drawingml/2006/main" noChangeAspect="1"/>
-          </wp:cNvGraphicFramePr>
-          <a:graphic xmlns:a="http://schemas.openxmlformats.org/drawingml/2006/main">
-            <a:graphicData uri="http://schemas.openxmlformats.org/drawingml/2006/picture">
-              <pic:pic xmlns:pic="http://schemas.openxmlformats.org/drawingml/2006/picture">
-                <pic:nvPicPr>
-                  <pic:cNvPr id="4" name="Imagen 3" descr=""/>
-                  <pic:cNvPicPr>
-                    <a:picLocks noChangeAspect="1" noChangeArrowheads="1"/>
-                  </pic:cNvPicPr>
-                </pic:nvPicPr>
-                <pic:blipFill>
-                  <a:blip r:embed="rId2"/>
-                  <a:stretch>
-                    <a:fillRect/>
-                  </a:stretch>
-                </pic:blipFill>
-                <pic:spPr bwMode="auto">
-                  <a:xfrm>
-                    <a:off x="0" y="0"/>
-                    <a:ext cx="934085" cy="342265"/>
-                  </a:xfrm>
-                  <a:prstGeom prst="rect">
-                    <a:avLst/>
-                  </a:prstGeom>
-                  <a:noFill/>
-                </pic:spPr>
-              </pic:pic>
-            </a:graphicData>
-          </a:graphic>
-        </wp:anchor>
-      </w:drawing>
-    </w:r>
-    <w:r>
-      <w:rPr>
-        <w:rFonts w:eastAsia="Times New Roman" w:cs="Arial" w:ascii="Arial" w:hAnsi="Arial"/>
-        <w:b/>
-        <w:bCs/>
-        <w:sz w:val="28"/>
-        <w:lang w:val="es-ES" w:eastAsia="es-MX"/>
-      </w:rPr>
-      <w:t>Tecnológico Nacional de México</w:t>
-    </w:r>
-  </w:p>
-  <w:p>
-    <w:pPr>
-      <w:pStyle w:val="Normal"/>
-      <w:spacing w:lineRule="auto" w:line="240" w:before="120" w:after="0"/>
-      <w:jc w:val="center"/>
-      <w:rPr>
-        <w:rFonts w:ascii="Arial" w:hAnsi="Arial" w:eastAsia="Times New Roman" w:cs="Arial"/>
-        <w:b/>
-        <w:bCs/>
-        <w:sz w:val="24"/>
-        <w:lang w:val="es-ES" w:eastAsia="es-MX"/>
-      </w:rPr>
-    </w:pPr>
-    <w:r>
-      <w:rPr>
-        <w:rFonts w:eastAsia="Times New Roman" w:cs="Arial" w:ascii="Arial" w:hAnsi="Arial"/>
-        <w:b/>
-        <w:bCs/>
-        <w:sz w:val="24"/>
-        <w:lang w:val="es-ES" w:eastAsia="es-MX"/>
-      </w:rPr>
-      <w:t>Instituto Tecnológico de Querétaro</w:t>
-    </w:r>
-  </w:p>
-  <w:tbl>
-    <w:tblPr>
-      <w:tblpPr w:vertAnchor="text" w:horzAnchor="text" w:leftFromText="141" w:rightFromText="141" w:tblpX="0" w:tblpY="1"/>
-      <w:tblOverlap w:val="never"/>
-      <w:tblW w:w="10070" w:type="dxa"/>
-      <w:jc w:val="left"/>
-      <w:tblInd w:w="-5" w:type="dxa"/>
-      <w:tblLayout w:type="fixed"/>
-      <w:tblCellMar>
-        <w:top w:w="0" w:type="dxa"/>
-        <w:left w:w="108" w:type="dxa"/>
-        <w:bottom w:w="0" w:type="dxa"/>
-        <w:right w:w="108" w:type="dxa"/>
-      </w:tblCellMar>
-      <w:tblLook w:val="01e0" w:noHBand="0" w:noVBand="0" w:firstColumn="1" w:lastRow="1" w:lastColumn="1" w:firstRow="1"/>
-    </w:tblPr>
-    <w:tblGrid>
-      <w:gridCol w:w="10070"/>
-    </w:tblGrid>
-    <w:tr>
-      <w:trPr>
-        <w:trHeight w:val="447" w:hRule="atLeast"/>
-      </w:trPr>
-      <w:tc>
-        <w:tcPr>
-          <w:tcW w:w="10070" w:type="dxa"/>
-          <w:tcBorders>
-            <w:top w:val="single" w:sz="4" w:space="0" w:color="000000"/>
-            <w:left w:val="single" w:sz="4" w:space="0" w:color="000000"/>
-            <w:bottom w:val="single" w:sz="4" w:space="0" w:color="000000"/>
-            <w:right w:val="single" w:sz="4" w:space="0" w:color="000000"/>
-          </w:tcBorders>
-          <w:shd w:color="auto" w:fill="1F4E79" w:themeFill="accent1" w:themeFillShade="80" w:val="clear"/>
-        </w:tcPr>
-        <w:p>
-          <w:pPr>
-            <w:pStyle w:val="Normal"/>
-            <w:spacing w:lineRule="auto" w:line="240" w:before="120" w:after="0"/>
-            <w:jc w:val="both"/>
-            <w:rPr>
-              <w:rFonts w:ascii="Arial" w:hAnsi="Arial" w:cs="Arial"/>
-              <w:b/>
-              <w:color w:val="FFFFFF"/>
-              <w:sz w:val="20"/>
-              <w:szCs w:val="20"/>
-              <w:lang w:val="es-ES"/>
-            </w:rPr>
-          </w:pPr>
-          <w:r>
-            <w:rPr>
-              <w:rFonts w:cs="Arial" w:ascii="Arial" w:hAnsi="Arial"/>
-              <w:b/>
-              <w:color w:val="FFFFFF"/>
-              <w:sz w:val="20"/>
-              <w:szCs w:val="20"/>
-              <w:lang w:val="es-ES"/>
-            </w:rPr>
-            <w:t>Nombre de la actividad: Teoría de Conjuntos y relaciones</w:t>
-          </w:r>
-        </w:p>
-      </w:tc>
-    </w:tr>
-    <w:tr>
-      <w:trPr>
-        <w:trHeight w:val="447" w:hRule="atLeast"/>
-      </w:trPr>
-      <w:tc>
-        <w:tcPr>
-          <w:tcW w:w="10070" w:type="dxa"/>
-          <w:tcBorders>
-            <w:top w:val="single" w:sz="4" w:space="0" w:color="000000"/>
-            <w:left w:val="single" w:sz="4" w:space="0" w:color="000000"/>
-            <w:bottom w:val="single" w:sz="4" w:space="0" w:color="000000"/>
-            <w:right w:val="single" w:sz="4" w:space="0" w:color="000000"/>
-          </w:tcBorders>
-          <w:shd w:color="auto" w:fill="1F4E79" w:themeFill="accent1" w:themeFillShade="80" w:val="clear"/>
-        </w:tcPr>
-        <w:tbl>
-          <w:tblPr>
-            <w:tblpPr w:vertAnchor="text" w:horzAnchor="text" w:leftFromText="141" w:rightFromText="141" w:tblpX="5" w:tblpY="1"/>
-            <w:tblOverlap w:val="never"/>
-            <w:tblW w:w="9844" w:type="dxa"/>
-            <w:jc w:val="left"/>
-            <w:tblInd w:w="-5" w:type="dxa"/>
-            <w:tblLayout w:type="fixed"/>
-            <w:tblCellMar>
-              <w:top w:w="0" w:type="dxa"/>
-              <w:left w:w="108" w:type="dxa"/>
-              <w:bottom w:w="0" w:type="dxa"/>
-              <w:right w:w="108" w:type="dxa"/>
-            </w:tblCellMar>
-            <w:tblLook w:val="01e0" w:noHBand="0" w:noVBand="0" w:firstColumn="1" w:lastRow="1" w:lastColumn="1" w:firstRow="1"/>
-          </w:tblPr>
-          <w:tblGrid>
-            <w:gridCol w:w="2377"/>
-            <w:gridCol w:w="7466"/>
-          </w:tblGrid>
-          <w:tr>
-            <w:trPr/>
-            <w:tc>
-              <w:tcPr>
-                <w:tcW w:w="2377" w:type="dxa"/>
-                <w:tcBorders>
-                  <w:top w:val="single" w:sz="4" w:space="0" w:color="000000"/>
-                  <w:left w:val="single" w:sz="4" w:space="0" w:color="000000"/>
-                  <w:bottom w:val="single" w:sz="4" w:space="0" w:color="000000"/>
-                  <w:right w:val="single" w:sz="4" w:space="0" w:color="000000"/>
-                </w:tcBorders>
-                <w:shd w:color="auto" w:fill="FFFFFF" w:val="clear"/>
-              </w:tcPr>
-              <w:p>
-                <w:pPr>
-                  <w:pStyle w:val="Normal"/>
-                  <w:spacing w:lineRule="auto" w:line="240" w:before="120" w:after="0"/>
-                  <w:rPr>
-                    <w:rFonts w:ascii="Arial" w:hAnsi="Arial" w:cs="Arial"/>
-                    <w:b/>
-                    <w:lang w:val="es-ES"/>
-                  </w:rPr>
-                </w:pPr>
-                <w:r>
-                  <w:rPr>
-                    <w:rFonts w:cs="Arial" w:ascii="Arial" w:hAnsi="Arial"/>
-                    <w:b/>
-                    <w:lang w:val="es-ES"/>
-                  </w:rPr>
-                  <w:t>Nombre del alumno:</w:t>
-                </w:r>
-              </w:p>
-            </w:tc>
-            <w:tc>
-              <w:tcPr>
-                <w:tcW w:w="7466" w:type="dxa"/>
-                <w:tcBorders>
-                  <w:top w:val="single" w:sz="4" w:space="0" w:color="000000"/>
-                  <w:left w:val="single" w:sz="4" w:space="0" w:color="000000"/>
-                  <w:bottom w:val="single" w:sz="4" w:space="0" w:color="000000"/>
-                  <w:right w:val="single" w:sz="4" w:space="0" w:color="000000"/>
-                </w:tcBorders>
-                <w:shd w:color="auto" w:fill="FFFFFF" w:val="clear"/>
+                <w:shd w:fill="FFFFFF" w:val="clear"/>
               </w:tcPr>
               <w:p>
                 <w:pPr>
@@ -3525,6 +3269,125 @@
   <w:abstractNum w:abstractNumId="1">
     <w:lvl w:ilvl="0">
       <w:start w:val="1"/>
+      <w:numFmt w:val="none"/>
+      <w:suff w:val="nothing"/>
+      <w:lvlText w:val="%1"/>
+      <w:lvlJc w:val="left"/>
+      <w:pPr>
+        <w:tabs>
+          <w:tab w:val="num" w:pos="0"/>
+        </w:tabs>
+        <w:ind w:left="0" w:hanging="0"/>
+      </w:pPr>
+    </w:lvl>
+    <w:lvl w:ilvl="1">
+      <w:start w:val="1"/>
+      <w:numFmt w:val="none"/>
+      <w:suff w:val="nothing"/>
+      <w:lvlText w:val="%2"/>
+      <w:lvlJc w:val="left"/>
+      <w:pPr>
+        <w:tabs>
+          <w:tab w:val="num" w:pos="0"/>
+        </w:tabs>
+        <w:ind w:left="0" w:hanging="0"/>
+      </w:pPr>
+    </w:lvl>
+    <w:lvl w:ilvl="2">
+      <w:start w:val="1"/>
+      <w:numFmt w:val="none"/>
+      <w:suff w:val="nothing"/>
+      <w:lvlText w:val="%3"/>
+      <w:lvlJc w:val="left"/>
+      <w:pPr>
+        <w:tabs>
+          <w:tab w:val="num" w:pos="0"/>
+        </w:tabs>
+        <w:ind w:left="0" w:hanging="0"/>
+      </w:pPr>
+    </w:lvl>
+    <w:lvl w:ilvl="3">
+      <w:start w:val="1"/>
+      <w:numFmt w:val="none"/>
+      <w:suff w:val="nothing"/>
+      <w:lvlText w:val="%4"/>
+      <w:lvlJc w:val="left"/>
+      <w:pPr>
+        <w:tabs>
+          <w:tab w:val="num" w:pos="0"/>
+        </w:tabs>
+        <w:ind w:left="0" w:hanging="0"/>
+      </w:pPr>
+    </w:lvl>
+    <w:lvl w:ilvl="4">
+      <w:start w:val="1"/>
+      <w:numFmt w:val="none"/>
+      <w:suff w:val="nothing"/>
+      <w:lvlText w:val="%5"/>
+      <w:lvlJc w:val="left"/>
+      <w:pPr>
+        <w:tabs>
+          <w:tab w:val="num" w:pos="0"/>
+        </w:tabs>
+        <w:ind w:left="0" w:hanging="0"/>
+      </w:pPr>
+    </w:lvl>
+    <w:lvl w:ilvl="5">
+      <w:start w:val="1"/>
+      <w:numFmt w:val="none"/>
+      <w:suff w:val="nothing"/>
+      <w:lvlText w:val="%6"/>
+      <w:lvlJc w:val="left"/>
+      <w:pPr>
+        <w:tabs>
+          <w:tab w:val="num" w:pos="0"/>
+        </w:tabs>
+        <w:ind w:left="0" w:hanging="0"/>
+      </w:pPr>
+    </w:lvl>
+    <w:lvl w:ilvl="6">
+      <w:start w:val="1"/>
+      <w:numFmt w:val="none"/>
+      <w:suff w:val="nothing"/>
+      <w:lvlText w:val="%7"/>
+      <w:lvlJc w:val="left"/>
+      <w:pPr>
+        <w:tabs>
+          <w:tab w:val="num" w:pos="0"/>
+        </w:tabs>
+        <w:ind w:left="0" w:hanging="0"/>
+      </w:pPr>
+    </w:lvl>
+    <w:lvl w:ilvl="7">
+      <w:start w:val="1"/>
+      <w:numFmt w:val="none"/>
+      <w:suff w:val="nothing"/>
+      <w:lvlText w:val="%8"/>
+      <w:lvlJc w:val="left"/>
+      <w:pPr>
+        <w:tabs>
+          <w:tab w:val="num" w:pos="0"/>
+        </w:tabs>
+        <w:ind w:left="0" w:hanging="0"/>
+      </w:pPr>
+    </w:lvl>
+    <w:lvl w:ilvl="8">
+      <w:start w:val="1"/>
+      <w:numFmt w:val="none"/>
+      <w:suff w:val="nothing"/>
+      <w:lvlText w:val="%9"/>
+      <w:lvlJc w:val="left"/>
+      <w:pPr>
+        <w:tabs>
+          <w:tab w:val="num" w:pos="0"/>
+        </w:tabs>
+        <w:ind w:left="0" w:hanging="0"/>
+      </w:pPr>
+    </w:lvl>
+  </w:abstractNum>
+  <w:abstractNum w:abstractNumId="2">
+    <w:lvl w:ilvl="0">
+      <w:start w:val="1"/>
       <w:numFmt w:val="bullet"/>
       <w:lvlText w:val=""/>
       <w:lvlJc w:val="left"/>
@@ -3659,7 +3522,7 @@
       </w:rPr>
     </w:lvl>
   </w:abstractNum>
-  <w:abstractNum w:abstractNumId="2">
+  <w:abstractNum w:abstractNumId="3">
     <w:lvl w:ilvl="0">
       <w:start w:val="1"/>
       <w:numFmt w:val="bullet"/>
@@ -3805,129 +3668,10 @@
       </w:rPr>
     </w:lvl>
   </w:abstractNum>
-  <w:abstractNum w:abstractNumId="3">
-    <w:lvl w:ilvl="0">
-      <w:start w:val="1"/>
-      <w:numFmt w:val="decimal"/>
-      <w:lvlText w:val="%1."/>
-      <w:lvlJc w:val="left"/>
-      <w:pPr>
-        <w:tabs>
-          <w:tab w:val="num" w:pos="720"/>
-        </w:tabs>
-        <w:ind w:left="720" w:hanging="360"/>
-      </w:pPr>
-      <w:rPr/>
-    </w:lvl>
-    <w:lvl w:ilvl="1">
-      <w:start w:val="1"/>
-      <w:numFmt w:val="decimal"/>
-      <w:lvlText w:val="%2."/>
-      <w:lvlJc w:val="left"/>
-      <w:pPr>
-        <w:tabs>
-          <w:tab w:val="num" w:pos="1440"/>
-        </w:tabs>
-        <w:ind w:left="1440" w:hanging="360"/>
-      </w:pPr>
-      <w:rPr/>
-    </w:lvl>
-    <w:lvl w:ilvl="2">
-      <w:start w:val="1"/>
-      <w:numFmt w:val="decimal"/>
-      <w:lvlText w:val="%3."/>
-      <w:lvlJc w:val="left"/>
-      <w:pPr>
-        <w:tabs>
-          <w:tab w:val="num" w:pos="2160"/>
-        </w:tabs>
-        <w:ind w:left="2160" w:hanging="360"/>
-      </w:pPr>
-      <w:rPr/>
-    </w:lvl>
-    <w:lvl w:ilvl="3">
-      <w:start w:val="1"/>
-      <w:numFmt w:val="decimal"/>
-      <w:lvlText w:val="%4."/>
-      <w:lvlJc w:val="left"/>
-      <w:pPr>
-        <w:tabs>
-          <w:tab w:val="num" w:pos="2880"/>
-        </w:tabs>
-        <w:ind w:left="2880" w:hanging="360"/>
-      </w:pPr>
-      <w:rPr/>
-    </w:lvl>
-    <w:lvl w:ilvl="4">
-      <w:start w:val="1"/>
-      <w:numFmt w:val="decimal"/>
-      <w:lvlText w:val="%5."/>
-      <w:lvlJc w:val="left"/>
-      <w:pPr>
-        <w:tabs>
-          <w:tab w:val="num" w:pos="3600"/>
-        </w:tabs>
-        <w:ind w:left="3600" w:hanging="360"/>
-      </w:pPr>
-      <w:rPr/>
-    </w:lvl>
-    <w:lvl w:ilvl="5">
-      <w:start w:val="1"/>
-      <w:numFmt w:val="decimal"/>
-      <w:lvlText w:val="%6."/>
-      <w:lvlJc w:val="left"/>
-      <w:pPr>
-        <w:tabs>
-          <w:tab w:val="num" w:pos="4320"/>
-        </w:tabs>
-        <w:ind w:left="4320" w:hanging="360"/>
-      </w:pPr>
-      <w:rPr/>
-    </w:lvl>
-    <w:lvl w:ilvl="6">
-      <w:start w:val="1"/>
-      <w:numFmt w:val="decimal"/>
-      <w:lvlText w:val="%7."/>
-      <w:lvlJc w:val="left"/>
-      <w:pPr>
-        <w:tabs>
-          <w:tab w:val="num" w:pos="5040"/>
-        </w:tabs>
-        <w:ind w:left="5040" w:hanging="360"/>
-      </w:pPr>
-      <w:rPr/>
-    </w:lvl>
-    <w:lvl w:ilvl="7">
-      <w:start w:val="1"/>
-      <w:numFmt w:val="decimal"/>
-      <w:lvlText w:val="%8."/>
-      <w:lvlJc w:val="left"/>
-      <w:pPr>
-        <w:tabs>
-          <w:tab w:val="num" w:pos="5760"/>
-        </w:tabs>
-        <w:ind w:left="5760" w:hanging="360"/>
-      </w:pPr>
-      <w:rPr/>
-    </w:lvl>
-    <w:lvl w:ilvl="8">
-      <w:start w:val="1"/>
-      <w:numFmt w:val="decimal"/>
-      <w:lvlText w:val="%9."/>
-      <w:lvlJc w:val="left"/>
-      <w:pPr>
-        <w:tabs>
-          <w:tab w:val="num" w:pos="6480"/>
-        </w:tabs>
-        <w:ind w:left="6480" w:hanging="360"/>
-      </w:pPr>
-      <w:rPr/>
-    </w:lvl>
-  </w:abstractNum>
   <w:abstractNum w:abstractNumId="4">
     <w:lvl w:ilvl="0">
       <w:start w:val="1"/>
-      <w:numFmt w:val="lowerLetter"/>
+      <w:numFmt w:val="decimal"/>
       <w:lvlText w:val="%1."/>
       <w:lvlJc w:val="left"/>
       <w:pPr>
@@ -4164,8 +3908,8 @@
   </w:abstractNum>
   <w:abstractNum w:abstractNumId="6">
     <w:lvl w:ilvl="0">
-      <w:start w:val="1"/>
-      <w:numFmt w:val="lowerLetter"/>
+      <w:start w:val="2"/>
+      <w:numFmt w:val="decimal"/>
       <w:lvlText w:val="%1."/>
       <w:lvlJc w:val="left"/>
       <w:pPr>
@@ -4402,7 +4146,7 @@
   </w:abstractNum>
   <w:abstractNum w:abstractNumId="8">
     <w:lvl w:ilvl="0">
-      <w:start w:val="2"/>
+      <w:start w:val="3"/>
       <w:numFmt w:val="decimal"/>
       <w:lvlText w:val="%1."/>
       <w:lvlJc w:val="left"/>
@@ -4522,9 +4266,9 @@
   <w:abstractNum w:abstractNumId="9">
     <w:lvl w:ilvl="0">
       <w:start w:val="1"/>
-      <w:numFmt w:val="lowerLetter"/>
+      <w:numFmt w:val="upperRoman"/>
       <w:lvlText w:val="%1."/>
-      <w:lvlJc w:val="left"/>
+      <w:lvlJc w:val="right"/>
       <w:pPr>
         <w:tabs>
           <w:tab w:val="num" w:pos="720"/>
@@ -4641,40 +4385,40 @@
   <w:abstractNum w:abstractNumId="10">
     <w:lvl w:ilvl="0">
       <w:start w:val="1"/>
+      <w:numFmt w:val="upperRoman"/>
+      <w:lvlText w:val="%1."/>
+      <w:lvlJc w:val="right"/>
+      <w:pPr>
+        <w:tabs>
+          <w:tab w:val="num" w:pos="720"/>
+        </w:tabs>
+        <w:ind w:left="360" w:hanging="360"/>
+      </w:pPr>
+      <w:rPr/>
+    </w:lvl>
+    <w:lvl w:ilvl="1">
+      <w:start w:val="1"/>
       <w:numFmt w:val="lowerLetter"/>
-      <w:lvlText w:val="%1."/>
-      <w:lvlJc w:val="left"/>
-      <w:pPr>
-        <w:tabs>
-          <w:tab w:val="num" w:pos="720"/>
-        </w:tabs>
-        <w:ind w:left="720" w:hanging="360"/>
-      </w:pPr>
-      <w:rPr/>
-    </w:lvl>
-    <w:lvl w:ilvl="1">
-      <w:start w:val="1"/>
-      <w:numFmt w:val="decimal"/>
       <w:lvlText w:val="%2."/>
       <w:lvlJc w:val="left"/>
       <w:pPr>
         <w:tabs>
           <w:tab w:val="num" w:pos="1440"/>
         </w:tabs>
-        <w:ind w:left="1440" w:hanging="360"/>
+        <w:ind w:left="1080" w:hanging="360"/>
       </w:pPr>
       <w:rPr/>
     </w:lvl>
     <w:lvl w:ilvl="2">
       <w:start w:val="1"/>
-      <w:numFmt w:val="decimal"/>
+      <w:numFmt w:val="lowerRoman"/>
       <w:lvlText w:val="%3."/>
-      <w:lvlJc w:val="left"/>
+      <w:lvlJc w:val="right"/>
       <w:pPr>
         <w:tabs>
           <w:tab w:val="num" w:pos="2160"/>
         </w:tabs>
-        <w:ind w:left="2160" w:hanging="360"/>
+        <w:ind w:left="1800" w:hanging="180"/>
       </w:pPr>
       <w:rPr/>
     </w:lvl>
@@ -4687,33 +4431,33 @@
         <w:tabs>
           <w:tab w:val="num" w:pos="2880"/>
         </w:tabs>
-        <w:ind w:left="2880" w:hanging="360"/>
+        <w:ind w:left="2520" w:hanging="360"/>
       </w:pPr>
       <w:rPr/>
     </w:lvl>
     <w:lvl w:ilvl="4">
       <w:start w:val="1"/>
-      <w:numFmt w:val="decimal"/>
+      <w:numFmt w:val="lowerLetter"/>
       <w:lvlText w:val="%5."/>
       <w:lvlJc w:val="left"/>
       <w:pPr>
         <w:tabs>
           <w:tab w:val="num" w:pos="3600"/>
         </w:tabs>
-        <w:ind w:left="3600" w:hanging="360"/>
+        <w:ind w:left="3240" w:hanging="360"/>
       </w:pPr>
       <w:rPr/>
     </w:lvl>
     <w:lvl w:ilvl="5">
       <w:start w:val="1"/>
-      <w:numFmt w:val="decimal"/>
+      <w:numFmt w:val="lowerRoman"/>
       <w:lvlText w:val="%6."/>
-      <w:lvlJc w:val="left"/>
+      <w:lvlJc w:val="right"/>
       <w:pPr>
         <w:tabs>
           <w:tab w:val="num" w:pos="4320"/>
         </w:tabs>
-        <w:ind w:left="4320" w:hanging="360"/>
+        <w:ind w:left="3960" w:hanging="180"/>
       </w:pPr>
       <w:rPr/>
     </w:lvl>
@@ -4726,33 +4470,33 @@
         <w:tabs>
           <w:tab w:val="num" w:pos="5040"/>
         </w:tabs>
-        <w:ind w:left="5040" w:hanging="360"/>
+        <w:ind w:left="4680" w:hanging="360"/>
       </w:pPr>
       <w:rPr/>
     </w:lvl>
     <w:lvl w:ilvl="7">
       <w:start w:val="1"/>
-      <w:numFmt w:val="decimal"/>
+      <w:numFmt w:val="lowerLetter"/>
       <w:lvlText w:val="%8."/>
       <w:lvlJc w:val="left"/>
       <w:pPr>
         <w:tabs>
           <w:tab w:val="num" w:pos="5760"/>
         </w:tabs>
-        <w:ind w:left="5760" w:hanging="360"/>
+        <w:ind w:left="5400" w:hanging="360"/>
       </w:pPr>
       <w:rPr/>
     </w:lvl>
     <w:lvl w:ilvl="8">
       <w:start w:val="1"/>
-      <w:numFmt w:val="decimal"/>
+      <w:numFmt w:val="lowerRoman"/>
       <w:lvlText w:val="%9."/>
-      <w:lvlJc w:val="left"/>
+      <w:lvlJc w:val="right"/>
       <w:pPr>
         <w:tabs>
           <w:tab w:val="num" w:pos="6480"/>
         </w:tabs>
-        <w:ind w:left="6480" w:hanging="360"/>
+        <w:ind w:left="6120" w:hanging="180"/>
       </w:pPr>
       <w:rPr/>
     </w:lvl>
@@ -4760,40 +4504,40 @@
   <w:abstractNum w:abstractNumId="11">
     <w:lvl w:ilvl="0">
       <w:start w:val="1"/>
+      <w:numFmt w:val="upperRoman"/>
+      <w:lvlText w:val="%1."/>
+      <w:lvlJc w:val="right"/>
+      <w:pPr>
+        <w:tabs>
+          <w:tab w:val="num" w:pos="720"/>
+        </w:tabs>
+        <w:ind w:left="360" w:hanging="360"/>
+      </w:pPr>
+      <w:rPr/>
+    </w:lvl>
+    <w:lvl w:ilvl="1">
+      <w:start w:val="1"/>
       <w:numFmt w:val="lowerLetter"/>
-      <w:lvlText w:val="%1."/>
-      <w:lvlJc w:val="left"/>
-      <w:pPr>
-        <w:tabs>
-          <w:tab w:val="num" w:pos="720"/>
-        </w:tabs>
-        <w:ind w:left="720" w:hanging="360"/>
-      </w:pPr>
-      <w:rPr/>
-    </w:lvl>
-    <w:lvl w:ilvl="1">
-      <w:start w:val="1"/>
-      <w:numFmt w:val="decimal"/>
       <w:lvlText w:val="%2."/>
       <w:lvlJc w:val="left"/>
       <w:pPr>
         <w:tabs>
           <w:tab w:val="num" w:pos="1440"/>
         </w:tabs>
-        <w:ind w:left="1440" w:hanging="360"/>
+        <w:ind w:left="1080" w:hanging="360"/>
       </w:pPr>
       <w:rPr/>
     </w:lvl>
     <w:lvl w:ilvl="2">
       <w:start w:val="1"/>
-      <w:numFmt w:val="decimal"/>
+      <w:numFmt w:val="lowerRoman"/>
       <w:lvlText w:val="%3."/>
-      <w:lvlJc w:val="left"/>
+      <w:lvlJc w:val="right"/>
       <w:pPr>
         <w:tabs>
           <w:tab w:val="num" w:pos="2160"/>
         </w:tabs>
-        <w:ind w:left="2160" w:hanging="360"/>
+        <w:ind w:left="1800" w:hanging="180"/>
       </w:pPr>
       <w:rPr/>
     </w:lvl>
@@ -4806,33 +4550,33 @@
         <w:tabs>
           <w:tab w:val="num" w:pos="2880"/>
         </w:tabs>
-        <w:ind w:left="2880" w:hanging="360"/>
+        <w:ind w:left="2520" w:hanging="360"/>
       </w:pPr>
       <w:rPr/>
     </w:lvl>
     <w:lvl w:ilvl="4">
       <w:start w:val="1"/>
-      <w:numFmt w:val="decimal"/>
+      <w:numFmt w:val="lowerLetter"/>
       <w:lvlText w:val="%5."/>
       <w:lvlJc w:val="left"/>
       <w:pPr>
         <w:tabs>
           <w:tab w:val="num" w:pos="3600"/>
         </w:tabs>
-        <w:ind w:left="3600" w:hanging="360"/>
+        <w:ind w:left="3240" w:hanging="360"/>
       </w:pPr>
       <w:rPr/>
     </w:lvl>
     <w:lvl w:ilvl="5">
       <w:start w:val="1"/>
-      <w:numFmt w:val="decimal"/>
+      <w:numFmt w:val="lowerRoman"/>
       <w:lvlText w:val="%6."/>
-      <w:lvlJc w:val="left"/>
+      <w:lvlJc w:val="right"/>
       <w:pPr>
         <w:tabs>
           <w:tab w:val="num" w:pos="4320"/>
         </w:tabs>
-        <w:ind w:left="4320" w:hanging="360"/>
+        <w:ind w:left="3960" w:hanging="180"/>
       </w:pPr>
       <w:rPr/>
     </w:lvl>
@@ -4845,41 +4589,41 @@
         <w:tabs>
           <w:tab w:val="num" w:pos="5040"/>
         </w:tabs>
-        <w:ind w:left="5040" w:hanging="360"/>
+        <w:ind w:left="4680" w:hanging="360"/>
       </w:pPr>
       <w:rPr/>
     </w:lvl>
     <w:lvl w:ilvl="7">
       <w:start w:val="1"/>
-      <w:numFmt w:val="decimal"/>
+      <w:numFmt w:val="lowerLetter"/>
       <w:lvlText w:val="%8."/>
       <w:lvlJc w:val="left"/>
       <w:pPr>
         <w:tabs>
           <w:tab w:val="num" w:pos="5760"/>
         </w:tabs>
-        <w:ind w:left="5760" w:hanging="360"/>
+        <w:ind w:left="5400" w:hanging="360"/>
       </w:pPr>
       <w:rPr/>
     </w:lvl>
     <w:lvl w:ilvl="8">
       <w:start w:val="1"/>
-      <w:numFmt w:val="decimal"/>
+      <w:numFmt w:val="lowerRoman"/>
       <w:lvlText w:val="%9."/>
-      <w:lvlJc w:val="left"/>
+      <w:lvlJc w:val="right"/>
       <w:pPr>
         <w:tabs>
           <w:tab w:val="num" w:pos="6480"/>
         </w:tabs>
-        <w:ind w:left="6480" w:hanging="360"/>
+        <w:ind w:left="6120" w:hanging="180"/>
       </w:pPr>
       <w:rPr/>
     </w:lvl>
   </w:abstractNum>
   <w:abstractNum w:abstractNumId="12">
     <w:lvl w:ilvl="0">
-      <w:start w:val="3"/>
-      <w:numFmt w:val="decimal"/>
+      <w:start w:val="1"/>
+      <w:numFmt w:val="lowerLetter"/>
       <w:lvlText w:val="%1."/>
       <w:lvlJc w:val="left"/>
       <w:pPr>
@@ -4998,6 +4742,482 @@
   <w:abstractNum w:abstractNumId="13">
     <w:lvl w:ilvl="0">
       <w:start w:val="1"/>
+      <w:numFmt w:val="lowerLetter"/>
+      <w:lvlText w:val="%1."/>
+      <w:lvlJc w:val="left"/>
+      <w:pPr>
+        <w:tabs>
+          <w:tab w:val="num" w:pos="720"/>
+        </w:tabs>
+        <w:ind w:left="720" w:hanging="360"/>
+      </w:pPr>
+      <w:rPr/>
+    </w:lvl>
+    <w:lvl w:ilvl="1">
+      <w:start w:val="1"/>
+      <w:numFmt w:val="decimal"/>
+      <w:lvlText w:val="%2."/>
+      <w:lvlJc w:val="left"/>
+      <w:pPr>
+        <w:tabs>
+          <w:tab w:val="num" w:pos="1440"/>
+        </w:tabs>
+        <w:ind w:left="1440" w:hanging="360"/>
+      </w:pPr>
+      <w:rPr/>
+    </w:lvl>
+    <w:lvl w:ilvl="2">
+      <w:start w:val="1"/>
+      <w:numFmt w:val="decimal"/>
+      <w:lvlText w:val="%3."/>
+      <w:lvlJc w:val="left"/>
+      <w:pPr>
+        <w:tabs>
+          <w:tab w:val="num" w:pos="2160"/>
+        </w:tabs>
+        <w:ind w:left="2160" w:hanging="360"/>
+      </w:pPr>
+      <w:rPr/>
+    </w:lvl>
+    <w:lvl w:ilvl="3">
+      <w:start w:val="1"/>
+      <w:numFmt w:val="decimal"/>
+      <w:lvlText w:val="%4."/>
+      <w:lvlJc w:val="left"/>
+      <w:pPr>
+        <w:tabs>
+          <w:tab w:val="num" w:pos="2880"/>
+        </w:tabs>
+        <w:ind w:left="2880" w:hanging="360"/>
+      </w:pPr>
+      <w:rPr/>
+    </w:lvl>
+    <w:lvl w:ilvl="4">
+      <w:start w:val="1"/>
+      <w:numFmt w:val="decimal"/>
+      <w:lvlText w:val="%5."/>
+      <w:lvlJc w:val="left"/>
+      <w:pPr>
+        <w:tabs>
+          <w:tab w:val="num" w:pos="3600"/>
+        </w:tabs>
+        <w:ind w:left="3600" w:hanging="360"/>
+      </w:pPr>
+      <w:rPr/>
+    </w:lvl>
+    <w:lvl w:ilvl="5">
+      <w:start w:val="1"/>
+      <w:numFmt w:val="decimal"/>
+      <w:lvlText w:val="%6."/>
+      <w:lvlJc w:val="left"/>
+      <w:pPr>
+        <w:tabs>
+          <w:tab w:val="num" w:pos="4320"/>
+        </w:tabs>
+        <w:ind w:left="4320" w:hanging="360"/>
+      </w:pPr>
+      <w:rPr/>
+    </w:lvl>
+    <w:lvl w:ilvl="6">
+      <w:start w:val="1"/>
+      <w:numFmt w:val="decimal"/>
+      <w:lvlText w:val="%7."/>
+      <w:lvlJc w:val="left"/>
+      <w:pPr>
+        <w:tabs>
+          <w:tab w:val="num" w:pos="5040"/>
+        </w:tabs>
+        <w:ind w:left="5040" w:hanging="360"/>
+      </w:pPr>
+      <w:rPr/>
+    </w:lvl>
+    <w:lvl w:ilvl="7">
+      <w:start w:val="1"/>
+      <w:numFmt w:val="decimal"/>
+      <w:lvlText w:val="%8."/>
+      <w:lvlJc w:val="left"/>
+      <w:pPr>
+        <w:tabs>
+          <w:tab w:val="num" w:pos="5760"/>
+        </w:tabs>
+        <w:ind w:left="5760" w:hanging="360"/>
+      </w:pPr>
+      <w:rPr/>
+    </w:lvl>
+    <w:lvl w:ilvl="8">
+      <w:start w:val="1"/>
+      <w:numFmt w:val="decimal"/>
+      <w:lvlText w:val="%9."/>
+      <w:lvlJc w:val="left"/>
+      <w:pPr>
+        <w:tabs>
+          <w:tab w:val="num" w:pos="6480"/>
+        </w:tabs>
+        <w:ind w:left="6480" w:hanging="360"/>
+      </w:pPr>
+      <w:rPr/>
+    </w:lvl>
+  </w:abstractNum>
+  <w:abstractNum w:abstractNumId="14">
+    <w:lvl w:ilvl="0">
+      <w:start w:val="1"/>
+      <w:numFmt w:val="lowerLetter"/>
+      <w:lvlText w:val="%1."/>
+      <w:lvlJc w:val="left"/>
+      <w:pPr>
+        <w:tabs>
+          <w:tab w:val="num" w:pos="720"/>
+        </w:tabs>
+        <w:ind w:left="720" w:hanging="360"/>
+      </w:pPr>
+      <w:rPr/>
+    </w:lvl>
+    <w:lvl w:ilvl="1">
+      <w:start w:val="1"/>
+      <w:numFmt w:val="decimal"/>
+      <w:lvlText w:val="%2."/>
+      <w:lvlJc w:val="left"/>
+      <w:pPr>
+        <w:tabs>
+          <w:tab w:val="num" w:pos="1440"/>
+        </w:tabs>
+        <w:ind w:left="1440" w:hanging="360"/>
+      </w:pPr>
+      <w:rPr/>
+    </w:lvl>
+    <w:lvl w:ilvl="2">
+      <w:start w:val="1"/>
+      <w:numFmt w:val="decimal"/>
+      <w:lvlText w:val="%3."/>
+      <w:lvlJc w:val="left"/>
+      <w:pPr>
+        <w:tabs>
+          <w:tab w:val="num" w:pos="2160"/>
+        </w:tabs>
+        <w:ind w:left="2160" w:hanging="360"/>
+      </w:pPr>
+      <w:rPr/>
+    </w:lvl>
+    <w:lvl w:ilvl="3">
+      <w:start w:val="1"/>
+      <w:numFmt w:val="decimal"/>
+      <w:lvlText w:val="%4."/>
+      <w:lvlJc w:val="left"/>
+      <w:pPr>
+        <w:tabs>
+          <w:tab w:val="num" w:pos="2880"/>
+        </w:tabs>
+        <w:ind w:left="2880" w:hanging="360"/>
+      </w:pPr>
+      <w:rPr/>
+    </w:lvl>
+    <w:lvl w:ilvl="4">
+      <w:start w:val="1"/>
+      <w:numFmt w:val="decimal"/>
+      <w:lvlText w:val="%5."/>
+      <w:lvlJc w:val="left"/>
+      <w:pPr>
+        <w:tabs>
+          <w:tab w:val="num" w:pos="3600"/>
+        </w:tabs>
+        <w:ind w:left="3600" w:hanging="360"/>
+      </w:pPr>
+      <w:rPr/>
+    </w:lvl>
+    <w:lvl w:ilvl="5">
+      <w:start w:val="1"/>
+      <w:numFmt w:val="decimal"/>
+      <w:lvlText w:val="%6."/>
+      <w:lvlJc w:val="left"/>
+      <w:pPr>
+        <w:tabs>
+          <w:tab w:val="num" w:pos="4320"/>
+        </w:tabs>
+        <w:ind w:left="4320" w:hanging="360"/>
+      </w:pPr>
+      <w:rPr/>
+    </w:lvl>
+    <w:lvl w:ilvl="6">
+      <w:start w:val="1"/>
+      <w:numFmt w:val="decimal"/>
+      <w:lvlText w:val="%7."/>
+      <w:lvlJc w:val="left"/>
+      <w:pPr>
+        <w:tabs>
+          <w:tab w:val="num" w:pos="5040"/>
+        </w:tabs>
+        <w:ind w:left="5040" w:hanging="360"/>
+      </w:pPr>
+      <w:rPr/>
+    </w:lvl>
+    <w:lvl w:ilvl="7">
+      <w:start w:val="1"/>
+      <w:numFmt w:val="decimal"/>
+      <w:lvlText w:val="%8."/>
+      <w:lvlJc w:val="left"/>
+      <w:pPr>
+        <w:tabs>
+          <w:tab w:val="num" w:pos="5760"/>
+        </w:tabs>
+        <w:ind w:left="5760" w:hanging="360"/>
+      </w:pPr>
+      <w:rPr/>
+    </w:lvl>
+    <w:lvl w:ilvl="8">
+      <w:start w:val="1"/>
+      <w:numFmt w:val="decimal"/>
+      <w:lvlText w:val="%9."/>
+      <w:lvlJc w:val="left"/>
+      <w:pPr>
+        <w:tabs>
+          <w:tab w:val="num" w:pos="6480"/>
+        </w:tabs>
+        <w:ind w:left="6480" w:hanging="360"/>
+      </w:pPr>
+      <w:rPr/>
+    </w:lvl>
+  </w:abstractNum>
+  <w:abstractNum w:abstractNumId="15">
+    <w:lvl w:ilvl="0">
+      <w:start w:val="1"/>
+      <w:numFmt w:val="lowerLetter"/>
+      <w:lvlText w:val="%1."/>
+      <w:lvlJc w:val="left"/>
+      <w:pPr>
+        <w:tabs>
+          <w:tab w:val="num" w:pos="720"/>
+        </w:tabs>
+        <w:ind w:left="720" w:hanging="360"/>
+      </w:pPr>
+      <w:rPr/>
+    </w:lvl>
+    <w:lvl w:ilvl="1">
+      <w:start w:val="1"/>
+      <w:numFmt w:val="decimal"/>
+      <w:lvlText w:val="%2."/>
+      <w:lvlJc w:val="left"/>
+      <w:pPr>
+        <w:tabs>
+          <w:tab w:val="num" w:pos="1440"/>
+        </w:tabs>
+        <w:ind w:left="1440" w:hanging="360"/>
+      </w:pPr>
+      <w:rPr/>
+    </w:lvl>
+    <w:lvl w:ilvl="2">
+      <w:start w:val="1"/>
+      <w:numFmt w:val="decimal"/>
+      <w:lvlText w:val="%3."/>
+      <w:lvlJc w:val="left"/>
+      <w:pPr>
+        <w:tabs>
+          <w:tab w:val="num" w:pos="2160"/>
+        </w:tabs>
+        <w:ind w:left="2160" w:hanging="360"/>
+      </w:pPr>
+      <w:rPr/>
+    </w:lvl>
+    <w:lvl w:ilvl="3">
+      <w:start w:val="1"/>
+      <w:numFmt w:val="decimal"/>
+      <w:lvlText w:val="%4."/>
+      <w:lvlJc w:val="left"/>
+      <w:pPr>
+        <w:tabs>
+          <w:tab w:val="num" w:pos="2880"/>
+        </w:tabs>
+        <w:ind w:left="2880" w:hanging="360"/>
+      </w:pPr>
+      <w:rPr/>
+    </w:lvl>
+    <w:lvl w:ilvl="4">
+      <w:start w:val="1"/>
+      <w:numFmt w:val="decimal"/>
+      <w:lvlText w:val="%5."/>
+      <w:lvlJc w:val="left"/>
+      <w:pPr>
+        <w:tabs>
+          <w:tab w:val="num" w:pos="3600"/>
+        </w:tabs>
+        <w:ind w:left="3600" w:hanging="360"/>
+      </w:pPr>
+      <w:rPr/>
+    </w:lvl>
+    <w:lvl w:ilvl="5">
+      <w:start w:val="1"/>
+      <w:numFmt w:val="decimal"/>
+      <w:lvlText w:val="%6."/>
+      <w:lvlJc w:val="left"/>
+      <w:pPr>
+        <w:tabs>
+          <w:tab w:val="num" w:pos="4320"/>
+        </w:tabs>
+        <w:ind w:left="4320" w:hanging="360"/>
+      </w:pPr>
+      <w:rPr/>
+    </w:lvl>
+    <w:lvl w:ilvl="6">
+      <w:start w:val="1"/>
+      <w:numFmt w:val="decimal"/>
+      <w:lvlText w:val="%7."/>
+      <w:lvlJc w:val="left"/>
+      <w:pPr>
+        <w:tabs>
+          <w:tab w:val="num" w:pos="5040"/>
+        </w:tabs>
+        <w:ind w:left="5040" w:hanging="360"/>
+      </w:pPr>
+      <w:rPr/>
+    </w:lvl>
+    <w:lvl w:ilvl="7">
+      <w:start w:val="1"/>
+      <w:numFmt w:val="decimal"/>
+      <w:lvlText w:val="%8."/>
+      <w:lvlJc w:val="left"/>
+      <w:pPr>
+        <w:tabs>
+          <w:tab w:val="num" w:pos="5760"/>
+        </w:tabs>
+        <w:ind w:left="5760" w:hanging="360"/>
+      </w:pPr>
+      <w:rPr/>
+    </w:lvl>
+    <w:lvl w:ilvl="8">
+      <w:start w:val="1"/>
+      <w:numFmt w:val="decimal"/>
+      <w:lvlText w:val="%9."/>
+      <w:lvlJc w:val="left"/>
+      <w:pPr>
+        <w:tabs>
+          <w:tab w:val="num" w:pos="6480"/>
+        </w:tabs>
+        <w:ind w:left="6480" w:hanging="360"/>
+      </w:pPr>
+      <w:rPr/>
+    </w:lvl>
+  </w:abstractNum>
+  <w:abstractNum w:abstractNumId="16">
+    <w:lvl w:ilvl="0">
+      <w:start w:val="1"/>
+      <w:numFmt w:val="lowerLetter"/>
+      <w:lvlText w:val="%1."/>
+      <w:lvlJc w:val="left"/>
+      <w:pPr>
+        <w:tabs>
+          <w:tab w:val="num" w:pos="720"/>
+        </w:tabs>
+        <w:ind w:left="720" w:hanging="360"/>
+      </w:pPr>
+      <w:rPr/>
+    </w:lvl>
+    <w:lvl w:ilvl="1">
+      <w:start w:val="1"/>
+      <w:numFmt w:val="decimal"/>
+      <w:lvlText w:val="%2."/>
+      <w:lvlJc w:val="left"/>
+      <w:pPr>
+        <w:tabs>
+          <w:tab w:val="num" w:pos="1440"/>
+        </w:tabs>
+        <w:ind w:left="1440" w:hanging="360"/>
+      </w:pPr>
+      <w:rPr/>
+    </w:lvl>
+    <w:lvl w:ilvl="2">
+      <w:start w:val="1"/>
+      <w:numFmt w:val="decimal"/>
+      <w:lvlText w:val="%3."/>
+      <w:lvlJc w:val="left"/>
+      <w:pPr>
+        <w:tabs>
+          <w:tab w:val="num" w:pos="2160"/>
+        </w:tabs>
+        <w:ind w:left="2160" w:hanging="360"/>
+      </w:pPr>
+      <w:rPr/>
+    </w:lvl>
+    <w:lvl w:ilvl="3">
+      <w:start w:val="1"/>
+      <w:numFmt w:val="decimal"/>
+      <w:lvlText w:val="%4."/>
+      <w:lvlJc w:val="left"/>
+      <w:pPr>
+        <w:tabs>
+          <w:tab w:val="num" w:pos="2880"/>
+        </w:tabs>
+        <w:ind w:left="2880" w:hanging="360"/>
+      </w:pPr>
+      <w:rPr/>
+    </w:lvl>
+    <w:lvl w:ilvl="4">
+      <w:start w:val="1"/>
+      <w:numFmt w:val="decimal"/>
+      <w:lvlText w:val="%5."/>
+      <w:lvlJc w:val="left"/>
+      <w:pPr>
+        <w:tabs>
+          <w:tab w:val="num" w:pos="3600"/>
+        </w:tabs>
+        <w:ind w:left="3600" w:hanging="360"/>
+      </w:pPr>
+      <w:rPr/>
+    </w:lvl>
+    <w:lvl w:ilvl="5">
+      <w:start w:val="1"/>
+      <w:numFmt w:val="decimal"/>
+      <w:lvlText w:val="%6."/>
+      <w:lvlJc w:val="left"/>
+      <w:pPr>
+        <w:tabs>
+          <w:tab w:val="num" w:pos="4320"/>
+        </w:tabs>
+        <w:ind w:left="4320" w:hanging="360"/>
+      </w:pPr>
+      <w:rPr/>
+    </w:lvl>
+    <w:lvl w:ilvl="6">
+      <w:start w:val="1"/>
+      <w:numFmt w:val="decimal"/>
+      <w:lvlText w:val="%7."/>
+      <w:lvlJc w:val="left"/>
+      <w:pPr>
+        <w:tabs>
+          <w:tab w:val="num" w:pos="5040"/>
+        </w:tabs>
+        <w:ind w:left="5040" w:hanging="360"/>
+      </w:pPr>
+      <w:rPr/>
+    </w:lvl>
+    <w:lvl w:ilvl="7">
+      <w:start w:val="1"/>
+      <w:numFmt w:val="decimal"/>
+      <w:lvlText w:val="%8."/>
+      <w:lvlJc w:val="left"/>
+      <w:pPr>
+        <w:tabs>
+          <w:tab w:val="num" w:pos="5760"/>
+        </w:tabs>
+        <w:ind w:left="5760" w:hanging="360"/>
+      </w:pPr>
+      <w:rPr/>
+    </w:lvl>
+    <w:lvl w:ilvl="8">
+      <w:start w:val="1"/>
+      <w:numFmt w:val="decimal"/>
+      <w:lvlText w:val="%9."/>
+      <w:lvlJc w:val="left"/>
+      <w:pPr>
+        <w:tabs>
+          <w:tab w:val="num" w:pos="6480"/>
+        </w:tabs>
+        <w:ind w:left="6480" w:hanging="360"/>
+      </w:pPr>
+      <w:rPr/>
+    </w:lvl>
+  </w:abstractNum>
+  <w:abstractNum w:abstractNumId="17">
+    <w:lvl w:ilvl="0">
+      <w:start w:val="1"/>
       <w:numFmt w:val="upperRoman"/>
       <w:lvlText w:val="%1."/>
       <w:lvlJc w:val="right"/>
@@ -5011,7 +5231,7 @@
     </w:lvl>
     <w:lvl w:ilvl="1">
       <w:start w:val="1"/>
-      <w:numFmt w:val="decimal"/>
+      <w:numFmt w:val="lowerLetter"/>
       <w:lvlText w:val="%2."/>
       <w:lvlJc w:val="left"/>
       <w:pPr>
@@ -5114,7 +5334,7 @@
       <w:rPr/>
     </w:lvl>
   </w:abstractNum>
-  <w:abstractNum w:abstractNumId="14">
+  <w:abstractNum w:abstractNumId="18">
     <w:lvl w:ilvl="0">
       <w:start w:val="1"/>
       <w:numFmt w:val="upperRoman"/>
@@ -5233,7 +5453,7 @@
       <w:rPr/>
     </w:lvl>
   </w:abstractNum>
-  <w:abstractNum w:abstractNumId="15">
+  <w:abstractNum w:abstractNumId="19">
     <w:lvl w:ilvl="0">
       <w:start w:val="1"/>
       <w:numFmt w:val="upperRoman"/>
@@ -5352,488 +5572,12 @@
       <w:rPr/>
     </w:lvl>
   </w:abstractNum>
-  <w:abstractNum w:abstractNumId="16">
+  <w:abstractNum w:abstractNumId="20">
     <w:lvl w:ilvl="0">
       <w:start w:val="1"/>
       <w:numFmt w:val="upperRoman"/>
       <w:lvlText w:val="%1."/>
       <w:lvlJc w:val="right"/>
-      <w:pPr>
-        <w:tabs>
-          <w:tab w:val="num" w:pos="720"/>
-        </w:tabs>
-        <w:ind w:left="720" w:hanging="360"/>
-      </w:pPr>
-      <w:rPr/>
-    </w:lvl>
-    <w:lvl w:ilvl="1">
-      <w:start w:val="1"/>
-      <w:numFmt w:val="lowerLetter"/>
-      <w:lvlText w:val="%2."/>
-      <w:lvlJc w:val="left"/>
-      <w:pPr>
-        <w:tabs>
-          <w:tab w:val="num" w:pos="1440"/>
-        </w:tabs>
-        <w:ind w:left="1440" w:hanging="360"/>
-      </w:pPr>
-      <w:rPr/>
-    </w:lvl>
-    <w:lvl w:ilvl="2">
-      <w:start w:val="1"/>
-      <w:numFmt w:val="decimal"/>
-      <w:lvlText w:val="%3."/>
-      <w:lvlJc w:val="left"/>
-      <w:pPr>
-        <w:tabs>
-          <w:tab w:val="num" w:pos="2160"/>
-        </w:tabs>
-        <w:ind w:left="2160" w:hanging="360"/>
-      </w:pPr>
-      <w:rPr/>
-    </w:lvl>
-    <w:lvl w:ilvl="3">
-      <w:start w:val="1"/>
-      <w:numFmt w:val="decimal"/>
-      <w:lvlText w:val="%4."/>
-      <w:lvlJc w:val="left"/>
-      <w:pPr>
-        <w:tabs>
-          <w:tab w:val="num" w:pos="2880"/>
-        </w:tabs>
-        <w:ind w:left="2880" w:hanging="360"/>
-      </w:pPr>
-      <w:rPr/>
-    </w:lvl>
-    <w:lvl w:ilvl="4">
-      <w:start w:val="1"/>
-      <w:numFmt w:val="decimal"/>
-      <w:lvlText w:val="%5."/>
-      <w:lvlJc w:val="left"/>
-      <w:pPr>
-        <w:tabs>
-          <w:tab w:val="num" w:pos="3600"/>
-        </w:tabs>
-        <w:ind w:left="3600" w:hanging="360"/>
-      </w:pPr>
-      <w:rPr/>
-    </w:lvl>
-    <w:lvl w:ilvl="5">
-      <w:start w:val="1"/>
-      <w:numFmt w:val="decimal"/>
-      <w:lvlText w:val="%6."/>
-      <w:lvlJc w:val="left"/>
-      <w:pPr>
-        <w:tabs>
-          <w:tab w:val="num" w:pos="4320"/>
-        </w:tabs>
-        <w:ind w:left="4320" w:hanging="360"/>
-      </w:pPr>
-      <w:rPr/>
-    </w:lvl>
-    <w:lvl w:ilvl="6">
-      <w:start w:val="1"/>
-      <w:numFmt w:val="decimal"/>
-      <w:lvlText w:val="%7."/>
-      <w:lvlJc w:val="left"/>
-      <w:pPr>
-        <w:tabs>
-          <w:tab w:val="num" w:pos="5040"/>
-        </w:tabs>
-        <w:ind w:left="5040" w:hanging="360"/>
-      </w:pPr>
-      <w:rPr/>
-    </w:lvl>
-    <w:lvl w:ilvl="7">
-      <w:start w:val="1"/>
-      <w:numFmt w:val="decimal"/>
-      <w:lvlText w:val="%8."/>
-      <w:lvlJc w:val="left"/>
-      <w:pPr>
-        <w:tabs>
-          <w:tab w:val="num" w:pos="5760"/>
-        </w:tabs>
-        <w:ind w:left="5760" w:hanging="360"/>
-      </w:pPr>
-      <w:rPr/>
-    </w:lvl>
-    <w:lvl w:ilvl="8">
-      <w:start w:val="1"/>
-      <w:numFmt w:val="decimal"/>
-      <w:lvlText w:val="%9."/>
-      <w:lvlJc w:val="left"/>
-      <w:pPr>
-        <w:tabs>
-          <w:tab w:val="num" w:pos="6480"/>
-        </w:tabs>
-        <w:ind w:left="6480" w:hanging="360"/>
-      </w:pPr>
-      <w:rPr/>
-    </w:lvl>
-  </w:abstractNum>
-  <w:abstractNum w:abstractNumId="17">
-    <w:lvl w:ilvl="0">
-      <w:start w:val="1"/>
-      <w:numFmt w:val="upperRoman"/>
-      <w:lvlText w:val="%1."/>
-      <w:lvlJc w:val="right"/>
-      <w:pPr>
-        <w:tabs>
-          <w:tab w:val="num" w:pos="720"/>
-        </w:tabs>
-        <w:ind w:left="720" w:hanging="360"/>
-      </w:pPr>
-      <w:rPr/>
-    </w:lvl>
-    <w:lvl w:ilvl="1">
-      <w:start w:val="1"/>
-      <w:numFmt w:val="lowerLetter"/>
-      <w:lvlText w:val="%2."/>
-      <w:lvlJc w:val="left"/>
-      <w:pPr>
-        <w:tabs>
-          <w:tab w:val="num" w:pos="1440"/>
-        </w:tabs>
-        <w:ind w:left="1440" w:hanging="360"/>
-      </w:pPr>
-      <w:rPr/>
-    </w:lvl>
-    <w:lvl w:ilvl="2">
-      <w:start w:val="1"/>
-      <w:numFmt w:val="decimal"/>
-      <w:lvlText w:val="%3."/>
-      <w:lvlJc w:val="left"/>
-      <w:pPr>
-        <w:tabs>
-          <w:tab w:val="num" w:pos="2160"/>
-        </w:tabs>
-        <w:ind w:left="2160" w:hanging="360"/>
-      </w:pPr>
-      <w:rPr/>
-    </w:lvl>
-    <w:lvl w:ilvl="3">
-      <w:start w:val="1"/>
-      <w:numFmt w:val="decimal"/>
-      <w:lvlText w:val="%4."/>
-      <w:lvlJc w:val="left"/>
-      <w:pPr>
-        <w:tabs>
-          <w:tab w:val="num" w:pos="2880"/>
-        </w:tabs>
-        <w:ind w:left="2880" w:hanging="360"/>
-      </w:pPr>
-      <w:rPr/>
-    </w:lvl>
-    <w:lvl w:ilvl="4">
-      <w:start w:val="1"/>
-      <w:numFmt w:val="decimal"/>
-      <w:lvlText w:val="%5."/>
-      <w:lvlJc w:val="left"/>
-      <w:pPr>
-        <w:tabs>
-          <w:tab w:val="num" w:pos="3600"/>
-        </w:tabs>
-        <w:ind w:left="3600" w:hanging="360"/>
-      </w:pPr>
-      <w:rPr/>
-    </w:lvl>
-    <w:lvl w:ilvl="5">
-      <w:start w:val="1"/>
-      <w:numFmt w:val="decimal"/>
-      <w:lvlText w:val="%6."/>
-      <w:lvlJc w:val="left"/>
-      <w:pPr>
-        <w:tabs>
-          <w:tab w:val="num" w:pos="4320"/>
-        </w:tabs>
-        <w:ind w:left="4320" w:hanging="360"/>
-      </w:pPr>
-      <w:rPr/>
-    </w:lvl>
-    <w:lvl w:ilvl="6">
-      <w:start w:val="1"/>
-      <w:numFmt w:val="decimal"/>
-      <w:lvlText w:val="%7."/>
-      <w:lvlJc w:val="left"/>
-      <w:pPr>
-        <w:tabs>
-          <w:tab w:val="num" w:pos="5040"/>
-        </w:tabs>
-        <w:ind w:left="5040" w:hanging="360"/>
-      </w:pPr>
-      <w:rPr/>
-    </w:lvl>
-    <w:lvl w:ilvl="7">
-      <w:start w:val="1"/>
-      <w:numFmt w:val="decimal"/>
-      <w:lvlText w:val="%8."/>
-      <w:lvlJc w:val="left"/>
-      <w:pPr>
-        <w:tabs>
-          <w:tab w:val="num" w:pos="5760"/>
-        </w:tabs>
-        <w:ind w:left="5760" w:hanging="360"/>
-      </w:pPr>
-      <w:rPr/>
-    </w:lvl>
-    <w:lvl w:ilvl="8">
-      <w:start w:val="1"/>
-      <w:numFmt w:val="decimal"/>
-      <w:lvlText w:val="%9."/>
-      <w:lvlJc w:val="left"/>
-      <w:pPr>
-        <w:tabs>
-          <w:tab w:val="num" w:pos="6480"/>
-        </w:tabs>
-        <w:ind w:left="6480" w:hanging="360"/>
-      </w:pPr>
-      <w:rPr/>
-    </w:lvl>
-  </w:abstractNum>
-  <w:abstractNum w:abstractNumId="18">
-    <w:lvl w:ilvl="0">
-      <w:start w:val="1"/>
-      <w:numFmt w:val="upperRoman"/>
-      <w:lvlText w:val="%1."/>
-      <w:lvlJc w:val="right"/>
-      <w:pPr>
-        <w:tabs>
-          <w:tab w:val="num" w:pos="720"/>
-        </w:tabs>
-        <w:ind w:left="360" w:hanging="360"/>
-      </w:pPr>
-      <w:rPr/>
-    </w:lvl>
-    <w:lvl w:ilvl="1">
-      <w:start w:val="1"/>
-      <w:numFmt w:val="lowerLetter"/>
-      <w:lvlText w:val="%2."/>
-      <w:lvlJc w:val="left"/>
-      <w:pPr>
-        <w:tabs>
-          <w:tab w:val="num" w:pos="1440"/>
-        </w:tabs>
-        <w:ind w:left="1080" w:hanging="360"/>
-      </w:pPr>
-      <w:rPr/>
-    </w:lvl>
-    <w:lvl w:ilvl="2">
-      <w:start w:val="1"/>
-      <w:numFmt w:val="lowerRoman"/>
-      <w:lvlText w:val="%3."/>
-      <w:lvlJc w:val="right"/>
-      <w:pPr>
-        <w:tabs>
-          <w:tab w:val="num" w:pos="2160"/>
-        </w:tabs>
-        <w:ind w:left="1800" w:hanging="180"/>
-      </w:pPr>
-      <w:rPr/>
-    </w:lvl>
-    <w:lvl w:ilvl="3">
-      <w:start w:val="1"/>
-      <w:numFmt w:val="decimal"/>
-      <w:lvlText w:val="%4."/>
-      <w:lvlJc w:val="left"/>
-      <w:pPr>
-        <w:tabs>
-          <w:tab w:val="num" w:pos="2880"/>
-        </w:tabs>
-        <w:ind w:left="2520" w:hanging="360"/>
-      </w:pPr>
-      <w:rPr/>
-    </w:lvl>
-    <w:lvl w:ilvl="4">
-      <w:start w:val="1"/>
-      <w:numFmt w:val="lowerLetter"/>
-      <w:lvlText w:val="%5."/>
-      <w:lvlJc w:val="left"/>
-      <w:pPr>
-        <w:tabs>
-          <w:tab w:val="num" w:pos="3600"/>
-        </w:tabs>
-        <w:ind w:left="3240" w:hanging="360"/>
-      </w:pPr>
-      <w:rPr/>
-    </w:lvl>
-    <w:lvl w:ilvl="5">
-      <w:start w:val="1"/>
-      <w:numFmt w:val="lowerRoman"/>
-      <w:lvlText w:val="%6."/>
-      <w:lvlJc w:val="right"/>
-      <w:pPr>
-        <w:tabs>
-          <w:tab w:val="num" w:pos="4320"/>
-        </w:tabs>
-        <w:ind w:left="3960" w:hanging="180"/>
-      </w:pPr>
-      <w:rPr/>
-    </w:lvl>
-    <w:lvl w:ilvl="6">
-      <w:start w:val="1"/>
-      <w:numFmt w:val="decimal"/>
-      <w:lvlText w:val="%7."/>
-      <w:lvlJc w:val="left"/>
-      <w:pPr>
-        <w:tabs>
-          <w:tab w:val="num" w:pos="5040"/>
-        </w:tabs>
-        <w:ind w:left="4680" w:hanging="360"/>
-      </w:pPr>
-      <w:rPr/>
-    </w:lvl>
-    <w:lvl w:ilvl="7">
-      <w:start w:val="1"/>
-      <w:numFmt w:val="lowerLetter"/>
-      <w:lvlText w:val="%8."/>
-      <w:lvlJc w:val="left"/>
-      <w:pPr>
-        <w:tabs>
-          <w:tab w:val="num" w:pos="5760"/>
-        </w:tabs>
-        <w:ind w:left="5400" w:hanging="360"/>
-      </w:pPr>
-      <w:rPr/>
-    </w:lvl>
-    <w:lvl w:ilvl="8">
-      <w:start w:val="1"/>
-      <w:numFmt w:val="lowerRoman"/>
-      <w:lvlText w:val="%9."/>
-      <w:lvlJc w:val="right"/>
-      <w:pPr>
-        <w:tabs>
-          <w:tab w:val="num" w:pos="6480"/>
-        </w:tabs>
-        <w:ind w:left="6120" w:hanging="180"/>
-      </w:pPr>
-      <w:rPr/>
-    </w:lvl>
-  </w:abstractNum>
-  <w:abstractNum w:abstractNumId="19">
-    <w:lvl w:ilvl="0">
-      <w:start w:val="2"/>
-      <w:numFmt w:val="decimal"/>
-      <w:lvlText w:val="%1."/>
-      <w:lvlJc w:val="left"/>
-      <w:pPr>
-        <w:tabs>
-          <w:tab w:val="num" w:pos="720"/>
-        </w:tabs>
-        <w:ind w:left="720" w:hanging="360"/>
-      </w:pPr>
-      <w:rPr/>
-    </w:lvl>
-    <w:lvl w:ilvl="1">
-      <w:start w:val="1"/>
-      <w:numFmt w:val="lowerLetter"/>
-      <w:lvlText w:val="%2."/>
-      <w:lvlJc w:val="left"/>
-      <w:pPr>
-        <w:tabs>
-          <w:tab w:val="num" w:pos="1440"/>
-        </w:tabs>
-        <w:ind w:left="1440" w:hanging="360"/>
-      </w:pPr>
-      <w:rPr/>
-    </w:lvl>
-    <w:lvl w:ilvl="2">
-      <w:start w:val="1"/>
-      <w:numFmt w:val="decimal"/>
-      <w:lvlText w:val="%3."/>
-      <w:lvlJc w:val="left"/>
-      <w:pPr>
-        <w:tabs>
-          <w:tab w:val="num" w:pos="2160"/>
-        </w:tabs>
-        <w:ind w:left="2160" w:hanging="360"/>
-      </w:pPr>
-      <w:rPr/>
-    </w:lvl>
-    <w:lvl w:ilvl="3">
-      <w:start w:val="1"/>
-      <w:numFmt w:val="decimal"/>
-      <w:lvlText w:val="%4."/>
-      <w:lvlJc w:val="left"/>
-      <w:pPr>
-        <w:tabs>
-          <w:tab w:val="num" w:pos="2880"/>
-        </w:tabs>
-        <w:ind w:left="2880" w:hanging="360"/>
-      </w:pPr>
-      <w:rPr/>
-    </w:lvl>
-    <w:lvl w:ilvl="4">
-      <w:start w:val="1"/>
-      <w:numFmt w:val="decimal"/>
-      <w:lvlText w:val="%5."/>
-      <w:lvlJc w:val="left"/>
-      <w:pPr>
-        <w:tabs>
-          <w:tab w:val="num" w:pos="3600"/>
-        </w:tabs>
-        <w:ind w:left="3600" w:hanging="360"/>
-      </w:pPr>
-      <w:rPr/>
-    </w:lvl>
-    <w:lvl w:ilvl="5">
-      <w:start w:val="1"/>
-      <w:numFmt w:val="decimal"/>
-      <w:lvlText w:val="%6."/>
-      <w:lvlJc w:val="left"/>
-      <w:pPr>
-        <w:tabs>
-          <w:tab w:val="num" w:pos="4320"/>
-        </w:tabs>
-        <w:ind w:left="4320" w:hanging="360"/>
-      </w:pPr>
-      <w:rPr/>
-    </w:lvl>
-    <w:lvl w:ilvl="6">
-      <w:start w:val="1"/>
-      <w:numFmt w:val="decimal"/>
-      <w:lvlText w:val="%7."/>
-      <w:lvlJc w:val="left"/>
-      <w:pPr>
-        <w:tabs>
-          <w:tab w:val="num" w:pos="5040"/>
-        </w:tabs>
-        <w:ind w:left="5040" w:hanging="360"/>
-      </w:pPr>
-      <w:rPr/>
-    </w:lvl>
-    <w:lvl w:ilvl="7">
-      <w:start w:val="1"/>
-      <w:numFmt w:val="decimal"/>
-      <w:lvlText w:val="%8."/>
-      <w:lvlJc w:val="left"/>
-      <w:pPr>
-        <w:tabs>
-          <w:tab w:val="num" w:pos="5760"/>
-        </w:tabs>
-        <w:ind w:left="5760" w:hanging="360"/>
-      </w:pPr>
-      <w:rPr/>
-    </w:lvl>
-    <w:lvl w:ilvl="8">
-      <w:start w:val="1"/>
-      <w:numFmt w:val="decimal"/>
-      <w:lvlText w:val="%9."/>
-      <w:lvlJc w:val="left"/>
-      <w:pPr>
-        <w:tabs>
-          <w:tab w:val="num" w:pos="6480"/>
-        </w:tabs>
-        <w:ind w:left="6480" w:hanging="360"/>
-      </w:pPr>
-      <w:rPr/>
-    </w:lvl>
-  </w:abstractNum>
-  <w:abstractNum w:abstractNumId="20">
-    <w:lvl w:ilvl="0">
-      <w:start w:val="2"/>
-      <w:numFmt w:val="decimal"/>
-      <w:lvlText w:val="%1."/>
-      <w:lvlJc w:val="left"/>
       <w:pPr>
         <w:tabs>
           <w:tab w:val="num" w:pos="720"/>
@@ -6187,15 +5931,15 @@
   </w:abstractNum>
   <w:abstractNum w:abstractNumId="23">
     <w:lvl w:ilvl="0">
-      <w:start w:val="1"/>
-      <w:numFmt w:val="upperRoman"/>
+      <w:start w:val="2"/>
+      <w:numFmt w:val="decimal"/>
       <w:lvlText w:val="%1."/>
-      <w:lvlJc w:val="right"/>
+      <w:lvlJc w:val="left"/>
       <w:pPr>
         <w:tabs>
           <w:tab w:val="num" w:pos="720"/>
         </w:tabs>
-        <w:ind w:left="360" w:hanging="360"/>
+        <w:ind w:left="720" w:hanging="360"/>
       </w:pPr>
       <w:rPr/>
     </w:lvl>
@@ -6208,20 +5952,20 @@
         <w:tabs>
           <w:tab w:val="num" w:pos="1440"/>
         </w:tabs>
-        <w:ind w:left="1080" w:hanging="360"/>
+        <w:ind w:left="1440" w:hanging="360"/>
       </w:pPr>
       <w:rPr/>
     </w:lvl>
     <w:lvl w:ilvl="2">
       <w:start w:val="1"/>
-      <w:numFmt w:val="lowerRoman"/>
+      <w:numFmt w:val="decimal"/>
       <w:lvlText w:val="%3."/>
-      <w:lvlJc w:val="right"/>
+      <w:lvlJc w:val="left"/>
       <w:pPr>
         <w:tabs>
           <w:tab w:val="num" w:pos="2160"/>
         </w:tabs>
-        <w:ind w:left="1800" w:hanging="180"/>
+        <w:ind w:left="2160" w:hanging="360"/>
       </w:pPr>
       <w:rPr/>
     </w:lvl>
@@ -6234,33 +5978,33 @@
         <w:tabs>
           <w:tab w:val="num" w:pos="2880"/>
         </w:tabs>
-        <w:ind w:left="2520" w:hanging="360"/>
+        <w:ind w:left="2880" w:hanging="360"/>
       </w:pPr>
       <w:rPr/>
     </w:lvl>
     <w:lvl w:ilvl="4">
       <w:start w:val="1"/>
-      <w:numFmt w:val="lowerLetter"/>
+      <w:numFmt w:val="decimal"/>
       <w:lvlText w:val="%5."/>
       <w:lvlJc w:val="left"/>
       <w:pPr>
         <w:tabs>
           <w:tab w:val="num" w:pos="3600"/>
         </w:tabs>
-        <w:ind w:left="3240" w:hanging="360"/>
+        <w:ind w:left="3600" w:hanging="360"/>
       </w:pPr>
       <w:rPr/>
     </w:lvl>
     <w:lvl w:ilvl="5">
       <w:start w:val="1"/>
-      <w:numFmt w:val="lowerRoman"/>
+      <w:numFmt w:val="decimal"/>
       <w:lvlText w:val="%6."/>
-      <w:lvlJc w:val="right"/>
+      <w:lvlJc w:val="left"/>
       <w:pPr>
         <w:tabs>
           <w:tab w:val="num" w:pos="4320"/>
         </w:tabs>
-        <w:ind w:left="3960" w:hanging="180"/>
+        <w:ind w:left="4320" w:hanging="360"/>
       </w:pPr>
       <w:rPr/>
     </w:lvl>
@@ -6273,40 +6017,40 @@
         <w:tabs>
           <w:tab w:val="num" w:pos="5040"/>
         </w:tabs>
-        <w:ind w:left="4680" w:hanging="360"/>
+        <w:ind w:left="5040" w:hanging="360"/>
       </w:pPr>
       <w:rPr/>
     </w:lvl>
     <w:lvl w:ilvl="7">
       <w:start w:val="1"/>
-      <w:numFmt w:val="lowerLetter"/>
+      <w:numFmt w:val="decimal"/>
       <w:lvlText w:val="%8."/>
       <w:lvlJc w:val="left"/>
       <w:pPr>
         <w:tabs>
           <w:tab w:val="num" w:pos="5760"/>
         </w:tabs>
-        <w:ind w:left="5400" w:hanging="360"/>
+        <w:ind w:left="5760" w:hanging="360"/>
       </w:pPr>
       <w:rPr/>
     </w:lvl>
     <w:lvl w:ilvl="8">
       <w:start w:val="1"/>
-      <w:numFmt w:val="lowerRoman"/>
+      <w:numFmt w:val="decimal"/>
       <w:lvlText w:val="%9."/>
-      <w:lvlJc w:val="right"/>
+      <w:lvlJc w:val="left"/>
       <w:pPr>
         <w:tabs>
           <w:tab w:val="num" w:pos="6480"/>
         </w:tabs>
-        <w:ind w:left="6120" w:hanging="180"/>
+        <w:ind w:left="6480" w:hanging="360"/>
       </w:pPr>
       <w:rPr/>
     </w:lvl>
   </w:abstractNum>
   <w:abstractNum w:abstractNumId="24">
     <w:lvl w:ilvl="0">
-      <w:start w:val="3"/>
+      <w:start w:val="2"/>
       <w:numFmt w:val="decimal"/>
       <w:lvlText w:val="%1."/>
       <w:lvlJc w:val="left"/>
@@ -6782,121 +6526,121 @@
   </w:abstractNum>
   <w:abstractNum w:abstractNumId="28">
     <w:lvl w:ilvl="0">
-      <w:start w:val="1"/>
-      <w:numFmt w:val="none"/>
-      <w:suff w:val="nothing"/>
-      <w:lvlText w:val=""/>
-      <w:lvlJc w:val="left"/>
-      <w:pPr>
-        <w:tabs>
-          <w:tab w:val="num" w:pos="0"/>
-        </w:tabs>
-        <w:ind w:left="0" w:hanging="0"/>
-      </w:pPr>
+      <w:start w:val="3"/>
+      <w:numFmt w:val="decimal"/>
+      <w:lvlText w:val="%1."/>
+      <w:lvlJc w:val="left"/>
+      <w:pPr>
+        <w:tabs>
+          <w:tab w:val="num" w:pos="720"/>
+        </w:tabs>
+        <w:ind w:left="720" w:hanging="360"/>
+      </w:pPr>
+      <w:rPr/>
     </w:lvl>
     <w:lvl w:ilvl="1">
       <w:start w:val="1"/>
-      <w:numFmt w:val="none"/>
-      <w:suff w:val="nothing"/>
-      <w:lvlText w:val=""/>
-      <w:lvlJc w:val="left"/>
-      <w:pPr>
-        <w:tabs>
-          <w:tab w:val="num" w:pos="0"/>
-        </w:tabs>
-        <w:ind w:left="0" w:hanging="0"/>
-      </w:pPr>
+      <w:numFmt w:val="lowerLetter"/>
+      <w:lvlText w:val="%2."/>
+      <w:lvlJc w:val="left"/>
+      <w:pPr>
+        <w:tabs>
+          <w:tab w:val="num" w:pos="1440"/>
+        </w:tabs>
+        <w:ind w:left="1440" w:hanging="360"/>
+      </w:pPr>
+      <w:rPr/>
     </w:lvl>
     <w:lvl w:ilvl="2">
       <w:start w:val="1"/>
-      <w:numFmt w:val="none"/>
-      <w:suff w:val="nothing"/>
-      <w:lvlText w:val=""/>
-      <w:lvlJc w:val="left"/>
-      <w:pPr>
-        <w:tabs>
-          <w:tab w:val="num" w:pos="0"/>
-        </w:tabs>
-        <w:ind w:left="0" w:hanging="0"/>
-      </w:pPr>
+      <w:numFmt w:val="decimal"/>
+      <w:lvlText w:val="%3."/>
+      <w:lvlJc w:val="left"/>
+      <w:pPr>
+        <w:tabs>
+          <w:tab w:val="num" w:pos="2160"/>
+        </w:tabs>
+        <w:ind w:left="2160" w:hanging="360"/>
+      </w:pPr>
+      <w:rPr/>
     </w:lvl>
     <w:lvl w:ilvl="3">
       <w:start w:val="1"/>
-      <w:numFmt w:val="none"/>
-      <w:suff w:val="nothing"/>
-      <w:lvlText w:val=""/>
-      <w:lvlJc w:val="left"/>
-      <w:pPr>
-        <w:tabs>
-          <w:tab w:val="num" w:pos="0"/>
-        </w:tabs>
-        <w:ind w:left="0" w:hanging="0"/>
-      </w:pPr>
+      <w:numFmt w:val="decimal"/>
+      <w:lvlText w:val="%4."/>
+      <w:lvlJc w:val="left"/>
+      <w:pPr>
+        <w:tabs>
+          <w:tab w:val="num" w:pos="2880"/>
+        </w:tabs>
+        <w:ind w:left="2880" w:hanging="360"/>
+      </w:pPr>
+      <w:rPr/>
     </w:lvl>
     <w:lvl w:ilvl="4">
       <w:start w:val="1"/>
-      <w:numFmt w:val="none"/>
-      <w:suff w:val="nothing"/>
-      <w:lvlText w:val=""/>
-      <w:lvlJc w:val="left"/>
-      <w:pPr>
-        <w:tabs>
-          <w:tab w:val="num" w:pos="0"/>
-        </w:tabs>
-        <w:ind w:left="0" w:hanging="0"/>
-      </w:pPr>
+      <w:numFmt w:val="decimal"/>
+      <w:lvlText w:val="%5."/>
+      <w:lvlJc w:val="left"/>
+      <w:pPr>
+        <w:tabs>
+          <w:tab w:val="num" w:pos="3600"/>
+        </w:tabs>
+        <w:ind w:left="3600" w:hanging="360"/>
+      </w:pPr>
+      <w:rPr/>
     </w:lvl>
     <w:lvl w:ilvl="5">
       <w:start w:val="1"/>
-      <w:numFmt w:val="none"/>
-      <w:suff w:val="nothing"/>
-      <w:lvlText w:val=""/>
-      <w:lvlJc w:val="left"/>
-      <w:pPr>
-        <w:tabs>
-          <w:tab w:val="num" w:pos="0"/>
-        </w:tabs>
-        <w:ind w:left="0" w:hanging="0"/>
-      </w:pPr>
+      <w:numFmt w:val="decimal"/>
+      <w:lvlText w:val="%6."/>
+      <w:lvlJc w:val="left"/>
+      <w:pPr>
+        <w:tabs>
+          <w:tab w:val="num" w:pos="4320"/>
+        </w:tabs>
+        <w:ind w:left="4320" w:hanging="360"/>
+      </w:pPr>
+      <w:rPr/>
     </w:lvl>
     <w:lvl w:ilvl="6">
       <w:start w:val="1"/>
-      <w:numFmt w:val="none"/>
-      <w:suff w:val="nothing"/>
-      <w:lvlText w:val=""/>
-      <w:lvlJc w:val="left"/>
-      <w:pPr>
-        <w:tabs>
-          <w:tab w:val="num" w:pos="0"/>
-        </w:tabs>
-        <w:ind w:left="0" w:hanging="0"/>
-      </w:pPr>
+      <w:numFmt w:val="decimal"/>
+      <w:lvlText w:val="%7."/>
+      <w:lvlJc w:val="left"/>
+      <w:pPr>
+        <w:tabs>
+          <w:tab w:val="num" w:pos="5040"/>
+        </w:tabs>
+        <w:ind w:left="5040" w:hanging="360"/>
+      </w:pPr>
+      <w:rPr/>
     </w:lvl>
     <w:lvl w:ilvl="7">
       <w:start w:val="1"/>
-      <w:numFmt w:val="none"/>
-      <w:suff w:val="nothing"/>
-      <w:lvlText w:val=""/>
-      <w:lvlJc w:val="left"/>
-      <w:pPr>
-        <w:tabs>
-          <w:tab w:val="num" w:pos="0"/>
-        </w:tabs>
-        <w:ind w:left="0" w:hanging="0"/>
-      </w:pPr>
+      <w:numFmt w:val="decimal"/>
+      <w:lvlText w:val="%8."/>
+      <w:lvlJc w:val="left"/>
+      <w:pPr>
+        <w:tabs>
+          <w:tab w:val="num" w:pos="5760"/>
+        </w:tabs>
+        <w:ind w:left="5760" w:hanging="360"/>
+      </w:pPr>
+      <w:rPr/>
     </w:lvl>
     <w:lvl w:ilvl="8">
       <w:start w:val="1"/>
-      <w:numFmt w:val="none"/>
-      <w:suff w:val="nothing"/>
-      <w:lvlText w:val=""/>
-      <w:lvlJc w:val="left"/>
-      <w:pPr>
-        <w:tabs>
-          <w:tab w:val="num" w:pos="0"/>
-        </w:tabs>
-        <w:ind w:left="0" w:hanging="0"/>
-      </w:pPr>
+      <w:numFmt w:val="decimal"/>
+      <w:lvlText w:val="%9."/>
+      <w:lvlJc w:val="left"/>
+      <w:pPr>
+        <w:tabs>
+          <w:tab w:val="num" w:pos="6480"/>
+        </w:tabs>
+        <w:ind w:left="6480" w:hanging="360"/>
+      </w:pPr>
+      <w:rPr/>
     </w:lvl>
   </w:abstractNum>
   <w:num w:numId="1">
@@ -6984,22 +6728,22 @@
     <w:abstractNumId w:val="28"/>
   </w:num>
   <w:num w:numId="29">
-    <w:abstractNumId w:val="4"/>
+    <w:abstractNumId w:val="5"/>
   </w:num>
   <w:num w:numId="30">
-    <w:abstractNumId w:val="4"/>
+    <w:abstractNumId w:val="5"/>
   </w:num>
   <w:num w:numId="31">
-    <w:abstractNumId w:val="4"/>
+    <w:abstractNumId w:val="5"/>
   </w:num>
   <w:num w:numId="32">
-    <w:abstractNumId w:val="9"/>
+    <w:abstractNumId w:val="7"/>
   </w:num>
   <w:num w:numId="33">
-    <w:abstractNumId w:val="9"/>
+    <w:abstractNumId w:val="7"/>
   </w:num>
   <w:num w:numId="34">
-    <w:abstractNumId w:val="13"/>
+    <w:abstractNumId w:val="9"/>
     <w:lvlOverride w:ilvl="0">
       <w:startOverride w:val="1"/>
     </w:lvlOverride>
@@ -7020,7 +6764,7 @@
     </w:lvlOverride>
   </w:num>
   <w:num w:numId="35">
-    <w:abstractNumId w:val="13"/>
+    <w:abstractNumId w:val="9"/>
     <w:lvlOverride w:ilvl="0">
       <w:startOverride w:val="1"/>
     </w:lvlOverride>
@@ -7041,7 +6785,7 @@
     </w:lvlOverride>
   </w:num>
   <w:num w:numId="36">
-    <w:abstractNumId w:val="13"/>
+    <w:abstractNumId w:val="9"/>
     <w:lvlOverride w:ilvl="0">
       <w:startOverride w:val="1"/>
     </w:lvlOverride>
@@ -7062,7 +6806,7 @@
     </w:lvlOverride>
   </w:num>
   <w:num w:numId="37">
-    <w:abstractNumId w:val="13"/>
+    <w:abstractNumId w:val="9"/>
     <w:lvlOverride w:ilvl="0">
       <w:startOverride w:val="1"/>
     </w:lvlOverride>
@@ -7083,7 +6827,7 @@
     </w:lvlOverride>
   </w:num>
   <w:num w:numId="38">
-    <w:abstractNumId w:val="18"/>
+    <w:abstractNumId w:val="10"/>
     <w:lvlOverride w:ilvl="0">
       <w:lvl w:ilvl="0">
         <w:start w:val="2"/>
@@ -7116,6 +6860,7 @@
         </w:pPr>
         <w:rPr/>
       </w:lvl>
+      <w:startOverride w:val="1"/>
     </w:lvlOverride>
     <w:lvlOverride w:ilvl="1">
       <w:startOverride w:val="1"/>
@@ -7245,7 +6990,7 @@
     </w:lvlOverride>
   </w:num>
   <w:num w:numId="39">
-    <w:abstractNumId w:val="18"/>
+    <w:abstractNumId w:val="10"/>
     <w:lvlOverride w:ilvl="0">
       <w:lvl w:ilvl="0">
         <w:start w:val="2"/>
@@ -7278,6 +7023,7 @@
         </w:pPr>
         <w:rPr/>
       </w:lvl>
+      <w:startOverride w:val="1"/>
     </w:lvlOverride>
     <w:lvlOverride w:ilvl="1">
       <w:startOverride w:val="1"/>
@@ -7407,7 +7153,7 @@
     </w:lvlOverride>
   </w:num>
   <w:num w:numId="40">
-    <w:abstractNumId w:val="18"/>
+    <w:abstractNumId w:val="10"/>
     <w:lvlOverride w:ilvl="0">
       <w:lvl w:ilvl="0">
         <w:start w:val="2"/>
@@ -7440,6 +7186,7 @@
         </w:pPr>
         <w:rPr/>
       </w:lvl>
+      <w:startOverride w:val="1"/>
     </w:lvlOverride>
     <w:lvlOverride w:ilvl="1">
       <w:startOverride w:val="1"/>
@@ -7569,7 +7316,7 @@
     </w:lvlOverride>
   </w:num>
   <w:num w:numId="41">
-    <w:abstractNumId w:val="18"/>
+    <w:abstractNumId w:val="10"/>
     <w:lvlOverride w:ilvl="0">
       <w:lvl w:ilvl="0">
         <w:start w:val="2"/>
@@ -7602,6 +7349,7 @@
         </w:pPr>
         <w:rPr/>
       </w:lvl>
+      <w:startOverride w:val="1"/>
     </w:lvlOverride>
     <w:lvlOverride w:ilvl="1">
       <w:startOverride w:val="1"/>
@@ -7731,7 +7479,7 @@
     </w:lvlOverride>
   </w:num>
   <w:num w:numId="42">
-    <w:abstractNumId w:val="23"/>
+    <w:abstractNumId w:val="11"/>
     <w:lvlOverride w:ilvl="0">
       <w:lvl w:ilvl="0">
         <w:start w:val="3"/>
@@ -7764,6 +7512,7 @@
         </w:pPr>
         <w:rPr/>
       </w:lvl>
+      <w:startOverride w:val="1"/>
     </w:lvlOverride>
     <w:lvlOverride w:ilvl="1">
       <w:startOverride w:val="1"/>
@@ -7893,7 +7642,7 @@
     </w:lvlOverride>
   </w:num>
   <w:num w:numId="43">
-    <w:abstractNumId w:val="23"/>
+    <w:abstractNumId w:val="11"/>
     <w:lvlOverride w:ilvl="0">
       <w:lvl w:ilvl="0">
         <w:start w:val="3"/>
@@ -7926,6 +7675,7 @@
         </w:pPr>
         <w:rPr/>
       </w:lvl>
+      <w:startOverride w:val="1"/>
     </w:lvlOverride>
     <w:lvlOverride w:ilvl="1">
       <w:startOverride w:val="1"/>
@@ -8055,7 +7805,7 @@
     </w:lvlOverride>
   </w:num>
   <w:num w:numId="44">
-    <w:abstractNumId w:val="23"/>
+    <w:abstractNumId w:val="11"/>
     <w:lvlOverride w:ilvl="0">
       <w:lvl w:ilvl="0">
         <w:start w:val="3"/>
@@ -8088,6 +7838,7 @@
         </w:pPr>
         <w:rPr/>
       </w:lvl>
+      <w:startOverride w:val="1"/>
     </w:lvlOverride>
     <w:lvlOverride w:ilvl="1">
       <w:startOverride w:val="1"/>
@@ -8217,7 +7968,7 @@
     </w:lvlOverride>
   </w:num>
   <w:num w:numId="45">
-    <w:abstractNumId w:val="23"/>
+    <w:abstractNumId w:val="11"/>
     <w:lvlOverride w:ilvl="0">
       <w:lvl w:ilvl="0">
         <w:start w:val="3"/>
@@ -8250,6 +8001,7 @@
         </w:pPr>
         <w:rPr/>
       </w:lvl>
+      <w:startOverride w:val="1"/>
     </w:lvlOverride>
     <w:lvlOverride w:ilvl="1">
       <w:startOverride w:val="1"/>
@@ -8386,7 +8138,7 @@
   <w:docDefaults>
     <w:rPrDefault>
       <w:rPr>
-        <w:rFonts w:ascii="Calibri" w:hAnsi="Calibri" w:eastAsia="Calibri" w:cs="" w:asciiTheme="minorHAnsi" w:cstheme="minorBidi" w:eastAsiaTheme="minorHAnsi" w:hAnsiTheme="minorHAnsi"/>
+        <w:rFonts w:ascii="Calibri" w:hAnsi="Calibri" w:eastAsia="Calibri" w:cs="DejaVu Sans"/>
         <w:sz w:val="22"/>
         <w:szCs w:val="22"/>
         <w:lang w:val="es-MX" w:eastAsia="en-US" w:bidi="ar-SA"/>
@@ -8398,396 +8150,21 @@
       </w:pPr>
     </w:pPrDefault>
   </w:docDefaults>
-  <w:latentStyles w:defLockedState="0" w:defUIPriority="99" w:defSemiHidden="0" w:defUnhideWhenUsed="0" w:defQFormat="0" w:count="376">
-    <w:lsdException w:name="Normal" w:uiPriority="0" w:qFormat="1"/>
-    <w:lsdException w:name="heading 1" w:uiPriority="9" w:qFormat="1"/>
-    <w:lsdException w:name="heading 2" w:uiPriority="9" w:semiHidden="1" w:unhideWhenUsed="1" w:qFormat="1"/>
-    <w:lsdException w:name="heading 3" w:uiPriority="0" w:semiHidden="1" w:unhideWhenUsed="1" w:qFormat="1"/>
-    <w:lsdException w:name="heading 4" w:uiPriority="9" w:semiHidden="1" w:unhideWhenUsed="1" w:qFormat="1"/>
-    <w:lsdException w:name="heading 5" w:uiPriority="9" w:semiHidden="1" w:unhideWhenUsed="1" w:qFormat="1"/>
-    <w:lsdException w:name="heading 6" w:uiPriority="9" w:semiHidden="1" w:unhideWhenUsed="1" w:qFormat="1"/>
-    <w:lsdException w:name="heading 7" w:uiPriority="9" w:semiHidden="1" w:unhideWhenUsed="1" w:qFormat="1"/>
-    <w:lsdException w:name="heading 8" w:uiPriority="9" w:semiHidden="1" w:unhideWhenUsed="1" w:qFormat="1"/>
-    <w:lsdException w:name="heading 9" w:uiPriority="9" w:semiHidden="1" w:unhideWhenUsed="1" w:qFormat="1"/>
-    <w:lsdException w:name="index 1" w:semiHidden="1" w:unhideWhenUsed="1"/>
-    <w:lsdException w:name="index 2" w:semiHidden="1" w:unhideWhenUsed="1"/>
-    <w:lsdException w:name="index 3" w:semiHidden="1" w:unhideWhenUsed="1"/>
-    <w:lsdException w:name="index 4" w:semiHidden="1" w:unhideWhenUsed="1"/>
-    <w:lsdException w:name="index 5" w:semiHidden="1" w:unhideWhenUsed="1"/>
-    <w:lsdException w:name="index 6" w:semiHidden="1" w:unhideWhenUsed="1"/>
-    <w:lsdException w:name="index 7" w:semiHidden="1" w:unhideWhenUsed="1"/>
-    <w:lsdException w:name="index 8" w:semiHidden="1" w:unhideWhenUsed="1"/>
-    <w:lsdException w:name="index 9" w:semiHidden="1" w:unhideWhenUsed="1"/>
-    <w:lsdException w:name="toc 1" w:uiPriority="39" w:semiHidden="1" w:unhideWhenUsed="1"/>
-    <w:lsdException w:name="toc 2" w:uiPriority="39" w:semiHidden="1" w:unhideWhenUsed="1"/>
-    <w:lsdException w:name="toc 3" w:uiPriority="39" w:semiHidden="1" w:unhideWhenUsed="1"/>
-    <w:lsdException w:name="toc 4" w:uiPriority="39" w:semiHidden="1" w:unhideWhenUsed="1"/>
-    <w:lsdException w:name="toc 5" w:uiPriority="39" w:semiHidden="1" w:unhideWhenUsed="1"/>
-    <w:lsdException w:name="toc 6" w:uiPriority="39" w:semiHidden="1" w:unhideWhenUsed="1"/>
-    <w:lsdException w:name="toc 7" w:uiPriority="39" w:semiHidden="1" w:unhideWhenUsed="1"/>
-    <w:lsdException w:name="toc 8" w:uiPriority="39" w:semiHidden="1" w:unhideWhenUsed="1"/>
-    <w:lsdException w:name="toc 9" w:uiPriority="39" w:semiHidden="1" w:unhideWhenUsed="1"/>
-    <w:lsdException w:name="Normal Indent" w:semiHidden="1" w:unhideWhenUsed="1"/>
-    <w:lsdException w:name="footnote text" w:semiHidden="1" w:unhideWhenUsed="1"/>
-    <w:lsdException w:name="annotation text" w:semiHidden="1" w:unhideWhenUsed="1"/>
-    <w:lsdException w:name="header" w:semiHidden="1" w:unhideWhenUsed="1"/>
-    <w:lsdException w:name="footer" w:semiHidden="1" w:unhideWhenUsed="1"/>
-    <w:lsdException w:name="index heading" w:semiHidden="1" w:unhideWhenUsed="1"/>
-    <w:lsdException w:name="caption" w:uiPriority="35" w:semiHidden="1" w:unhideWhenUsed="1" w:qFormat="1"/>
-    <w:lsdException w:name="table of figures" w:semiHidden="1" w:unhideWhenUsed="1"/>
-    <w:lsdException w:name="envelope address" w:semiHidden="1" w:unhideWhenUsed="1"/>
-    <w:lsdException w:name="envelope return" w:semiHidden="1" w:unhideWhenUsed="1"/>
-    <w:lsdException w:name="footnote reference" w:semiHidden="1" w:unhideWhenUsed="1"/>
-    <w:lsdException w:name="annotation reference" w:semiHidden="1" w:unhideWhenUsed="1"/>
-    <w:lsdException w:name="line number" w:semiHidden="1" w:unhideWhenUsed="1"/>
-    <w:lsdException w:name="page number" w:semiHidden="1" w:unhideWhenUsed="1"/>
-    <w:lsdException w:name="endnote reference" w:semiHidden="1" w:unhideWhenUsed="1"/>
-    <w:lsdException w:name="endnote text" w:semiHidden="1" w:unhideWhenUsed="1"/>
-    <w:lsdException w:name="table of authorities" w:semiHidden="1" w:unhideWhenUsed="1"/>
-    <w:lsdException w:name="macro" w:semiHidden="1" w:unhideWhenUsed="1"/>
-    <w:lsdException w:name="toa heading" w:semiHidden="1" w:unhideWhenUsed="1"/>
-    <w:lsdException w:name="List" w:semiHidden="1" w:unhideWhenUsed="1"/>
-    <w:lsdException w:name="List Bullet" w:semiHidden="1" w:unhideWhenUsed="1"/>
-    <w:lsdException w:name="List Number" w:semiHidden="1" w:unhideWhenUsed="1"/>
-    <w:lsdException w:name="List 2" w:semiHidden="1" w:unhideWhenUsed="1"/>
-    <w:lsdException w:name="List 3" w:semiHidden="1" w:unhideWhenUsed="1"/>
-    <w:lsdException w:name="List 4" w:semiHidden="1" w:unhideWhenUsed="1"/>
-    <w:lsdException w:name="List 5" w:semiHidden="1" w:unhideWhenUsed="1"/>
-    <w:lsdException w:name="List Bullet 2" w:semiHidden="1" w:unhideWhenUsed="1"/>
-    <w:lsdException w:name="List Bullet 3" w:semiHidden="1" w:unhideWhenUsed="1"/>
-    <w:lsdException w:name="List Bullet 4" w:semiHidden="1" w:unhideWhenUsed="1"/>
-    <w:lsdException w:name="List Bullet 5" w:semiHidden="1" w:unhideWhenUsed="1"/>
-    <w:lsdException w:name="List Number 2" w:semiHidden="1" w:unhideWhenUsed="1"/>
-    <w:lsdException w:name="List Number 3" w:semiHidden="1" w:unhideWhenUsed="1"/>
-    <w:lsdException w:name="List Number 4" w:semiHidden="1" w:unhideWhenUsed="1"/>
-    <w:lsdException w:name="List Number 5" w:semiHidden="1" w:unhideWhenUsed="1"/>
-    <w:lsdException w:name="Title" w:uiPriority="10" w:qFormat="1"/>
-    <w:lsdException w:name="Closing" w:semiHidden="1" w:unhideWhenUsed="1"/>
-    <w:lsdException w:name="Signature" w:semiHidden="1" w:unhideWhenUsed="1"/>
-    <w:lsdException w:name="Default Paragraph Font" w:uiPriority="1" w:semiHidden="1" w:unhideWhenUsed="1"/>
-    <w:lsdException w:name="Body Text" w:semiHidden="1" w:unhideWhenUsed="1"/>
-    <w:lsdException w:name="Body Text Indent" w:semiHidden="1" w:unhideWhenUsed="1"/>
-    <w:lsdException w:name="List Continue" w:semiHidden="1" w:unhideWhenUsed="1"/>
-    <w:lsdException w:name="List Continue 2" w:semiHidden="1" w:unhideWhenUsed="1"/>
-    <w:lsdException w:name="List Continue 3" w:semiHidden="1" w:unhideWhenUsed="1"/>
-    <w:lsdException w:name="List Continue 4" w:semiHidden="1" w:unhideWhenUsed="1"/>
-    <w:lsdException w:name="List Continue 5" w:semiHidden="1" w:unhideWhenUsed="1"/>
-    <w:lsdException w:name="Message Header" w:semiHidden="1" w:unhideWhenUsed="1"/>
-    <w:lsdException w:name="Subtitle" w:uiPriority="11" w:qFormat="1"/>
-    <w:lsdException w:name="Salutation" w:semiHidden="1" w:unhideWhenUsed="1"/>
-    <w:lsdException w:name="Date" w:semiHidden="1" w:unhideWhenUsed="1"/>
-    <w:lsdException w:name="Body Text First Indent" w:semiHidden="1" w:unhideWhenUsed="1"/>
-    <w:lsdException w:name="Body Text First Indent 2" w:semiHidden="1" w:unhideWhenUsed="1"/>
-    <w:lsdException w:name="Note Heading" w:semiHidden="1" w:unhideWhenUsed="1"/>
-    <w:lsdException w:name="Body Text 2" w:semiHidden="1" w:unhideWhenUsed="1"/>
-    <w:lsdException w:name="Body Text 3" w:semiHidden="1" w:unhideWhenUsed="1"/>
-    <w:lsdException w:name="Body Text Indent 2" w:semiHidden="1" w:unhideWhenUsed="1"/>
-    <w:lsdException w:name="Body Text Indent 3" w:semiHidden="1" w:unhideWhenUsed="1"/>
-    <w:lsdException w:name="Block Text" w:semiHidden="1" w:unhideWhenUsed="1"/>
-    <w:lsdException w:name="Hyperlink" w:semiHidden="1" w:unhideWhenUsed="1"/>
-    <w:lsdException w:name="FollowedHyperlink" w:semiHidden="1" w:unhideWhenUsed="1"/>
-    <w:lsdException w:name="Strong" w:uiPriority="22" w:qFormat="1"/>
-    <w:lsdException w:name="Emphasis" w:uiPriority="20" w:qFormat="1"/>
-    <w:lsdException w:name="Document Map" w:semiHidden="1" w:unhideWhenUsed="1"/>
-    <w:lsdException w:name="Plain Text" w:semiHidden="1" w:unhideWhenUsed="1"/>
-    <w:lsdException w:name="E-mail Signature" w:semiHidden="1" w:unhideWhenUsed="1"/>
-    <w:lsdException w:name="HTML Top of Form" w:semiHidden="1" w:unhideWhenUsed="1"/>
-    <w:lsdException w:name="HTML Bottom of Form" w:semiHidden="1" w:unhideWhenUsed="1"/>
-    <w:lsdException w:name="Normal (Web)" w:semiHidden="1" w:unhideWhenUsed="1"/>
-    <w:lsdException w:name="HTML Acronym" w:semiHidden="1" w:unhideWhenUsed="1"/>
-    <w:lsdException w:name="HTML Address" w:semiHidden="1" w:unhideWhenUsed="1"/>
-    <w:lsdException w:name="HTML Cite" w:semiHidden="1" w:unhideWhenUsed="1"/>
-    <w:lsdException w:name="HTML Code" w:semiHidden="1" w:unhideWhenUsed="1"/>
-    <w:lsdException w:name="HTML Definition" w:semiHidden="1" w:unhideWhenUsed="1"/>
-    <w:lsdException w:name="HTML Keyboard" w:semiHidden="1" w:unhideWhenUsed="1"/>
-    <w:lsdException w:name="HTML Preformatted" w:semiHidden="1" w:unhideWhenUsed="1"/>
-    <w:lsdException w:name="HTML Sample" w:semiHidden="1" w:unhideWhenUsed="1"/>
-    <w:lsdException w:name="HTML Typewriter" w:semiHidden="1" w:unhideWhenUsed="1"/>
-    <w:lsdException w:name="HTML Variable" w:semiHidden="1" w:unhideWhenUsed="1"/>
-    <w:lsdException w:name="Normal Table" w:semiHidden="1" w:unhideWhenUsed="1"/>
-    <w:lsdException w:name="annotation subject" w:semiHidden="1" w:unhideWhenUsed="1"/>
-    <w:lsdException w:name="No List" w:semiHidden="1" w:unhideWhenUsed="1"/>
-    <w:lsdException w:name="Outline List 1" w:semiHidden="1" w:unhideWhenUsed="1"/>
-    <w:lsdException w:name="Outline List 2" w:semiHidden="1" w:unhideWhenUsed="1"/>
-    <w:lsdException w:name="Outline List 3" w:semiHidden="1" w:unhideWhenUsed="1"/>
-    <w:lsdException w:name="Table Simple 1" w:semiHidden="1" w:unhideWhenUsed="1"/>
-    <w:lsdException w:name="Table Simple 2" w:semiHidden="1" w:unhideWhenUsed="1"/>
-    <w:lsdException w:name="Table Simple 3" w:semiHidden="1" w:unhideWhenUsed="1"/>
-    <w:lsdException w:name="Table Classic 1" w:semiHidden="1" w:unhideWhenUsed="1"/>
-    <w:lsdException w:name="Table Classic 2" w:semiHidden="1" w:unhideWhenUsed="1"/>
-    <w:lsdException w:name="Table Classic 3" w:semiHidden="1" w:unhideWhenUsed="1"/>
-    <w:lsdException w:name="Table Classic 4" w:semiHidden="1" w:unhideWhenUsed="1"/>
-    <w:lsdException w:name="Table Colorful 1" w:semiHidden="1" w:unhideWhenUsed="1"/>
-    <w:lsdException w:name="Table Colorful 2" w:semiHidden="1" w:unhideWhenUsed="1"/>
-    <w:lsdException w:name="Table Colorful 3" w:semiHidden="1" w:unhideWhenUsed="1"/>
-    <w:lsdException w:name="Table Columns 1" w:semiHidden="1" w:unhideWhenUsed="1"/>
-    <w:lsdException w:name="Table Columns 2" w:semiHidden="1" w:unhideWhenUsed="1"/>
-    <w:lsdException w:name="Table Columns 3" w:semiHidden="1" w:unhideWhenUsed="1"/>
-    <w:lsdException w:name="Table Columns 4" w:semiHidden="1" w:unhideWhenUsed="1"/>
-    <w:lsdException w:name="Table Columns 5" w:semiHidden="1" w:unhideWhenUsed="1"/>
-    <w:lsdException w:name="Table Grid 1" w:semiHidden="1" w:unhideWhenUsed="1"/>
-    <w:lsdException w:name="Table Grid 2" w:semiHidden="1" w:unhideWhenUsed="1"/>
-    <w:lsdException w:name="Table Grid 3" w:semiHidden="1" w:unhideWhenUsed="1"/>
-    <w:lsdException w:name="Table Grid 4" w:semiHidden="1" w:unhideWhenUsed="1"/>
-    <w:lsdException w:name="Table Grid 5" w:semiHidden="1" w:unhideWhenUsed="1"/>
-    <w:lsdException w:name="Table Grid 6" w:semiHidden="1" w:unhideWhenUsed="1"/>
-    <w:lsdException w:name="Table Grid 7" w:semiHidden="1" w:unhideWhenUsed="1"/>
-    <w:lsdException w:name="Table Grid 8" w:semiHidden="1" w:unhideWhenUsed="1"/>
-    <w:lsdException w:name="Table List 1" w:semiHidden="1" w:unhideWhenUsed="1"/>
-    <w:lsdException w:name="Table List 2" w:semiHidden="1" w:unhideWhenUsed="1"/>
-    <w:lsdException w:name="Table List 3" w:semiHidden="1" w:unhideWhenUsed="1"/>
-    <w:lsdException w:name="Table List 4" w:semiHidden="1" w:unhideWhenUsed="1"/>
-    <w:lsdException w:name="Table List 5" w:semiHidden="1" w:unhideWhenUsed="1"/>
-    <w:lsdException w:name="Table List 6" w:semiHidden="1" w:unhideWhenUsed="1"/>
-    <w:lsdException w:name="Table List 7" w:semiHidden="1" w:unhideWhenUsed="1"/>
-    <w:lsdException w:name="Table List 8" w:semiHidden="1" w:unhideWhenUsed="1"/>
-    <w:lsdException w:name="Table 3D effects 1" w:semiHidden="1" w:unhideWhenUsed="1"/>
-    <w:lsdException w:name="Table 3D effects 2" w:semiHidden="1" w:unhideWhenUsed="1"/>
-    <w:lsdException w:name="Table 3D effects 3" w:semiHidden="1" w:unhideWhenUsed="1"/>
-    <w:lsdException w:name="Table Contemporary" w:semiHidden="1" w:unhideWhenUsed="1"/>
-    <w:lsdException w:name="Table Elegant" w:semiHidden="1" w:unhideWhenUsed="1"/>
-    <w:lsdException w:name="Table Professional" w:semiHidden="1" w:unhideWhenUsed="1"/>
-    <w:lsdException w:name="Table Subtle 1" w:semiHidden="1" w:unhideWhenUsed="1"/>
-    <w:lsdException w:name="Table Subtle 2" w:semiHidden="1" w:unhideWhenUsed="1"/>
-    <w:lsdException w:name="Table Web 1" w:semiHidden="1" w:unhideWhenUsed="1"/>
-    <w:lsdException w:name="Table Web 2" w:semiHidden="1" w:unhideWhenUsed="1"/>
-    <w:lsdException w:name="Table Web 3" w:semiHidden="1" w:unhideWhenUsed="1"/>
-    <w:lsdException w:name="Balloon Text" w:semiHidden="1" w:unhideWhenUsed="1"/>
-    <w:lsdException w:name="Table Grid" w:uiPriority="39"/>
-    <w:lsdException w:name="Table Theme" w:semiHidden="1" w:unhideWhenUsed="1"/>
-    <w:lsdException w:name="Placeholder Text" w:semiHidden="1"/>
-    <w:lsdException w:name="No Spacing" w:uiPriority="1" w:qFormat="1"/>
-    <w:lsdException w:name="Light Shading" w:uiPriority="60"/>
-    <w:lsdException w:name="Light List" w:uiPriority="61"/>
-    <w:lsdException w:name="Light Grid" w:uiPriority="62"/>
-    <w:lsdException w:name="Medium Shading 1" w:uiPriority="63"/>
-    <w:lsdException w:name="Medium Shading 2" w:uiPriority="64"/>
-    <w:lsdException w:name="Medium List 1" w:uiPriority="65"/>
-    <w:lsdException w:name="Medium List 2" w:uiPriority="66"/>
-    <w:lsdException w:name="Medium Grid 1" w:uiPriority="67"/>
-    <w:lsdException w:name="Medium Grid 2" w:uiPriority="68"/>
-    <w:lsdException w:name="Medium Grid 3" w:uiPriority="69"/>
-    <w:lsdException w:name="Dark List" w:uiPriority="70"/>
-    <w:lsdException w:name="Colorful Shading" w:uiPriority="71"/>
-    <w:lsdException w:name="Colorful List" w:uiPriority="72"/>
-    <w:lsdException w:name="Colorful Grid" w:uiPriority="73"/>
-    <w:lsdException w:name="Light Shading Accent 1" w:uiPriority="60"/>
-    <w:lsdException w:name="Light List Accent 1" w:uiPriority="61"/>
-    <w:lsdException w:name="Light Grid Accent 1" w:uiPriority="62"/>
-    <w:lsdException w:name="Medium Shading 1 Accent 1" w:uiPriority="63"/>
-    <w:lsdException w:name="Medium Shading 2 Accent 1" w:uiPriority="64"/>
-    <w:lsdException w:name="Medium List 1 Accent 1" w:uiPriority="65"/>
-    <w:lsdException w:name="Revision" w:semiHidden="1"/>
-    <w:lsdException w:name="List Paragraph" w:uiPriority="34" w:qFormat="1"/>
-    <w:lsdException w:name="Quote" w:uiPriority="29" w:qFormat="1"/>
-    <w:lsdException w:name="Intense Quote" w:uiPriority="30" w:qFormat="1"/>
-    <w:lsdException w:name="Medium List 2 Accent 1" w:uiPriority="66"/>
-    <w:lsdException w:name="Medium Grid 1 Accent 1" w:uiPriority="67"/>
-    <w:lsdException w:name="Medium Grid 2 Accent 1" w:uiPriority="68"/>
-    <w:lsdException w:name="Medium Grid 3 Accent 1" w:uiPriority="69"/>
-    <w:lsdException w:name="Dark List Accent 1" w:uiPriority="70"/>
-    <w:lsdException w:name="Colorful Shading Accent 1" w:uiPriority="71"/>
-    <w:lsdException w:name="Colorful List Accent 1" w:uiPriority="72"/>
-    <w:lsdException w:name="Colorful Grid Accent 1" w:uiPriority="73"/>
-    <w:lsdException w:name="Light Shading Accent 2" w:uiPriority="60"/>
-    <w:lsdException w:name="Light List Accent 2" w:uiPriority="61"/>
-    <w:lsdException w:name="Light Grid Accent 2" w:uiPriority="62"/>
-    <w:lsdException w:name="Medium Shading 1 Accent 2" w:uiPriority="63"/>
-    <w:lsdException w:name="Medium Shading 2 Accent 2" w:uiPriority="64"/>
-    <w:lsdException w:name="Medium List 1 Accent 2" w:uiPriority="65"/>
-    <w:lsdException w:name="Medium List 2 Accent 2" w:uiPriority="66"/>
-    <w:lsdException w:name="Medium Grid 1 Accent 2" w:uiPriority="67"/>
-    <w:lsdException w:name="Medium Grid 2 Accent 2" w:uiPriority="68"/>
-    <w:lsdException w:name="Medium Grid 3 Accent 2" w:uiPriority="69"/>
-    <w:lsdException w:name="Dark List Accent 2" w:uiPriority="70"/>
-    <w:lsdException w:name="Colorful Shading Accent 2" w:uiPriority="71"/>
-    <w:lsdException w:name="Colorful List Accent 2" w:uiPriority="72"/>
-    <w:lsdException w:name="Colorful Grid Accent 2" w:uiPriority="73"/>
-    <w:lsdException w:name="Light Shading Accent 3" w:uiPriority="60"/>
-    <w:lsdException w:name="Light List Accent 3" w:uiPriority="61"/>
-    <w:lsdException w:name="Light Grid Accent 3" w:uiPriority="62"/>
-    <w:lsdException w:name="Medium Shading 1 Accent 3" w:uiPriority="63"/>
-    <w:lsdException w:name="Medium Shading 2 Accent 3" w:uiPriority="64"/>
-    <w:lsdException w:name="Medium List 1 Accent 3" w:uiPriority="65"/>
-    <w:lsdException w:name="Medium List 2 Accent 3" w:uiPriority="66"/>
-    <w:lsdException w:name="Medium Grid 1 Accent 3" w:uiPriority="67"/>
-    <w:lsdException w:name="Medium Grid 2 Accent 3" w:uiPriority="68"/>
-    <w:lsdException w:name="Medium Grid 3 Accent 3" w:uiPriority="69"/>
-    <w:lsdException w:name="Dark List Accent 3" w:uiPriority="70"/>
-    <w:lsdException w:name="Colorful Shading Accent 3" w:uiPriority="71"/>
-    <w:lsdException w:name="Colorful List Accent 3" w:uiPriority="72"/>
-    <w:lsdException w:name="Colorful Grid Accent 3" w:uiPriority="73"/>
-    <w:lsdException w:name="Light Shading Accent 4" w:uiPriority="60"/>
-    <w:lsdException w:name="Light List Accent 4" w:uiPriority="61"/>
-    <w:lsdException w:name="Light Grid Accent 4" w:uiPriority="62"/>
-    <w:lsdException w:name="Medium Shading 1 Accent 4" w:uiPriority="63"/>
-    <w:lsdException w:name="Medium Shading 2 Accent 4" w:uiPriority="64"/>
-    <w:lsdException w:name="Medium List 1 Accent 4" w:uiPriority="65"/>
-    <w:lsdException w:name="Medium List 2 Accent 4" w:uiPriority="66"/>
-    <w:lsdException w:name="Medium Grid 1 Accent 4" w:uiPriority="67"/>
-    <w:lsdException w:name="Medium Grid 2 Accent 4" w:uiPriority="68"/>
-    <w:lsdException w:name="Medium Grid 3 Accent 4" w:uiPriority="69"/>
-    <w:lsdException w:name="Dark List Accent 4" w:uiPriority="70"/>
-    <w:lsdException w:name="Colorful Shading Accent 4" w:uiPriority="71"/>
-    <w:lsdException w:name="Colorful List Accent 4" w:uiPriority="72"/>
-    <w:lsdException w:name="Colorful Grid Accent 4" w:uiPriority="73"/>
-    <w:lsdException w:name="Light Shading Accent 5" w:uiPriority="60"/>
-    <w:lsdException w:name="Light List Accent 5" w:uiPriority="61"/>
-    <w:lsdException w:name="Light Grid Accent 5" w:uiPriority="62"/>
-    <w:lsdException w:name="Medium Shading 1 Accent 5" w:uiPriority="63"/>
-    <w:lsdException w:name="Medium Shading 2 Accent 5" w:uiPriority="64"/>
-    <w:lsdException w:name="Medium List 1 Accent 5" w:uiPriority="65"/>
-    <w:lsdException w:name="Medium List 2 Accent 5" w:uiPriority="66"/>
-    <w:lsdException w:name="Medium Grid 1 Accent 5" w:uiPriority="67"/>
-    <w:lsdException w:name="Medium Grid 2 Accent 5" w:uiPriority="68"/>
-    <w:lsdException w:name="Medium Grid 3 Accent 5" w:uiPriority="69"/>
-    <w:lsdException w:name="Dark List Accent 5" w:uiPriority="70"/>
-    <w:lsdException w:name="Colorful Shading Accent 5" w:uiPriority="71"/>
-    <w:lsdException w:name="Colorful List Accent 5" w:uiPriority="72"/>
-    <w:lsdException w:name="Colorful Grid Accent 5" w:uiPriority="73"/>
-    <w:lsdException w:name="Light Shading Accent 6" w:uiPriority="60"/>
-    <w:lsdException w:name="Light List Accent 6" w:uiPriority="61"/>
-    <w:lsdException w:name="Light Grid Accent 6" w:uiPriority="62"/>
-    <w:lsdException w:name="Medium Shading 1 Accent 6" w:uiPriority="63"/>
-    <w:lsdException w:name="Medium Shading 2 Accent 6" w:uiPriority="64"/>
-    <w:lsdException w:name="Medium List 1 Accent 6" w:uiPriority="65"/>
-    <w:lsdException w:name="Medium List 2 Accent 6" w:uiPriority="66"/>
-    <w:lsdException w:name="Medium Grid 1 Accent 6" w:uiPriority="67"/>
-    <w:lsdException w:name="Medium Grid 2 Accent 6" w:uiPriority="68"/>
-    <w:lsdException w:name="Medium Grid 3 Accent 6" w:uiPriority="69"/>
-    <w:lsdException w:name="Dark List Accent 6" w:uiPriority="70"/>
-    <w:lsdException w:name="Colorful Shading Accent 6" w:uiPriority="71"/>
-    <w:lsdException w:name="Colorful List Accent 6" w:uiPriority="72"/>
-    <w:lsdException w:name="Colorful Grid Accent 6" w:uiPriority="73"/>
-    <w:lsdException w:name="Subtle Emphasis" w:uiPriority="19" w:qFormat="1"/>
-    <w:lsdException w:name="Intense Emphasis" w:uiPriority="21" w:qFormat="1"/>
-    <w:lsdException w:name="Subtle Reference" w:uiPriority="31" w:qFormat="1"/>
-    <w:lsdException w:name="Intense Reference" w:uiPriority="32" w:qFormat="1"/>
-    <w:lsdException w:name="Book Title" w:uiPriority="33" w:qFormat="1"/>
-    <w:lsdException w:name="Bibliography" w:uiPriority="37" w:semiHidden="1" w:unhideWhenUsed="1"/>
-    <w:lsdException w:name="TOC Heading" w:uiPriority="39" w:semiHidden="1" w:unhideWhenUsed="1" w:qFormat="1"/>
-    <w:lsdException w:name="Plain Table 1" w:uiPriority="41"/>
-    <w:lsdException w:name="Plain Table 2" w:uiPriority="42"/>
-    <w:lsdException w:name="Plain Table 3" w:uiPriority="43"/>
-    <w:lsdException w:name="Plain Table 4" w:uiPriority="44"/>
-    <w:lsdException w:name="Plain Table 5" w:uiPriority="45"/>
-    <w:lsdException w:name="Grid Table Light" w:uiPriority="40"/>
-    <w:lsdException w:name="Grid Table 1 Light" w:uiPriority="46"/>
-    <w:lsdException w:name="Grid Table 2" w:uiPriority="47"/>
-    <w:lsdException w:name="Grid Table 3" w:uiPriority="48"/>
-    <w:lsdException w:name="Grid Table 4" w:uiPriority="49"/>
-    <w:lsdException w:name="Grid Table 5 Dark" w:uiPriority="50"/>
-    <w:lsdException w:name="Grid Table 6 Colorful" w:uiPriority="51"/>
-    <w:lsdException w:name="Grid Table 7 Colorful" w:uiPriority="52"/>
-    <w:lsdException w:name="Grid Table 1 Light Accent 1" w:uiPriority="46"/>
-    <w:lsdException w:name="Grid Table 2 Accent 1" w:uiPriority="47"/>
-    <w:lsdException w:name="Grid Table 3 Accent 1" w:uiPriority="48"/>
-    <w:lsdException w:name="Grid Table 4 Accent 1" w:uiPriority="49"/>
-    <w:lsdException w:name="Grid Table 5 Dark Accent 1" w:uiPriority="50"/>
-    <w:lsdException w:name="Grid Table 6 Colorful Accent 1" w:uiPriority="51"/>
-    <w:lsdException w:name="Grid Table 7 Colorful Accent 1" w:uiPriority="52"/>
-    <w:lsdException w:name="Grid Table 1 Light Accent 2" w:uiPriority="46"/>
-    <w:lsdException w:name="Grid Table 2 Accent 2" w:uiPriority="47"/>
-    <w:lsdException w:name="Grid Table 3 Accent 2" w:uiPriority="48"/>
-    <w:lsdException w:name="Grid Table 4 Accent 2" w:uiPriority="49"/>
-    <w:lsdException w:name="Grid Table 5 Dark Accent 2" w:uiPriority="50"/>
-    <w:lsdException w:name="Grid Table 6 Colorful Accent 2" w:uiPriority="51"/>
-    <w:lsdException w:name="Grid Table 7 Colorful Accent 2" w:uiPriority="52"/>
-    <w:lsdException w:name="Grid Table 1 Light Accent 3" w:uiPriority="46"/>
-    <w:lsdException w:name="Grid Table 2 Accent 3" w:uiPriority="47"/>
-    <w:lsdException w:name="Grid Table 3 Accent 3" w:uiPriority="48"/>
-    <w:lsdException w:name="Grid Table 4 Accent 3" w:uiPriority="49"/>
-    <w:lsdException w:name="Grid Table 5 Dark Accent 3" w:uiPriority="50"/>
-    <w:lsdException w:name="Grid Table 6 Colorful Accent 3" w:uiPriority="51"/>
-    <w:lsdException w:name="Grid Table 7 Colorful Accent 3" w:uiPriority="52"/>
-    <w:lsdException w:name="Grid Table 1 Light Accent 4" w:uiPriority="46"/>
-    <w:lsdException w:name="Grid Table 2 Accent 4" w:uiPriority="47"/>
-    <w:lsdException w:name="Grid Table 3 Accent 4" w:uiPriority="48"/>
-    <w:lsdException w:name="Grid Table 4 Accent 4" w:uiPriority="49"/>
-    <w:lsdException w:name="Grid Table 5 Dark Accent 4" w:uiPriority="50"/>
-    <w:lsdException w:name="Grid Table 6 Colorful Accent 4" w:uiPriority="51"/>
-    <w:lsdException w:name="Grid Table 7 Colorful Accent 4" w:uiPriority="52"/>
-    <w:lsdException w:name="Grid Table 1 Light Accent 5" w:uiPriority="46"/>
-    <w:lsdException w:name="Grid Table 2 Accent 5" w:uiPriority="47"/>
-    <w:lsdException w:name="Grid Table 3 Accent 5" w:uiPriority="48"/>
-    <w:lsdException w:name="Grid Table 4 Accent 5" w:uiPriority="49"/>
-    <w:lsdException w:name="Grid Table 5 Dark Accent 5" w:uiPriority="50"/>
-    <w:lsdException w:name="Grid Table 6 Colorful Accent 5" w:uiPriority="51"/>
-    <w:lsdException w:name="Grid Table 7 Colorful Accent 5" w:uiPriority="52"/>
-    <w:lsdException w:name="Grid Table 1 Light Accent 6" w:uiPriority="46"/>
-    <w:lsdException w:name="Grid Table 2 Accent 6" w:uiPriority="47"/>
-    <w:lsdException w:name="Grid Table 3 Accent 6" w:uiPriority="48"/>
-    <w:lsdException w:name="Grid Table 4 Accent 6" w:uiPriority="49"/>
-    <w:lsdException w:name="Grid Table 5 Dark Accent 6" w:uiPriority="50"/>
-    <w:lsdException w:name="Grid Table 6 Colorful Accent 6" w:uiPriority="51"/>
-    <w:lsdException w:name="Grid Table 7 Colorful Accent 6" w:uiPriority="52"/>
-    <w:lsdException w:name="List Table 1 Light" w:uiPriority="46"/>
-    <w:lsdException w:name="List Table 2" w:uiPriority="47"/>
-    <w:lsdException w:name="List Table 3" w:uiPriority="48"/>
-    <w:lsdException w:name="List Table 4" w:uiPriority="49"/>
-    <w:lsdException w:name="List Table 5 Dark" w:uiPriority="50"/>
-    <w:lsdException w:name="List Table 6 Colorful" w:uiPriority="51"/>
-    <w:lsdException w:name="List Table 7 Colorful" w:uiPriority="52"/>
-    <w:lsdException w:name="List Table 1 Light Accent 1" w:uiPriority="46"/>
-    <w:lsdException w:name="List Table 2 Accent 1" w:uiPriority="47"/>
-    <w:lsdException w:name="List Table 3 Accent 1" w:uiPriority="48"/>
-    <w:lsdException w:name="List Table 4 Accent 1" w:uiPriority="49"/>
-    <w:lsdException w:name="List Table 5 Dark Accent 1" w:uiPriority="50"/>
-    <w:lsdException w:name="List Table 6 Colorful Accent 1" w:uiPriority="51"/>
-    <w:lsdException w:name="List Table 7 Colorful Accent 1" w:uiPriority="52"/>
-    <w:lsdException w:name="List Table 1 Light Accent 2" w:uiPriority="46"/>
-    <w:lsdException w:name="List Table 2 Accent 2" w:uiPriority="47"/>
-    <w:lsdException w:name="List Table 3 Accent 2" w:uiPriority="48"/>
-    <w:lsdException w:name="List Table 4 Accent 2" w:uiPriority="49"/>
-    <w:lsdException w:name="List Table 5 Dark Accent 2" w:uiPriority="50"/>
-    <w:lsdException w:name="List Table 6 Colorful Accent 2" w:uiPriority="51"/>
-    <w:lsdException w:name="List Table 7 Colorful Accent 2" w:uiPriority="52"/>
-    <w:lsdException w:name="List Table 1 Light Accent 3" w:uiPriority="46"/>
-    <w:lsdException w:name="List Table 2 Accent 3" w:uiPriority="47"/>
-    <w:lsdException w:name="List Table 3 Accent 3" w:uiPriority="48"/>
-    <w:lsdException w:name="List Table 4 Accent 3" w:uiPriority="49"/>
-    <w:lsdException w:name="List Table 5 Dark Accent 3" w:uiPriority="50"/>
-    <w:lsdException w:name="List Table 6 Colorful Accent 3" w:uiPriority="51"/>
-    <w:lsdException w:name="List Table 7 Colorful Accent 3" w:uiPriority="52"/>
-    <w:lsdException w:name="List Table 1 Light Accent 4" w:uiPriority="46"/>
-    <w:lsdException w:name="List Table 2 Accent 4" w:uiPriority="47"/>
-    <w:lsdException w:name="List Table 3 Accent 4" w:uiPriority="48"/>
-    <w:lsdException w:name="List Table 4 Accent 4" w:uiPriority="49"/>
-    <w:lsdException w:name="List Table 5 Dark Accent 4" w:uiPriority="50"/>
-    <w:lsdException w:name="List Table 6 Colorful Accent 4" w:uiPriority="51"/>
-    <w:lsdException w:name="List Table 7 Colorful Accent 4" w:uiPriority="52"/>
-    <w:lsdException w:name="List Table 1 Light Accent 5" w:uiPriority="46"/>
-    <w:lsdException w:name="List Table 2 Accent 5" w:uiPriority="47"/>
-    <w:lsdException w:name="List Table 3 Accent 5" w:uiPriority="48"/>
-    <w:lsdException w:name="List Table 4 Accent 5" w:uiPriority="49"/>
-    <w:lsdException w:name="List Table 5 Dark Accent 5" w:uiPriority="50"/>
-    <w:lsdException w:name="List Table 6 Colorful Accent 5" w:uiPriority="51"/>
-    <w:lsdException w:name="List Table 7 Colorful Accent 5" w:uiPriority="52"/>
-    <w:lsdException w:name="List Table 1 Light Accent 6" w:uiPriority="46"/>
-    <w:lsdException w:name="List Table 2 Accent 6" w:uiPriority="47"/>
-    <w:lsdException w:name="List Table 3 Accent 6" w:uiPriority="48"/>
-    <w:lsdException w:name="List Table 4 Accent 6" w:uiPriority="49"/>
-    <w:lsdException w:name="List Table 5 Dark Accent 6" w:uiPriority="50"/>
-    <w:lsdException w:name="List Table 6 Colorful Accent 6" w:uiPriority="51"/>
-    <w:lsdException w:name="List Table 7 Colorful Accent 6" w:uiPriority="52"/>
-    <w:lsdException w:name="Mention" w:semiHidden="1" w:unhideWhenUsed="1"/>
-    <w:lsdException w:name="Smart Hyperlink" w:semiHidden="1" w:unhideWhenUsed="1"/>
-    <w:lsdException w:name="Hashtag" w:semiHidden="1" w:unhideWhenUsed="1"/>
-    <w:lsdException w:name="Unresolved Mention" w:semiHidden="1" w:unhideWhenUsed="1"/>
-    <w:lsdException w:name="Smart Link" w:semiHidden="1" w:unhideWhenUsed="1"/>
-  </w:latentStyles>
-  <w:style w:type="paragraph" w:styleId="Normal" w:default="1">
+  <w:style w:type="paragraph" w:styleId="Normal">
     <w:name w:val="Normal"/>
     <w:qFormat/>
-    <w:rsid w:val="00496891"/>
     <w:pPr>
       <w:widowControl/>
+      <w:suppressAutoHyphens w:val="true"/>
+      <w:kinsoku w:val="true"/>
+      <w:overflowPunct w:val="true"/>
+      <w:autoSpaceDE w:val="true"/>
       <w:bidi w:val="0"/>
       <w:spacing w:lineRule="auto" w:line="259" w:before="0" w:after="160"/>
       <w:jc w:val="left"/>
     </w:pPr>
     <w:rPr>
-      <w:rFonts w:ascii="Calibri" w:hAnsi="Calibri" w:eastAsia="Calibri" w:cs="" w:asciiTheme="minorHAnsi" w:cstheme="minorBidi" w:eastAsiaTheme="minorHAnsi" w:hAnsiTheme="minorHAnsi"/>
+      <w:rFonts w:ascii="Calibri" w:hAnsi="Calibri" w:eastAsia="Calibri" w:cs="DejaVu Sans"/>
       <w:color w:val="auto"/>
       <w:kern w:val="0"/>
       <w:sz w:val="22"/>
@@ -8800,17 +8177,19 @@
     <w:basedOn w:val="Normal"/>
     <w:next w:val="Normal"/>
     <w:link w:val="Ttulo1Car"/>
-    <w:uiPriority w:val="9"/>
     <w:qFormat/>
-    <w:rsid w:val="00496891"/>
     <w:pPr>
       <w:keepNext w:val="true"/>
       <w:keepLines/>
+      <w:numPr>
+        <w:ilvl w:val="0"/>
+        <w:numId w:val="0"/>
+      </w:numPr>
       <w:spacing w:before="240" w:after="0"/>
       <w:outlineLvl w:val="0"/>
     </w:pPr>
     <w:rPr>
-      <w:rFonts w:ascii="Calibri Light" w:hAnsi="Calibri Light" w:eastAsia="" w:cs="" w:asciiTheme="majorHAnsi" w:cstheme="majorBidi" w:eastAsiaTheme="majorEastAsia" w:hAnsiTheme="majorHAnsi"/>
+      <w:rFonts w:ascii="Calibri Light" w:hAnsi="Calibri Light" w:eastAsia="Calibri" w:cs="DejaVu Sans"/>
       <w:color w:themeColor="accent1" w:themeShade="bf" w:val="2E74B5"/>
       <w:sz w:val="32"/>
       <w:szCs w:val="32"/>
@@ -8821,11 +8200,13 @@
     <w:basedOn w:val="Heading1"/>
     <w:next w:val="Heading1"/>
     <w:link w:val="Ttulo3Car"/>
-    <w:unhideWhenUsed/>
     <w:qFormat/>
-    <w:rsid w:val="00496891"/>
     <w:pPr>
-      <w:spacing w:lineRule="auto" w:line="240" w:beforeAutospacing="1" w:afterAutospacing="1"/>
+      <w:numPr>
+        <w:ilvl w:val="0"/>
+        <w:numId w:val="0"/>
+      </w:numPr>
+      <w:spacing w:lineRule="auto" w:line="240" w:before="280" w:after="280"/>
       <w:outlineLvl w:val="2"/>
     </w:pPr>
     <w:rPr>
@@ -8840,22 +8221,18 @@
       <w:lang w:eastAsia="es-MX"/>
     </w:rPr>
   </w:style>
-  <w:style w:type="character" w:styleId="DefaultParagraphFont" w:default="1">
+  <w:style w:type="character" w:styleId="DefaultParagraphFont">
     <w:name w:val="Default Paragraph Font"/>
-    <w:uiPriority w:val="1"/>
-    <w:semiHidden/>
-    <w:unhideWhenUsed/>
     <w:qFormat/>
     <w:rPr/>
   </w:style>
-  <w:style w:type="character" w:styleId="Ttulo3Car" w:customStyle="1">
+  <w:style w:type="character" w:styleId="Ttulo3Car">
     <w:name w:val="Título 3 Car"/>
     <w:basedOn w:val="DefaultParagraphFont"/>
     <w:link w:val="Heading3"/>
     <w:qFormat/>
-    <w:rsid w:val="00496891"/>
     <w:rPr>
-      <w:rFonts w:ascii="Arial" w:hAnsi="Arial" w:eastAsia="" w:cs="" w:cstheme="majorBidi" w:eastAsiaTheme="majorEastAsia"/>
+      <w:rFonts w:ascii="Arial" w:hAnsi="Arial" w:eastAsia="Calibri" w:cs="DejaVu Sans"/>
       <w:b/>
       <w:bCs/>
       <w:i/>
@@ -8865,36 +8242,30 @@
       <w:lang w:eastAsia="es-MX"/>
     </w:rPr>
   </w:style>
-  <w:style w:type="character" w:styleId="Ttulo1Car" w:customStyle="1">
+  <w:style w:type="character" w:styleId="Ttulo1Car">
     <w:name w:val="Título 1 Car"/>
     <w:basedOn w:val="DefaultParagraphFont"/>
     <w:link w:val="Heading1"/>
-    <w:uiPriority w:val="9"/>
     <w:qFormat/>
-    <w:rsid w:val="00496891"/>
     <w:rPr>
-      <w:rFonts w:ascii="Calibri Light" w:hAnsi="Calibri Light" w:eastAsia="" w:cs="" w:asciiTheme="majorHAnsi" w:cstheme="majorBidi" w:eastAsiaTheme="majorEastAsia" w:hAnsiTheme="majorHAnsi"/>
+      <w:rFonts w:ascii="Calibri Light" w:hAnsi="Calibri Light" w:eastAsia="Calibri" w:cs="DejaVu Sans"/>
       <w:color w:themeColor="accent1" w:themeShade="bf" w:val="2E74B5"/>
       <w:sz w:val="32"/>
       <w:szCs w:val="32"/>
     </w:rPr>
   </w:style>
-  <w:style w:type="character" w:styleId="EncabezadoCar" w:customStyle="1">
+  <w:style w:type="character" w:styleId="EncabezadoCar">
     <w:name w:val="Encabezado Car"/>
     <w:basedOn w:val="DefaultParagraphFont"/>
     <w:link w:val="Header"/>
-    <w:uiPriority w:val="99"/>
     <w:qFormat/>
-    <w:rsid w:val="005b7611"/>
     <w:rPr/>
   </w:style>
-  <w:style w:type="character" w:styleId="PiedepginaCar" w:customStyle="1">
+  <w:style w:type="character" w:styleId="PiedepginaCar">
     <w:name w:val="Pie de página Car"/>
     <w:basedOn w:val="DefaultParagraphFont"/>
     <w:link w:val="Footer"/>
-    <w:uiPriority w:val="99"/>
     <w:qFormat/>
-    <w:rsid w:val="005b7611"/>
     <w:rPr/>
   </w:style>
   <w:style w:type="paragraph" w:styleId="Heading">
@@ -8966,9 +8337,6 @@
     <w:name w:val="header"/>
     <w:basedOn w:val="Normal"/>
     <w:link w:val="EncabezadoCar"/>
-    <w:uiPriority w:val="99"/>
-    <w:unhideWhenUsed/>
-    <w:rsid w:val="005b7611"/>
     <w:pPr>
       <w:tabs>
         <w:tab w:val="clear" w:pos="708"/>
@@ -8983,9 +8351,6 @@
     <w:name w:val="footer"/>
     <w:basedOn w:val="Normal"/>
     <w:link w:val="PiedepginaCar"/>
-    <w:uiPriority w:val="99"/>
-    <w:unhideWhenUsed/>
-    <w:rsid w:val="005b7611"/>
     <w:pPr>
       <w:tabs>
         <w:tab w:val="clear" w:pos="708"/>
@@ -8999,9 +8364,7 @@
   <w:style w:type="paragraph" w:styleId="ListParagraph">
     <w:name w:val="List Paragraph"/>
     <w:basedOn w:val="Normal"/>
-    <w:uiPriority w:val="34"/>
     <w:qFormat/>
-    <w:rsid w:val="005b7611"/>
     <w:pPr>
       <w:spacing w:before="0" w:after="160"/>
       <w:ind w:left="720"/>
@@ -9012,15 +8375,12 @@
   <w:style w:type="paragraph" w:styleId="NormalWeb">
     <w:name w:val="Normal (Web)"/>
     <w:basedOn w:val="Normal"/>
-    <w:uiPriority w:val="99"/>
-    <w:unhideWhenUsed/>
     <w:qFormat/>
-    <w:rsid w:val="00584015"/>
     <w:pPr>
-      <w:spacing w:lineRule="auto" w:line="240" w:beforeAutospacing="1" w:afterAutospacing="1"/>
+      <w:spacing w:lineRule="auto" w:line="240" w:before="280" w:after="280"/>
     </w:pPr>
     <w:rPr>
-      <w:rFonts w:ascii="Times" w:hAnsi="Times" w:eastAsia="" w:cs="Times New Roman" w:eastAsiaTheme="minorEastAsia"/>
+      <w:rFonts w:ascii="Times" w:hAnsi="Times" w:eastAsia="Calibri" w:cs="Times New Roman"/>
       <w:sz w:val="20"/>
       <w:szCs w:val="20"/>
       <w:lang w:eastAsia="es-ES"/>
@@ -9033,26 +8393,26 @@
     <w:pPr/>
     <w:rPr/>
   </w:style>
-  <w:style w:type="numbering" w:styleId="NoList" w:default="1">
+  <w:style w:type="paragraph" w:styleId="FrameContentsuser">
+    <w:name w:val="Frame Contents (user)"/>
+    <w:basedOn w:val="Normal"/>
+    <w:qFormat/>
+    <w:pPr/>
+    <w:rPr/>
+  </w:style>
+  <w:style w:type="paragraph" w:styleId="TableContents">
+    <w:name w:val="Table Contents"/>
+    <w:basedOn w:val="Normal"/>
+    <w:qFormat/>
+    <w:pPr>
+      <w:widowControl w:val="false"/>
+      <w:suppressLineNumbers/>
+    </w:pPr>
+    <w:rPr/>
+  </w:style>
+  <w:style w:type="numbering" w:styleId="NoList">
     <w:name w:val="No List"/>
-    <w:uiPriority w:val="99"/>
-    <w:semiHidden/>
-    <w:unhideWhenUsed/>
     <w:qFormat/>
-  </w:style>
-  <w:style w:type="table" w:default="1" w:styleId="Tablanormal">
-    <w:name w:val="Normal Table"/>
-    <w:uiPriority w:val="99"/>
-    <w:semiHidden/>
-    <w:unhideWhenUsed/>
-    <w:tblPr>
-      <w:tblCellMar>
-        <w:top w:w="0" w:type="dxa"/>
-        <w:left w:w="108" w:type="dxa"/>
-        <w:bottom w:w="0" w:type="dxa"/>
-        <w:right w:w="108" w:type="dxa"/>
-      </w:tblCellMar>
-    </w:tblPr>
   </w:style>
 </w:styles>
 </file>
@@ -9100,14 +8460,14 @@
     </a:clrScheme>
     <a:fontScheme name="Office">
       <a:majorFont>
-        <a:latin typeface="Calibri Light" panose="020F0302020204030204" pitchFamily="0" charset="1"/>
-        <a:ea typeface=""/>
-        <a:cs typeface=""/>
+        <a:latin typeface="Arial" pitchFamily="0" charset="1"/>
+        <a:ea typeface="DejaVu Sans" pitchFamily="0" charset="1"/>
+        <a:cs typeface="DejaVu Sans" pitchFamily="0" charset="1"/>
       </a:majorFont>
       <a:minorFont>
-        <a:latin typeface="Calibri" panose="020F0502020204030204" pitchFamily="0" charset="1"/>
-        <a:ea typeface=""/>
-        <a:cs typeface=""/>
+        <a:latin typeface="Arial" pitchFamily="0" charset="1"/>
+        <a:ea typeface="DejaVu Sans" pitchFamily="0" charset="1"/>
+        <a:cs typeface="DejaVu Sans" pitchFamily="0" charset="1"/>
       </a:minorFont>
     </a:fontScheme>
     <a:fmtScheme>
@@ -9115,67 +8475,25 @@
         <a:solidFill>
           <a:schemeClr val="phClr"/>
         </a:solidFill>
-        <a:gradFill>
-          <a:gsLst>
-            <a:gs pos="0">
-              <a:schemeClr val="phClr">
-                <a:lumMod val="110000"/>
-                <a:tint val="67000"/>
-              </a:schemeClr>
-            </a:gs>
-            <a:gs pos="50000">
-              <a:schemeClr val="phClr">
-                <a:lumMod val="105000"/>
-                <a:tint val="73000"/>
-              </a:schemeClr>
-            </a:gs>
-            <a:gs pos="100000">
-              <a:schemeClr val="phClr">
-                <a:lumMod val="105000"/>
-                <a:tint val="81000"/>
-              </a:schemeClr>
-            </a:gs>
-          </a:gsLst>
-          <a:lin ang="5400000" scaled="0"/>
-          <a:tileRect l="0" t="0" r="0" b="0"/>
-        </a:gradFill>
-        <a:gradFill>
-          <a:gsLst>
-            <a:gs pos="0">
-              <a:schemeClr val="phClr">
-                <a:lumMod val="102000"/>
-                <a:tint val="94000"/>
-              </a:schemeClr>
-            </a:gs>
-            <a:gs pos="50000">
-              <a:schemeClr val="phClr">
-                <a:lumMod val="100000"/>
-                <a:shade val="100000"/>
-              </a:schemeClr>
-            </a:gs>
-            <a:gs pos="100000">
-              <a:schemeClr val="phClr">
-                <a:lumMod val="99000"/>
-                <a:shade val="78000"/>
-              </a:schemeClr>
-            </a:gs>
-          </a:gsLst>
-          <a:lin ang="5400000" scaled="0"/>
-          <a:tileRect l="0" t="0" r="0" b="0"/>
-        </a:gradFill>
+        <a:solidFill>
+          <a:schemeClr val="phClr"/>
+        </a:solidFill>
+        <a:solidFill>
+          <a:schemeClr val="phClr"/>
+        </a:solidFill>
       </a:fillStyleLst>
       <a:lnStyleLst>
         <a:ln w="6350" cap="flat" cmpd="sng" algn="ctr">
           <a:prstDash val="solid"/>
-          <a:miter lim="800000"/>
+          <a:miter/>
         </a:ln>
-        <a:ln w="12700" cap="flat" cmpd="sng" algn="ctr">
+        <a:ln w="6350" cap="flat" cmpd="sng" algn="ctr">
           <a:prstDash val="solid"/>
-          <a:miter lim="800000"/>
+          <a:miter/>
         </a:ln>
-        <a:ln w="19050" cap="flat" cmpd="sng" algn="ctr">
+        <a:ln w="6350" cap="flat" cmpd="sng" algn="ctr">
           <a:prstDash val="solid"/>
-          <a:miter lim="800000"/>
+          <a:miter/>
         </a:ln>
       </a:lnStyleLst>
       <a:effectStyleLst>
@@ -9194,49 +8512,13 @@
           <a:schemeClr val="phClr"/>
         </a:solidFill>
         <a:solidFill>
-          <a:schemeClr val="phClr">
-            <a:tint val="95000"/>
-          </a:schemeClr>
+          <a:schemeClr val="phClr"/>
         </a:solidFill>
-        <a:gradFill>
-          <a:gsLst>
-            <a:gs pos="0">
-              <a:schemeClr val="phClr">
-                <a:tint val="93000"/>
-                <a:shade val="98000"/>
-                <a:lumMod val="102000"/>
-              </a:schemeClr>
-            </a:gs>
-            <a:gs pos="50000">
-              <a:schemeClr val="phClr">
-                <a:tint val="98000"/>
-                <a:shade val="90000"/>
-                <a:lumMod val="103000"/>
-              </a:schemeClr>
-            </a:gs>
-            <a:gs pos="100000">
-              <a:schemeClr val="phClr">
-                <a:shade val="63000"/>
-              </a:schemeClr>
-            </a:gs>
-          </a:gsLst>
-          <a:lin ang="5400000" scaled="0"/>
-          <a:tileRect l="0" t="0" r="0" b="0"/>
-        </a:gradFill>
+        <a:solidFill>
+          <a:schemeClr val="phClr"/>
+        </a:solidFill>
       </a:bgFillStyleLst>
     </a:fmtScheme>
   </a:themeElements>
 </a:theme>
-</file>
-
-<file path=customXml/item1.xml><?xml version="1.0" encoding="utf-8"?>
-<b:Sources xmlns:b="http://schemas.openxmlformats.org/officeDocument/2006/bibliography" xmlns="http://schemas.openxmlformats.org/officeDocument/2006/bibliography" SelectedStyle="\APASixthEditionOfficeOnline.xsl" StyleName="APA" Version="6"/>
-</file>
-
-<file path=customXml/itemProps1.xml><?xml version="1.0" encoding="utf-8"?>
-<ds:datastoreItem xmlns:ds="http://schemas.openxmlformats.org/officeDocument/2006/customXml" ds:itemID="{A4D5919C-3DA1-4E7E-9ABD-56F11B694303}">
-  <ds:schemaRefs>
-    <ds:schemaRef ds:uri="http://schemas.openxmlformats.org/officeDocument/2006/bibliography"/>
-  </ds:schemaRefs>
-</ds:datastoreItem>
 </file>
</xml_diff>